<commit_message>
chore: learning MPI, Jesus please help
</commit_message>
<xml_diff>
--- a/42TR Tehnologiji Rozpodilenyh System/3/TR_KNT-122_Onyshchenko_19_PR3.docx
+++ b/42TR Tehnologiji Rozpodilenyh System/3/TR_KNT-122_Onyshchenko_19_PR3.docx
@@ -500,7 +500,7 @@
         <w:rPr>
           <w:lang w:val="en-US"/>
         </w:rPr>
-        <w:t>2. Доповніть вихідну програму так,  щоб процес  "1" виконував  посилку,  а процес  "0" – прийом елементів масиву цілих чисел типу long,  причому,  розміри буферів передачі та прийому мають дорівнювати  номеру робочого місця,  помноженому на 10,  а кількість елементів,  що  передаються – номеру робочого місця, збільшеного на одиницю.  В  процесі  "0"  реалізувати виведення кількості фактично прийнятих елементів.</w:t>
+        <w:t>2. Доповніть вихідну програму так,  щоб процес  "1" виконував  посилку,  а процес  "0" – прийом елементів масиву цілих чисел типу long,  причому,  розміри буферів передачі та прийому мають дорівнювати  номеру робочого місця,  помноженому на 10,  а кількість елементів,  що  передаються – номеру робочого місця, збільшеного на одиницю. В процесі  "0"  реалізувати виведення кількості фактично прийнятих елементів.</w:t>
       </w:r>
     </w:p>
     <w:p>
@@ -528,7 +528,7 @@
         <w:rPr>
           <w:lang w:val="en-US"/>
         </w:rPr>
-        <w:t>4. Напишіть програму, яка складається з чотирьох процесів. Процес"0" передає до процесів "1", "2" та "3" рядок зпрізвищем студента. Процес"1" конкатенує прийнятий рядок з рядком, відповідним імені студента, і відсилає отриманий рядок назад. Процес"2" визначає кількість символів в прийнятому рядку та відсилає це число до нульового процесу. Процес "3" множить число, що дорівнює сумі кодів символів прийнятого рядка на число PI, та відсилає отримане значення до процеса "0".</w:t>
+        <w:t>4. Напишіть програму, яка складається з чотирьох процесів. Процес "0" передає до процесів "1", "2" та "3" рядок з прізвищем студента. Процес"1" конкатенує прийнятий рядок з рядком, відповідним імені студента, і відсилає отриманий рядок назад. Процес"2" визначає кількість символів в прийнятому рядку та відсилає це число до нульового процесу. Процес "3" множить число, що дорівнює сумі кодів символів прийнятого рядка на число PI, та відсилає отримане значення до процеса "0".</w:t>
       </w:r>
     </w:p>
     <w:p>
@@ -568,26 +568,242 @@
     <w:p>
       <w:pPr>
         <w:pStyle w:val="H2"/>
-        <w:rPr/>
-      </w:pPr>
-      <w:r>
-        <w:rPr/>
-        <w:t>Який стандарт MPI та яку назву має біблиотека (реалізація) функцій MPI, які використовуються в даній лабораторній роботі?</w:t>
+        <w:spacing w:lineRule="auto" w:line="360" w:before="0" w:after="0"/>
+        <w:rPr/>
+      </w:pPr>
+      <w:r>
+        <w:rPr/>
+        <w:t xml:space="preserve">Який стандарт MPI та яку назву має </w:t>
+      </w:r>
+      <w:r>
+        <w:rPr>
+          <w:lang w:val="en-US"/>
+        </w:rPr>
+        <w:t>бібл</w:t>
+      </w:r>
+      <w:r>
+        <w:rPr>
+          <w:lang w:val="en-US"/>
+        </w:rPr>
+        <w:t>і</w:t>
+      </w:r>
+      <w:r>
+        <w:rPr>
+          <w:lang w:val="en-US"/>
+        </w:rPr>
+        <w:t>отека</w:t>
+      </w:r>
+      <w:r>
+        <w:rPr/>
+        <w:t xml:space="preserve"> (реалізація) функцій MPI, які використовуються в даній лабораторній роботі?</w:t>
+      </w:r>
+    </w:p>
+    <w:p>
+      <w:pPr>
+        <w:pStyle w:val="P1"/>
+        <w:spacing w:lineRule="auto" w:line="360" w:before="0" w:after="0"/>
+        <w:rPr/>
+      </w:pPr>
+      <w:r>
+        <w:rPr/>
+      </w:r>
+    </w:p>
+    <w:p>
+      <w:pPr>
+        <w:pStyle w:val="P1"/>
+        <w:spacing w:lineRule="auto" w:line="360" w:before="0" w:after="0"/>
+        <w:rPr/>
+      </w:pPr>
+      <w:r>
+        <w:rPr/>
+        <w:t xml:space="preserve">Стандарт — </w:t>
+      </w:r>
+      <w:r>
+        <w:rPr>
+          <w:lang w:val="en-US"/>
+        </w:rPr>
+        <w:t>OpenMPI.</w:t>
+      </w:r>
+    </w:p>
+    <w:p>
+      <w:pPr>
+        <w:pStyle w:val="P1"/>
+        <w:spacing w:lineRule="auto" w:line="360" w:before="0" w:after="0"/>
+        <w:rPr>
+          <w:lang w:val="uk-UA"/>
+        </w:rPr>
+      </w:pPr>
+      <w:r>
+        <w:rPr>
+          <w:lang w:val="uk-UA"/>
+        </w:rPr>
+        <w:t xml:space="preserve">Бібліотека — </w:t>
+      </w:r>
+      <w:r>
+        <w:rPr>
+          <w:lang w:val="en-US"/>
+        </w:rPr>
+        <w:t xml:space="preserve">mpi4py </w:t>
+      </w:r>
+      <w:r>
+        <w:rPr>
+          <w:lang w:val="uk-UA"/>
+        </w:rPr>
+        <w:t xml:space="preserve">(для </w:t>
+      </w:r>
+      <w:r>
+        <w:rPr>
+          <w:lang w:val="en-US"/>
+        </w:rPr>
+        <w:t xml:space="preserve">Python, </w:t>
+      </w:r>
+      <w:r>
+        <w:rPr>
+          <w:lang w:val="uk-UA"/>
+        </w:rPr>
+        <w:t xml:space="preserve">для </w:t>
+      </w:r>
+      <w:r>
+        <w:rPr>
+          <w:lang w:val="en-US"/>
+        </w:rPr>
+        <w:t xml:space="preserve">C++ </w:t>
+      </w:r>
+      <w:r>
+        <w:rPr>
+          <w:lang w:val="uk-UA"/>
+        </w:rPr>
+        <w:t xml:space="preserve">— </w:t>
+      </w:r>
+      <w:r>
+        <w:rPr>
+          <w:lang w:val="en-US"/>
+        </w:rPr>
+        <w:t>mpi.h).</w:t>
+      </w:r>
+    </w:p>
+    <w:p>
+      <w:pPr>
+        <w:pStyle w:val="P1"/>
+        <w:spacing w:lineRule="auto" w:line="360" w:before="0" w:after="0"/>
+        <w:rPr/>
+      </w:pPr>
+      <w:r>
+        <w:rPr/>
       </w:r>
     </w:p>
     <w:p>
       <w:pPr>
         <w:pStyle w:val="H2"/>
-        <w:rPr/>
-      </w:pPr>
-      <w:r>
-        <w:rPr/>
-        <w:t>Які функції вихідної програми завдання 1 виконуються у всіх процесах?</w:t>
+        <w:spacing w:lineRule="auto" w:line="360" w:before="0" w:after="0"/>
+        <w:rPr/>
+      </w:pPr>
+      <w:r>
+        <w:rPr/>
+        <w:t>Які функції вихідної програми завдання 1 виконуються у всіх процесах</w:t>
+      </w:r>
+      <w:r>
+        <w:rPr/>
+        <w:t>?</w:t>
+      </w:r>
+    </w:p>
+    <w:p>
+      <w:pPr>
+        <w:pStyle w:val="P1"/>
+        <w:spacing w:lineRule="auto" w:line="360" w:before="0" w:after="0"/>
+        <w:rPr/>
+      </w:pPr>
+      <w:r>
+        <w:rPr/>
+      </w:r>
+    </w:p>
+    <w:p>
+      <w:pPr>
+        <w:pStyle w:val="P1"/>
+        <w:spacing w:lineRule="auto" w:line="360" w:before="0" w:after="0"/>
+        <w:rPr/>
+      </w:pPr>
+      <w:r>
+        <w:rPr/>
+        <w:t>Наступні функції виконуються у всіх процесах:</w:t>
+      </w:r>
+    </w:p>
+    <w:p>
+      <w:pPr>
+        <w:pStyle w:val="P1"/>
+        <w:spacing w:lineRule="auto" w:line="360" w:before="0" w:after="0"/>
+        <w:rPr/>
+      </w:pPr>
+      <w:r>
+        <w:rPr/>
+        <w:t xml:space="preserve">- </w:t>
+      </w:r>
+      <w:r>
+        <w:rPr>
+          <w:lang w:val="en-US"/>
+        </w:rPr>
+        <w:t>MPI_Init;</w:t>
+      </w:r>
+    </w:p>
+    <w:p>
+      <w:pPr>
+        <w:pStyle w:val="P1"/>
+        <w:spacing w:lineRule="auto" w:line="360" w:before="0" w:after="0"/>
+        <w:rPr>
+          <w:lang w:val="en-US"/>
+        </w:rPr>
+      </w:pPr>
+      <w:r>
+        <w:rPr>
+          <w:lang w:val="en-US"/>
+        </w:rPr>
+        <w:t>- MPI_Comm_size;</w:t>
+      </w:r>
+    </w:p>
+    <w:p>
+      <w:pPr>
+        <w:pStyle w:val="P1"/>
+        <w:spacing w:lineRule="auto" w:line="360" w:before="0" w:after="0"/>
+        <w:rPr>
+          <w:lang w:val="en-US"/>
+        </w:rPr>
+      </w:pPr>
+      <w:r>
+        <w:rPr>
+          <w:lang w:val="en-US"/>
+        </w:rPr>
+        <w:t>- MPI_Comm_rank;</w:t>
+      </w:r>
+    </w:p>
+    <w:p>
+      <w:pPr>
+        <w:pStyle w:val="P1"/>
+        <w:spacing w:lineRule="auto" w:line="360" w:before="0" w:after="0"/>
+        <w:rPr>
+          <w:lang w:val="en-US"/>
+        </w:rPr>
+      </w:pPr>
+      <w:r>
+        <w:rPr>
+          <w:lang w:val="en-US"/>
+        </w:rPr>
+        <w:t>- MPI_Finalize.</w:t>
+      </w:r>
+    </w:p>
+    <w:p>
+      <w:pPr>
+        <w:pStyle w:val="P1"/>
+        <w:spacing w:lineRule="auto" w:line="360" w:before="0" w:after="0"/>
+        <w:rPr/>
+      </w:pPr>
+      <w:r>
+        <w:rPr/>
       </w:r>
     </w:p>
     <w:p>
       <w:pPr>
         <w:pStyle w:val="H2"/>
+        <w:spacing w:lineRule="auto" w:line="360" w:before="0" w:after="0"/>
         <w:rPr/>
       </w:pPr>
       <w:r>
@@ -597,7 +813,91 @@
     </w:p>
     <w:p>
       <w:pPr>
+        <w:pStyle w:val="P1"/>
+        <w:spacing w:lineRule="auto" w:line="360" w:before="0" w:after="0"/>
+        <w:rPr/>
+      </w:pPr>
+      <w:r>
+        <w:rPr/>
+      </w:r>
+    </w:p>
+    <w:p>
+      <w:pPr>
+        <w:pStyle w:val="P1"/>
+        <w:spacing w:lineRule="auto" w:line="360" w:before="0" w:after="0"/>
+        <w:rPr>
+          <w:lang w:val="en-US"/>
+        </w:rPr>
+      </w:pPr>
+      <w:r>
+        <w:rPr>
+          <w:lang w:val="en-US"/>
+        </w:rPr>
+        <w:t xml:space="preserve">MPI_COMM_WORLD </w:t>
+      </w:r>
+      <w:r>
+        <w:rPr>
+          <w:lang w:val="uk-UA"/>
+        </w:rPr>
+        <w:t>є комунікатором, який об’єднує всі процеси, запущені в межах однієї паралельної програми.</w:t>
+      </w:r>
+    </w:p>
+    <w:p>
+      <w:pPr>
+        <w:pStyle w:val="P1"/>
+        <w:spacing w:lineRule="auto" w:line="360" w:before="0" w:after="0"/>
+        <w:rPr/>
+      </w:pPr>
+      <w:r>
+        <w:rPr/>
+        <w:t xml:space="preserve">Джерело: </w:t>
+      </w:r>
+      <w:r>
+        <w:fldChar w:fldCharType="begin"/>
+      </w:r>
+      <w:r>
+        <w:rPr>
+          <w:rStyle w:val="Hyperlink"/>
+        </w:rPr>
+        <w:instrText xml:space="preserve"> HYPERLINK "https://www.dcs.ed.ac.uk/home/trollius/www.osc.edu/Lam/mpi/tutorial1.html" \l ":~:text=MPI_COMM_WORLD%20means%20%22all%20the%20processes%20in%20the%20MPI%20application.%22%20It%20is%20called%20a%20communicator%20and%20it%20provides%20all%20information%20necessary%20to%20do%20message%20passing"</w:instrText>
+      </w:r>
+      <w:r>
+        <w:rPr>
+          <w:rStyle w:val="Hyperlink"/>
+        </w:rPr>
+        <w:fldChar w:fldCharType="separate"/>
+      </w:r>
+      <w:r>
+        <w:rPr>
+          <w:rStyle w:val="Hyperlink"/>
+        </w:rPr>
+        <w:t>https://www.dcs.ed.ac.uk/home/trollius/www.osc.edu/Lam/mpi/tutorial1.html#:~:text=MPI_COMM_WORLD%20means%20%22all%20the%20processes%20in%20the%20MPI%20application.%22%20It%20is%20called%20a%20communicator%20and%20it%20provides%20all%20information%20necessary%20to%20do%20message%20passing</w:t>
+      </w:r>
+      <w:r>
+        <w:rPr>
+          <w:rStyle w:val="Hyperlink"/>
+        </w:rPr>
+        <w:fldChar w:fldCharType="end"/>
+      </w:r>
+      <w:r>
+        <w:rPr/>
+        <w:t>.</w:t>
+      </w:r>
+    </w:p>
+    <w:p>
+      <w:pPr>
+        <w:pStyle w:val="P1"/>
+        <w:spacing w:lineRule="auto" w:line="360" w:before="0" w:after="0"/>
+        <w:rPr/>
+      </w:pPr>
+      <w:r>
+        <w:rPr/>
+      </w:r>
+    </w:p>
+    <w:p>
+      <w:pPr>
         <w:pStyle w:val="H2"/>
+        <w:spacing w:lineRule="auto" w:line="360" w:before="0" w:after="0"/>
         <w:rPr/>
       </w:pPr>
       <w:r>
@@ -607,7 +907,39 @@
     </w:p>
     <w:p>
       <w:pPr>
+        <w:pStyle w:val="P1"/>
+        <w:spacing w:lineRule="auto" w:line="360" w:before="0" w:after="0"/>
+        <w:rPr/>
+      </w:pPr>
+      <w:r>
+        <w:rPr/>
+      </w:r>
+    </w:p>
+    <w:p>
+      <w:pPr>
+        <w:pStyle w:val="P1"/>
+        <w:spacing w:lineRule="auto" w:line="360" w:before="0" w:after="0"/>
+        <w:rPr/>
+      </w:pPr>
+      <w:r>
+        <w:rPr/>
+        <w:t>Без знання свого номера, кожен процес робив би те ж саме.</w:t>
+      </w:r>
+    </w:p>
+    <w:p>
+      <w:pPr>
+        <w:pStyle w:val="P1"/>
+        <w:spacing w:lineRule="auto" w:line="360" w:before="0" w:after="0"/>
+        <w:rPr/>
+      </w:pPr>
+      <w:r>
+        <w:rPr/>
+      </w:r>
+    </w:p>
+    <w:p>
+      <w:pPr>
         <w:pStyle w:val="H2"/>
+        <w:spacing w:lineRule="auto" w:line="360" w:before="0" w:after="0"/>
         <w:rPr/>
       </w:pPr>
       <w:r>
@@ -618,6 +950,7 @@
     <w:p>
       <w:pPr>
         <w:pStyle w:val="H2"/>
+        <w:spacing w:lineRule="auto" w:line="360" w:before="0" w:after="0"/>
         <w:rPr/>
       </w:pPr>
       <w:r>
@@ -628,6 +961,7 @@
     <w:p>
       <w:pPr>
         <w:pStyle w:val="H2"/>
+        <w:spacing w:lineRule="auto" w:line="360" w:before="0" w:after="0"/>
         <w:rPr/>
       </w:pPr>
       <w:r>

</xml_diff>

<commit_message>
docs (TR3): filling in the control questions
</commit_message>
<xml_diff>
--- a/42TR Tehnologiji Rozpodilenyh System/3/TR_KNT-122_Onyshchenko_19_PR3.docx
+++ b/42TR Tehnologiji Rozpodilenyh System/3/TR_KNT-122_Onyshchenko_19_PR3.docx
@@ -945,6 +945,296 @@
       <w:r>
         <w:rPr/>
         <w:t>Напишіть фрагмент паралельної програми, який використовує значення кількості процесів в області зв’язку.</w:t>
+      </w:r>
+    </w:p>
+    <w:p>
+      <w:pPr>
+        <w:pStyle w:val="P1"/>
+        <w:spacing w:lineRule="auto" w:line="360" w:before="0" w:after="0"/>
+        <w:rPr/>
+      </w:pPr>
+      <w:r>
+        <w:rPr/>
+      </w:r>
+    </w:p>
+    <w:p>
+      <w:pPr>
+        <w:pStyle w:val="P1"/>
+        <w:spacing w:lineRule="auto" w:line="360" w:before="0" w:after="0"/>
+        <w:rPr/>
+      </w:pPr>
+      <w:r>
+        <w:rPr/>
+        <w:t xml:space="preserve">Код мовою </w:t>
+      </w:r>
+      <w:r>
+        <w:rPr>
+          <w:lang w:val="en-US"/>
+        </w:rPr>
+        <w:t xml:space="preserve">Python </w:t>
+      </w:r>
+      <w:r>
+        <w:rPr>
+          <w:lang w:val="uk-UA"/>
+        </w:rPr>
+        <w:t xml:space="preserve">з бібліотекою </w:t>
+      </w:r>
+      <w:r>
+        <w:rPr>
+          <w:lang w:val="en-US"/>
+        </w:rPr>
+        <w:t xml:space="preserve">mpi4py </w:t>
+      </w:r>
+      <w:r>
+        <w:rPr>
+          <w:lang w:val="uk-UA"/>
+        </w:rPr>
+        <w:t>наведено нижче:</w:t>
+      </w:r>
+    </w:p>
+    <w:p>
+      <w:pPr>
+        <w:pStyle w:val="P1"/>
+        <w:spacing w:lineRule="auto" w:line="360" w:before="0" w:after="0"/>
+        <w:rPr/>
+      </w:pPr>
+      <w:r>
+        <w:rPr/>
+      </w:r>
+    </w:p>
+    <w:p>
+      <w:pPr>
+        <w:pStyle w:val="Code"/>
+        <w:rPr/>
+      </w:pPr>
+      <w:r>
+        <w:rPr/>
+        <w:t>from mpi4py import MPI</w:t>
+      </w:r>
+    </w:p>
+    <w:p>
+      <w:pPr>
+        <w:pStyle w:val="Code"/>
+        <w:rPr/>
+      </w:pPr>
+      <w:r>
+        <w:rPr/>
+      </w:r>
+    </w:p>
+    <w:p>
+      <w:pPr>
+        <w:pStyle w:val="Code"/>
+        <w:rPr/>
+      </w:pPr>
+      <w:r>
+        <w:rPr/>
+        <w:t>comm = MPI.COMM_WORLD</w:t>
+      </w:r>
+    </w:p>
+    <w:p>
+      <w:pPr>
+        <w:pStyle w:val="Code"/>
+        <w:rPr/>
+      </w:pPr>
+      <w:r>
+        <w:rPr/>
+      </w:r>
+    </w:p>
+    <w:p>
+      <w:pPr>
+        <w:pStyle w:val="Code"/>
+        <w:rPr/>
+      </w:pPr>
+      <w:r>
+        <w:rPr/>
+        <w:t>size = comm.Get_size()</w:t>
+      </w:r>
+    </w:p>
+    <w:p>
+      <w:pPr>
+        <w:pStyle w:val="Code"/>
+        <w:rPr/>
+      </w:pPr>
+      <w:r>
+        <w:rPr/>
+        <w:t>rank = comm.Get_rank()</w:t>
+      </w:r>
+    </w:p>
+    <w:p>
+      <w:pPr>
+        <w:pStyle w:val="Code"/>
+        <w:rPr/>
+      </w:pPr>
+      <w:r>
+        <w:rPr/>
+      </w:r>
+    </w:p>
+    <w:p>
+      <w:pPr>
+        <w:pStyle w:val="Code"/>
+        <w:rPr/>
+      </w:pPr>
+      <w:r>
+        <w:rPr/>
+        <w:t>total_data_size = 1000</w:t>
+      </w:r>
+    </w:p>
+    <w:p>
+      <w:pPr>
+        <w:pStyle w:val="Code"/>
+        <w:rPr/>
+      </w:pPr>
+      <w:r>
+        <w:rPr/>
+      </w:r>
+    </w:p>
+    <w:p>
+      <w:pPr>
+        <w:pStyle w:val="Code"/>
+        <w:rPr/>
+      </w:pPr>
+      <w:r>
+        <w:rPr/>
+        <w:t>chunk_size = total_data_size // size</w:t>
+      </w:r>
+    </w:p>
+    <w:p>
+      <w:pPr>
+        <w:pStyle w:val="Code"/>
+        <w:rPr/>
+      </w:pPr>
+      <w:r>
+        <w:rPr/>
+        <w:t>start_index = rank * chunk_size</w:t>
+      </w:r>
+    </w:p>
+    <w:p>
+      <w:pPr>
+        <w:pStyle w:val="Code"/>
+        <w:rPr/>
+      </w:pPr>
+      <w:r>
+        <w:rPr/>
+        <w:t>end_index = (rank + 1) * chunk_size if rank != size - 1 else total_data_size</w:t>
+      </w:r>
+    </w:p>
+    <w:p>
+      <w:pPr>
+        <w:pStyle w:val="Code"/>
+        <w:rPr/>
+      </w:pPr>
+      <w:r>
+        <w:rPr/>
+      </w:r>
+    </w:p>
+    <w:p>
+      <w:pPr>
+        <w:pStyle w:val="Code"/>
+        <w:rPr/>
+      </w:pPr>
+      <w:r>
+        <w:rPr/>
+        <w:t>print(</w:t>
+      </w:r>
+    </w:p>
+    <w:p>
+      <w:pPr>
+        <w:pStyle w:val="Code"/>
+        <w:rPr/>
+      </w:pPr>
+      <w:r>
+        <w:rPr/>
+        <w:t xml:space="preserve">    </w:t>
+      </w:r>
+      <w:r>
+        <w:rPr/>
+        <w:t>f"[Процес {rank}/{size}]: Працюю з індексами від {start_index} до {end_index - 1}"</w:t>
+      </w:r>
+    </w:p>
+    <w:p>
+      <w:pPr>
+        <w:pStyle w:val="Code"/>
+        <w:rPr/>
+      </w:pPr>
+      <w:r>
+        <w:rPr/>
+        <w:t>)</w:t>
+      </w:r>
+    </w:p>
+    <w:p>
+      <w:pPr>
+        <w:pStyle w:val="Code"/>
+        <w:rPr/>
+      </w:pPr>
+      <w:r>
+        <w:rPr/>
+      </w:r>
+    </w:p>
+    <w:p>
+      <w:pPr>
+        <w:pStyle w:val="Code"/>
+        <w:rPr/>
+      </w:pPr>
+      <w:r>
+        <w:rPr/>
+        <w:t>local_sum = sum(range(start_index, end_index))</w:t>
+      </w:r>
+    </w:p>
+    <w:p>
+      <w:pPr>
+        <w:pStyle w:val="Code"/>
+        <w:rPr/>
+      </w:pPr>
+      <w:r>
+        <w:rPr/>
+        <w:t>total_sum = comm.reduce(local_sum, op=MPI.SUM, root=0)</w:t>
+      </w:r>
+    </w:p>
+    <w:p>
+      <w:pPr>
+        <w:pStyle w:val="Code"/>
+        <w:rPr/>
+      </w:pPr>
+      <w:r>
+        <w:rPr/>
+      </w:r>
+    </w:p>
+    <w:p>
+      <w:pPr>
+        <w:pStyle w:val="Code"/>
+        <w:rPr/>
+      </w:pPr>
+      <w:r>
+        <w:rPr/>
+        <w:t>if rank == 0:</w:t>
+      </w:r>
+    </w:p>
+    <w:p>
+      <w:pPr>
+        <w:pStyle w:val="Code"/>
+        <w:rPr/>
+      </w:pPr>
+      <w:r>
+        <w:rPr/>
+        <w:t xml:space="preserve">    </w:t>
+      </w:r>
+      <w:r>
+        <w:rPr/>
+        <w:t>print(f"\nЗагальна сума, зібрана з {size} процесів: {total_sum}"</w:t>
+      </w:r>
+      <w:r>
+        <w:rPr/>
+        <w:t>)</w:t>
+      </w:r>
+    </w:p>
+    <w:p>
+      <w:pPr>
+        <w:pStyle w:val="P1"/>
+        <w:spacing w:lineRule="auto" w:line="360" w:before="0" w:after="0"/>
+        <w:rPr/>
+      </w:pPr>
+      <w:r>
+        <w:rPr/>
       </w:r>
     </w:p>
     <w:p>

</xml_diff>

<commit_message>
docs (TR3): fill in the control questions
</commit_message>
<xml_diff>
--- a/42TR Tehnologiji Rozpodilenyh System/3/TR_KNT-122_Onyshchenko_19_PR3.docx
+++ b/42TR Tehnologiji Rozpodilenyh System/3/TR_KNT-122_Onyshchenko_19_PR3.docx
@@ -1250,6 +1250,229 @@
     </w:p>
     <w:p>
       <w:pPr>
+        <w:pStyle w:val="P1"/>
+        <w:spacing w:lineRule="auto" w:line="360" w:before="0" w:after="0"/>
+        <w:rPr/>
+      </w:pPr>
+      <w:r>
+        <w:rPr/>
+      </w:r>
+    </w:p>
+    <w:p>
+      <w:pPr>
+        <w:pStyle w:val="P1"/>
+        <w:spacing w:lineRule="auto" w:line="360" w:before="0" w:after="0"/>
+        <w:rPr/>
+      </w:pPr>
+      <w:r>
+        <w:rPr/>
+        <w:t>Написану програму наведено нижче:</w:t>
+      </w:r>
+    </w:p>
+    <w:p>
+      <w:pPr>
+        <w:pStyle w:val="P1"/>
+        <w:spacing w:lineRule="auto" w:line="360" w:before="0" w:after="0"/>
+        <w:rPr/>
+      </w:pPr>
+      <w:r>
+        <w:rPr/>
+      </w:r>
+    </w:p>
+    <w:p>
+      <w:pPr>
+        <w:pStyle w:val="Code"/>
+        <w:rPr/>
+      </w:pPr>
+      <w:r>
+        <w:rPr/>
+        <w:t>from mpi4py import MPI</w:t>
+      </w:r>
+    </w:p>
+    <w:p>
+      <w:pPr>
+        <w:pStyle w:val="Code"/>
+        <w:rPr/>
+      </w:pPr>
+      <w:r>
+        <w:rPr/>
+        <w:t>import numpy as np</w:t>
+      </w:r>
+    </w:p>
+    <w:p>
+      <w:pPr>
+        <w:pStyle w:val="Code"/>
+        <w:rPr/>
+      </w:pPr>
+      <w:r>
+        <w:rPr/>
+      </w:r>
+    </w:p>
+    <w:p>
+      <w:pPr>
+        <w:pStyle w:val="Code"/>
+        <w:rPr/>
+      </w:pPr>
+      <w:r>
+        <w:rPr/>
+        <w:t>comm = MPI.COMM_WORLD</w:t>
+      </w:r>
+    </w:p>
+    <w:p>
+      <w:pPr>
+        <w:pStyle w:val="Code"/>
+        <w:rPr/>
+      </w:pPr>
+      <w:r>
+        <w:rPr/>
+        <w:t>size = comm.Get_size()</w:t>
+      </w:r>
+    </w:p>
+    <w:p>
+      <w:pPr>
+        <w:pStyle w:val="Code"/>
+        <w:rPr/>
+      </w:pPr>
+      <w:r>
+        <w:rPr/>
+        <w:t>rank = comm.Get_rank()</w:t>
+      </w:r>
+    </w:p>
+    <w:p>
+      <w:pPr>
+        <w:pStyle w:val="Code"/>
+        <w:rPr/>
+      </w:pPr>
+      <w:r>
+        <w:rPr/>
+      </w:r>
+    </w:p>
+    <w:p>
+      <w:pPr>
+        <w:pStyle w:val="Code"/>
+        <w:rPr/>
+      </w:pPr>
+      <w:r>
+        <w:rPr/>
+        <w:t>array_size = rank * size</w:t>
+      </w:r>
+    </w:p>
+    <w:p>
+      <w:pPr>
+        <w:pStyle w:val="Code"/>
+        <w:rPr/>
+      </w:pPr>
+      <w:r>
+        <w:rPr/>
+      </w:r>
+    </w:p>
+    <w:p>
+      <w:pPr>
+        <w:pStyle w:val="Code"/>
+        <w:rPr/>
+      </w:pPr>
+      <w:r>
+        <w:rPr/>
+        <w:t>data_array = np.zeros(array_size, dtype=int)</w:t>
+      </w:r>
+    </w:p>
+    <w:p>
+      <w:pPr>
+        <w:pStyle w:val="Code"/>
+        <w:rPr/>
+      </w:pPr>
+      <w:r>
+        <w:rPr/>
+      </w:r>
+    </w:p>
+    <w:p>
+      <w:pPr>
+        <w:pStyle w:val="Code"/>
+        <w:rPr/>
+      </w:pPr>
+      <w:r>
+        <w:rPr/>
+        <w:t>print(f"Процес {rank}: Розмір масиву = {rank} * {size} = {array_size}")</w:t>
+      </w:r>
+    </w:p>
+    <w:p>
+      <w:pPr>
+        <w:pStyle w:val="Code"/>
+        <w:rPr/>
+      </w:pPr>
+      <w:r>
+        <w:rPr/>
+        <w:t>print(f"Пам'ять виділено за адресою: {data_array.__array_interface__['data'][0]}")</w:t>
+      </w:r>
+    </w:p>
+    <w:p>
+      <w:pPr>
+        <w:pStyle w:val="Code"/>
+        <w:rPr/>
+      </w:pPr>
+      <w:r>
+        <w:rPr/>
+      </w:r>
+    </w:p>
+    <w:p>
+      <w:pPr>
+        <w:pStyle w:val="Code"/>
+        <w:rPr/>
+      </w:pPr>
+      <w:r>
+        <w:rPr/>
+        <w:t>if array_size &gt; 0:</w:t>
+      </w:r>
+    </w:p>
+    <w:p>
+      <w:pPr>
+        <w:pStyle w:val="Code"/>
+        <w:rPr/>
+      </w:pPr>
+      <w:r>
+        <w:rPr/>
+        <w:t xml:space="preserve">    </w:t>
+      </w:r>
+      <w:r>
+        <w:rPr/>
+        <w:t>print(f"\t-&gt; Перші елементи процесу {rank}: {data_array[:5]}...")</w:t>
+      </w:r>
+    </w:p>
+    <w:p>
+      <w:pPr>
+        <w:pStyle w:val="Code"/>
+        <w:rPr/>
+      </w:pPr>
+      <w:r>
+        <w:rPr/>
+        <w:t>else:</w:t>
+      </w:r>
+    </w:p>
+    <w:p>
+      <w:pPr>
+        <w:pStyle w:val="Code"/>
+        <w:rPr/>
+      </w:pPr>
+      <w:r>
+        <w:rPr/>
+        <w:t xml:space="preserve">    </w:t>
+      </w:r>
+      <w:r>
+        <w:rPr/>
+        <w:t>print(f"\t-&gt; Процес {rank} має порожній масив, (бо rank = 0))")</w:t>
+      </w:r>
+    </w:p>
+    <w:p>
+      <w:pPr>
+        <w:pStyle w:val="p11"/>
+        <w:rPr/>
+      </w:pPr>
+      <w:r>
+        <w:rPr/>
+      </w:r>
+    </w:p>
+    <w:p>
+      <w:pPr>
         <w:pStyle w:val="H2"/>
         <w:spacing w:lineRule="auto" w:line="360" w:before="0" w:after="0"/>
         <w:rPr/>
@@ -1257,6 +1480,79 @@
       <w:r>
         <w:rPr/>
         <w:t>До якого класу належать програми даної лабораторної роботи: SIMD чи MIMD?</w:t>
+      </w:r>
+    </w:p>
+    <w:p>
+      <w:pPr>
+        <w:pStyle w:val="P1"/>
+        <w:spacing w:lineRule="auto" w:line="360" w:before="0" w:after="0"/>
+        <w:rPr/>
+      </w:pPr>
+      <w:r>
+        <w:rPr/>
+      </w:r>
+    </w:p>
+    <w:p>
+      <w:pPr>
+        <w:pStyle w:val="P1"/>
+        <w:spacing w:lineRule="auto" w:line="360" w:before="0" w:after="0"/>
+        <w:rPr>
+          <w:lang w:val="en-US"/>
+        </w:rPr>
+      </w:pPr>
+      <w:r>
+        <w:rPr>
+          <w:lang w:val="en-US"/>
+        </w:rPr>
+        <w:t xml:space="preserve">SIMD – Single Instruction Multiple Data. </w:t>
+      </w:r>
+      <w:r>
+        <w:rPr>
+          <w:lang w:val="uk-UA"/>
+        </w:rPr>
+        <w:t>Всі паралельні блоки виконують ту ж інструкцію, але над різними елементами даних.</w:t>
+      </w:r>
+    </w:p>
+    <w:p>
+      <w:pPr>
+        <w:pStyle w:val="P1"/>
+        <w:spacing w:lineRule="auto" w:line="360" w:before="0" w:after="0"/>
+        <w:rPr>
+          <w:lang w:val="en-US"/>
+        </w:rPr>
+      </w:pPr>
+      <w:r>
+        <w:rPr>
+          <w:lang w:val="en-US"/>
+        </w:rPr>
+        <w:t xml:space="preserve">MIMD – Multiple Instruction Multiple Data. </w:t>
+      </w:r>
+      <w:r>
+        <w:rPr>
+          <w:lang w:val="uk-UA"/>
+        </w:rPr>
+        <w:t>Всі паралельні блоки мають окремі інструкції і можуть виконувати їх в будь-який час.</w:t>
+      </w:r>
+    </w:p>
+    <w:p>
+      <w:pPr>
+        <w:pStyle w:val="P1"/>
+        <w:spacing w:lineRule="auto" w:line="360" w:before="0" w:after="0"/>
+        <w:rPr>
+          <w:lang w:val="uk-UA"/>
+        </w:rPr>
+      </w:pPr>
+      <w:r>
+        <w:rPr>
+          <w:lang w:val="uk-UA"/>
+        </w:rPr>
+        <w:t xml:space="preserve">Програми, створені впродовж цієї лабораторної роботи є типу </w:t>
+      </w:r>
+      <w:r>
+        <w:rPr>
+          <w:lang w:val="en-US"/>
+        </w:rPr>
+        <w:t>SIMD.</w:t>
       </w:r>
     </w:p>
     <w:sectPr>

</xml_diff>

<commit_message>
feat (TR3): make the first assignment
</commit_message>
<xml_diff>
--- a/42TR Tehnologiji Rozpodilenyh System/3/TR_KNT-122_Onyshchenko_19_PR3.docx
+++ b/42TR Tehnologiji Rozpodilenyh System/3/TR_KNT-122_Onyshchenko_19_PR3.docx
@@ -553,6 +553,424 @@
       <w:r>
         <w:rPr/>
         <w:t>Виконання</w:t>
+      </w:r>
+    </w:p>
+    <w:p>
+      <w:pPr>
+        <w:pStyle w:val="H2"/>
+        <w:rPr/>
+      </w:pPr>
+      <w:r>
+        <w:rPr/>
+        <w:t>1 Парність процесів</w:t>
+      </w:r>
+    </w:p>
+    <w:p>
+      <w:pPr>
+        <w:pStyle w:val="H3"/>
+        <w:rPr/>
+      </w:pPr>
+      <w:r>
+        <w:rPr/>
+        <w:t>Код</w:t>
+      </w:r>
+    </w:p>
+    <w:p>
+      <w:pPr>
+        <w:pStyle w:val="P1"/>
+        <w:rPr/>
+      </w:pPr>
+      <w:r>
+        <w:rPr/>
+      </w:r>
+    </w:p>
+    <w:p>
+      <w:pPr>
+        <w:pStyle w:val="Code"/>
+        <w:rPr/>
+      </w:pPr>
+      <w:r>
+        <w:rPr/>
+        <w:t>from mpi4py import MPI</w:t>
+      </w:r>
+    </w:p>
+    <w:p>
+      <w:pPr>
+        <w:pStyle w:val="Code"/>
+        <w:rPr/>
+      </w:pPr>
+      <w:r>
+        <w:rPr/>
+        <w:t>import sys</w:t>
+      </w:r>
+    </w:p>
+    <w:p>
+      <w:pPr>
+        <w:pStyle w:val="Code"/>
+        <w:rPr/>
+      </w:pPr>
+      <w:r>
+        <w:rPr/>
+      </w:r>
+    </w:p>
+    <w:p>
+      <w:pPr>
+        <w:pStyle w:val="Code"/>
+        <w:rPr/>
+      </w:pPr>
+      <w:r>
+        <w:rPr/>
+      </w:r>
+    </w:p>
+    <w:p>
+      <w:pPr>
+        <w:pStyle w:val="Code"/>
+        <w:rPr/>
+      </w:pPr>
+      <w:r>
+        <w:rPr/>
+        <w:t>def main():</w:t>
+      </w:r>
+    </w:p>
+    <w:p>
+      <w:pPr>
+        <w:pStyle w:val="Code"/>
+        <w:rPr/>
+      </w:pPr>
+      <w:r>
+        <w:rPr/>
+        <w:t xml:space="preserve">    </w:t>
+      </w:r>
+      <w:r>
+        <w:rPr/>
+        <w:t>comm = MPI.COMM_WORLD</w:t>
+      </w:r>
+    </w:p>
+    <w:p>
+      <w:pPr>
+        <w:pStyle w:val="Code"/>
+        <w:rPr/>
+      </w:pPr>
+      <w:r>
+        <w:rPr/>
+        <w:t xml:space="preserve">    </w:t>
+      </w:r>
+      <w:r>
+        <w:rPr/>
+        <w:t>size = comm.Get_size()</w:t>
+      </w:r>
+    </w:p>
+    <w:p>
+      <w:pPr>
+        <w:pStyle w:val="Code"/>
+        <w:rPr/>
+      </w:pPr>
+      <w:r>
+        <w:rPr/>
+        <w:t xml:space="preserve">    </w:t>
+      </w:r>
+      <w:r>
+        <w:rPr/>
+        <w:t>rank = comm.Get_rank()</w:t>
+      </w:r>
+    </w:p>
+    <w:p>
+      <w:pPr>
+        <w:pStyle w:val="Code"/>
+        <w:rPr/>
+      </w:pPr>
+      <w:r>
+        <w:rPr/>
+      </w:r>
+    </w:p>
+    <w:p>
+      <w:pPr>
+        <w:pStyle w:val="Code"/>
+        <w:rPr/>
+      </w:pPr>
+      <w:r>
+        <w:rPr/>
+        <w:t xml:space="preserve">    </w:t>
+      </w:r>
+      <w:r>
+        <w:rPr/>
+        <w:t>parity = "парний" if rank % 2 == 0 else "непарний"</w:t>
+      </w:r>
+    </w:p>
+    <w:p>
+      <w:pPr>
+        <w:pStyle w:val="Code"/>
+        <w:rPr/>
+      </w:pPr>
+      <w:r>
+        <w:rPr/>
+        <w:t xml:space="preserve">    </w:t>
+      </w:r>
+      <w:r>
+        <w:rPr/>
+        <w:t>print(f"Процес {rank} з {size} є {parity}")</w:t>
+      </w:r>
+    </w:p>
+    <w:p>
+      <w:pPr>
+        <w:pStyle w:val="Code"/>
+        <w:rPr/>
+      </w:pPr>
+      <w:r>
+        <w:rPr/>
+      </w:r>
+    </w:p>
+    <w:p>
+      <w:pPr>
+        <w:pStyle w:val="Code"/>
+        <w:rPr/>
+      </w:pPr>
+      <w:r>
+        <w:rPr/>
+        <w:t xml:space="preserve">    </w:t>
+      </w:r>
+      <w:r>
+        <w:rPr/>
+        <w:t>comm.Barrier()</w:t>
+      </w:r>
+    </w:p>
+    <w:p>
+      <w:pPr>
+        <w:pStyle w:val="Code"/>
+        <w:rPr/>
+      </w:pPr>
+      <w:r>
+        <w:rPr/>
+      </w:r>
+    </w:p>
+    <w:p>
+      <w:pPr>
+        <w:pStyle w:val="Code"/>
+        <w:rPr/>
+      </w:pPr>
+      <w:r>
+        <w:rPr/>
+        <w:t xml:space="preserve">    </w:t>
+      </w:r>
+      <w:r>
+        <w:rPr/>
+        <w:t>if rank == 0:</w:t>
+      </w:r>
+    </w:p>
+    <w:p>
+      <w:pPr>
+        <w:pStyle w:val="Code"/>
+        <w:rPr/>
+      </w:pPr>
+      <w:r>
+        <w:rPr/>
+        <w:t xml:space="preserve">        </w:t>
+      </w:r>
+      <w:r>
+        <w:rPr/>
+        <w:t>print(f"\nВсього процесів: {size}")</w:t>
+      </w:r>
+    </w:p>
+    <w:p>
+      <w:pPr>
+        <w:pStyle w:val="Code"/>
+        <w:rPr/>
+      </w:pPr>
+      <w:r>
+        <w:rPr/>
+        <w:t xml:space="preserve">        </w:t>
+      </w:r>
+      <w:r>
+        <w:rPr/>
+        <w:t>print("Вміст командного рядку для першого процесу:")</w:t>
+      </w:r>
+    </w:p>
+    <w:p>
+      <w:pPr>
+        <w:pStyle w:val="Code"/>
+        <w:rPr/>
+      </w:pPr>
+      <w:r>
+        <w:rPr/>
+        <w:t xml:space="preserve">        </w:t>
+      </w:r>
+      <w:r>
+        <w:rPr/>
+        <w:t>for i, arg in enumerate(sys.argv):</w:t>
+      </w:r>
+    </w:p>
+    <w:p>
+      <w:pPr>
+        <w:pStyle w:val="Code"/>
+        <w:rPr/>
+      </w:pPr>
+      <w:r>
+        <w:rPr/>
+        <w:t xml:space="preserve">            </w:t>
+      </w:r>
+      <w:r>
+        <w:rPr/>
+        <w:t>print(f"{i}: {arg}")</w:t>
+      </w:r>
+    </w:p>
+    <w:p>
+      <w:pPr>
+        <w:pStyle w:val="Code"/>
+        <w:rPr/>
+      </w:pPr>
+      <w:r>
+        <w:rPr/>
+      </w:r>
+    </w:p>
+    <w:p>
+      <w:pPr>
+        <w:pStyle w:val="Code"/>
+        <w:rPr/>
+      </w:pPr>
+      <w:r>
+        <w:rPr/>
+      </w:r>
+    </w:p>
+    <w:p>
+      <w:pPr>
+        <w:pStyle w:val="Code"/>
+        <w:rPr/>
+      </w:pPr>
+      <w:r>
+        <w:rPr/>
+        <w:t>if __name__ == "__main__":</w:t>
+      </w:r>
+    </w:p>
+    <w:p>
+      <w:pPr>
+        <w:pStyle w:val="Code"/>
+        <w:rPr/>
+      </w:pPr>
+      <w:r>
+        <w:rPr/>
+        <w:t xml:space="preserve">    </w:t>
+      </w:r>
+      <w:r>
+        <w:rPr/>
+        <w:t>main()</w:t>
+      </w:r>
+    </w:p>
+    <w:p>
+      <w:pPr>
+        <w:pStyle w:val="P1"/>
+        <w:rPr/>
+      </w:pPr>
+      <w:r>
+        <w:rPr/>
+      </w:r>
+    </w:p>
+    <w:p>
+      <w:pPr>
+        <w:pStyle w:val="H3"/>
+        <w:rPr/>
+      </w:pPr>
+      <w:r>
+        <w:rPr/>
+        <w:t>Результати</w:t>
+      </w:r>
+    </w:p>
+    <w:p>
+      <w:pPr>
+        <w:pStyle w:val="img1"/>
+        <w:rPr/>
+      </w:pPr>
+      <w:r>
+        <w:rPr/>
+      </w:r>
+    </w:p>
+    <w:p>
+      <w:pPr>
+        <w:pStyle w:val="img1"/>
+        <w:rPr/>
+      </w:pPr>
+      <w:r>
+        <w:rPr/>
+        <w:drawing>
+          <wp:inline distT="0" distB="0" distL="0" distR="0">
+            <wp:extent cx="5731510" cy="898525"/>
+            <wp:effectExtent l="0" t="0" r="0" b="0"/>
+            <wp:docPr id="1" name="Зображення1"/>
+            <wp:cNvGraphicFramePr>
+              <a:graphicFrameLocks xmlns:a="http://schemas.openxmlformats.org/drawingml/2006/main" noChangeAspect="1"/>
+            </wp:cNvGraphicFramePr>
+            <a:graphic xmlns:a="http://schemas.openxmlformats.org/drawingml/2006/main">
+              <a:graphicData uri="http://schemas.openxmlformats.org/drawingml/2006/picture">
+                <pic:pic xmlns:pic="http://schemas.openxmlformats.org/drawingml/2006/picture">
+                  <pic:nvPicPr>
+                    <pic:cNvPr id="1" name="Зображення1"/>
+                    <pic:cNvPicPr>
+                      <a:picLocks noChangeAspect="1" noChangeArrowheads="1"/>
+                    </pic:cNvPicPr>
+                  </pic:nvPicPr>
+                  <pic:blipFill>
+                    <a:blip r:embed="rId2"/>
+                    <a:stretch>
+                      <a:fillRect/>
+                    </a:stretch>
+                  </pic:blipFill>
+                  <pic:spPr bwMode="auto">
+                    <a:xfrm>
+                      <a:off x="0" y="0"/>
+                      <a:ext cx="5731510" cy="898525"/>
+                    </a:xfrm>
+                    <a:prstGeom prst="rect">
+                      <a:avLst/>
+                    </a:prstGeom>
+                    <a:noFill/>
+                  </pic:spPr>
+                </pic:pic>
+              </a:graphicData>
+            </a:graphic>
+          </wp:inline>
+        </w:drawing>
+      </w:r>
+      <w:r>
+        <w:rPr/>
+        <w:t>Рисунок 1.1 — Вигляд результатів роботи програми</w:t>
+      </w:r>
+    </w:p>
+    <w:p>
+      <w:pPr>
+        <w:pStyle w:val="p11"/>
+        <w:rPr/>
+      </w:pPr>
+      <w:r>
+        <w:rPr/>
+      </w:r>
+    </w:p>
+    <w:p>
+      <w:pPr>
+        <w:pStyle w:val="H2"/>
+        <w:rPr/>
+      </w:pPr>
+      <w:r>
+        <w:rPr/>
+        <w:t>2 Доповнення</w:t>
+      </w:r>
+    </w:p>
+    <w:p>
+      <w:pPr>
+        <w:pStyle w:val="H2"/>
+        <w:rPr/>
+      </w:pPr>
+      <w:r>
+        <w:rPr/>
+        <w:t>3 Буфер</w:t>
+      </w:r>
+    </w:p>
+    <w:p>
+      <w:pPr>
+        <w:pStyle w:val="H2"/>
+        <w:rPr/>
+      </w:pPr>
+      <w:r>
+        <w:rPr/>
+        <w:t>4 Чотири процеси</w:t>
       </w:r>
     </w:p>
     <w:p>

</xml_diff>

<commit_message>
docs (TR3): add second app to the report
</commit_message>
<xml_diff>
--- a/42TR Tehnologiji Rozpodilenyh System/3/TR_KNT-122_Onyshchenko_19_PR3.docx
+++ b/42TR Tehnologiji Rozpodilenyh System/3/TR_KNT-122_Onyshchenko_19_PR3.docx
@@ -951,6 +951,669 @@
       <w:r>
         <w:rPr/>
         <w:t>2 Доповнення</w:t>
+      </w:r>
+    </w:p>
+    <w:p>
+      <w:pPr>
+        <w:pStyle w:val="H3"/>
+        <w:rPr/>
+      </w:pPr>
+      <w:r>
+        <w:rPr/>
+        <w:t>Код</w:t>
+      </w:r>
+    </w:p>
+    <w:p>
+      <w:pPr>
+        <w:pStyle w:val="P1"/>
+        <w:rPr/>
+      </w:pPr>
+      <w:r>
+        <w:rPr/>
+      </w:r>
+    </w:p>
+    <w:p>
+      <w:pPr>
+        <w:pStyle w:val="Code"/>
+        <w:rPr/>
+      </w:pPr>
+      <w:r>
+        <w:rPr/>
+        <w:t>from mpi4py import MPI</w:t>
+      </w:r>
+    </w:p>
+    <w:p>
+      <w:pPr>
+        <w:pStyle w:val="Code"/>
+        <w:rPr/>
+      </w:pPr>
+      <w:r>
+        <w:rPr/>
+        <w:t>import numpy as np</w:t>
+      </w:r>
+    </w:p>
+    <w:p>
+      <w:pPr>
+        <w:pStyle w:val="Code"/>
+        <w:rPr/>
+      </w:pPr>
+      <w:r>
+        <w:rPr/>
+      </w:r>
+    </w:p>
+    <w:p>
+      <w:pPr>
+        <w:pStyle w:val="Code"/>
+        <w:rPr/>
+      </w:pPr>
+      <w:r>
+        <w:rPr/>
+      </w:r>
+    </w:p>
+    <w:p>
+      <w:pPr>
+        <w:pStyle w:val="Code"/>
+        <w:rPr/>
+      </w:pPr>
+      <w:r>
+        <w:rPr/>
+        <w:t>def main():</w:t>
+      </w:r>
+    </w:p>
+    <w:p>
+      <w:pPr>
+        <w:pStyle w:val="Code"/>
+        <w:rPr/>
+      </w:pPr>
+      <w:r>
+        <w:rPr/>
+        <w:t xml:space="preserve">    </w:t>
+      </w:r>
+      <w:r>
+        <w:rPr/>
+        <w:t>comm = MPI.COMM_WORLD</w:t>
+      </w:r>
+    </w:p>
+    <w:p>
+      <w:pPr>
+        <w:pStyle w:val="Code"/>
+        <w:rPr/>
+      </w:pPr>
+      <w:r>
+        <w:rPr/>
+        <w:t xml:space="preserve">    </w:t>
+      </w:r>
+      <w:r>
+        <w:rPr/>
+        <w:t>rank = comm.Get_rank()</w:t>
+      </w:r>
+    </w:p>
+    <w:p>
+      <w:pPr>
+        <w:pStyle w:val="Code"/>
+        <w:rPr/>
+      </w:pPr>
+      <w:r>
+        <w:rPr/>
+        <w:t xml:space="preserve">    </w:t>
+      </w:r>
+      <w:r>
+        <w:rPr/>
+        <w:t>size = comm.Get_size()</w:t>
+      </w:r>
+    </w:p>
+    <w:p>
+      <w:pPr>
+        <w:pStyle w:val="Code"/>
+        <w:rPr/>
+      </w:pPr>
+      <w:r>
+        <w:rPr/>
+      </w:r>
+    </w:p>
+    <w:p>
+      <w:pPr>
+        <w:pStyle w:val="Code"/>
+        <w:rPr/>
+      </w:pPr>
+      <w:r>
+        <w:rPr/>
+        <w:t xml:space="preserve">    </w:t>
+      </w:r>
+      <w:r>
+        <w:rPr/>
+        <w:t># --- Налаштування згідно з варіантом ---</w:t>
+      </w:r>
+    </w:p>
+    <w:p>
+      <w:pPr>
+        <w:pStyle w:val="Code"/>
+        <w:rPr/>
+      </w:pPr>
+      <w:r>
+        <w:rPr/>
+        <w:t xml:space="preserve">    </w:t>
+      </w:r>
+      <w:r>
+        <w:rPr/>
+        <w:t>WOKRSTATION_ID = 19</w:t>
+      </w:r>
+    </w:p>
+    <w:p>
+      <w:pPr>
+        <w:pStyle w:val="Code"/>
+        <w:rPr/>
+      </w:pPr>
+      <w:r>
+        <w:rPr/>
+      </w:r>
+    </w:p>
+    <w:p>
+      <w:pPr>
+        <w:pStyle w:val="Code"/>
+        <w:rPr/>
+      </w:pPr>
+      <w:r>
+        <w:rPr/>
+        <w:t xml:space="preserve">    </w:t>
+      </w:r>
+      <w:r>
+        <w:rPr/>
+        <w:t>buffer_size = WOKRSTATION_ID * 10</w:t>
+      </w:r>
+    </w:p>
+    <w:p>
+      <w:pPr>
+        <w:pStyle w:val="Code"/>
+        <w:rPr/>
+      </w:pPr>
+      <w:r>
+        <w:rPr/>
+        <w:t xml:space="preserve">    </w:t>
+      </w:r>
+      <w:r>
+        <w:rPr/>
+        <w:t>elements_to_send = WOKRSTATION_ID + 1</w:t>
+      </w:r>
+    </w:p>
+    <w:p>
+      <w:pPr>
+        <w:pStyle w:val="Code"/>
+        <w:rPr/>
+      </w:pPr>
+      <w:r>
+        <w:rPr/>
+        <w:t xml:space="preserve">    </w:t>
+      </w:r>
+      <w:r>
+        <w:rPr/>
+        <w:t># --- ✝ ---</w:t>
+      </w:r>
+    </w:p>
+    <w:p>
+      <w:pPr>
+        <w:pStyle w:val="Code"/>
+        <w:rPr/>
+      </w:pPr>
+      <w:r>
+        <w:rPr/>
+      </w:r>
+    </w:p>
+    <w:p>
+      <w:pPr>
+        <w:pStyle w:val="Code"/>
+        <w:rPr/>
+      </w:pPr>
+      <w:r>
+        <w:rPr/>
+        <w:t xml:space="preserve">    </w:t>
+      </w:r>
+      <w:r>
+        <w:rPr/>
+        <w:t>if size &lt; 2:</w:t>
+      </w:r>
+    </w:p>
+    <w:p>
+      <w:pPr>
+        <w:pStyle w:val="Code"/>
+        <w:rPr/>
+      </w:pPr>
+      <w:r>
+        <w:rPr/>
+        <w:t xml:space="preserve">        </w:t>
+      </w:r>
+      <w:r>
+        <w:rPr/>
+        <w:t>if rank == 0:</w:t>
+      </w:r>
+    </w:p>
+    <w:p>
+      <w:pPr>
+        <w:pStyle w:val="Code"/>
+        <w:rPr/>
+      </w:pPr>
+      <w:r>
+        <w:rPr/>
+        <w:t xml:space="preserve">            </w:t>
+      </w:r>
+      <w:r>
+        <w:rPr/>
+        <w:t>print("Потрібно принаймні 2 процеси.")</w:t>
+      </w:r>
+    </w:p>
+    <w:p>
+      <w:pPr>
+        <w:pStyle w:val="Code"/>
+        <w:rPr/>
+      </w:pPr>
+      <w:r>
+        <w:rPr/>
+        <w:t xml:space="preserve">        </w:t>
+      </w:r>
+      <w:r>
+        <w:rPr/>
+        <w:t>return</w:t>
+      </w:r>
+    </w:p>
+    <w:p>
+      <w:pPr>
+        <w:pStyle w:val="Code"/>
+        <w:rPr/>
+      </w:pPr>
+      <w:r>
+        <w:rPr/>
+      </w:r>
+    </w:p>
+    <w:p>
+      <w:pPr>
+        <w:pStyle w:val="Code"/>
+        <w:rPr/>
+      </w:pPr>
+      <w:r>
+        <w:rPr/>
+        <w:t xml:space="preserve">    </w:t>
+      </w:r>
+      <w:r>
+        <w:rPr/>
+        <w:t>if rank == 1:</w:t>
+      </w:r>
+    </w:p>
+    <w:p>
+      <w:pPr>
+        <w:pStyle w:val="Code"/>
+        <w:rPr/>
+      </w:pPr>
+      <w:r>
+        <w:rPr/>
+        <w:t xml:space="preserve">        </w:t>
+      </w:r>
+      <w:r>
+        <w:rPr/>
+        <w:t># Процес 1: Посилка</w:t>
+      </w:r>
+    </w:p>
+    <w:p>
+      <w:pPr>
+        <w:pStyle w:val="Code"/>
+        <w:rPr/>
+      </w:pPr>
+      <w:r>
+        <w:rPr/>
+        <w:t xml:space="preserve">        </w:t>
+      </w:r>
+      <w:r>
+        <w:rPr/>
+        <w:t># Створити масив даних типу Long (int64)</w:t>
+      </w:r>
+    </w:p>
+    <w:p>
+      <w:pPr>
+        <w:pStyle w:val="Code"/>
+        <w:rPr/>
+      </w:pPr>
+      <w:r>
+        <w:rPr/>
+        <w:t xml:space="preserve">        </w:t>
+      </w:r>
+      <w:r>
+        <w:rPr/>
+        <w:t>data = np.arange(elements_to_send, dtype=np.int64) + 100</w:t>
+      </w:r>
+    </w:p>
+    <w:p>
+      <w:pPr>
+        <w:pStyle w:val="Code"/>
+        <w:rPr/>
+      </w:pPr>
+      <w:r>
+        <w:rPr/>
+        <w:t xml:space="preserve">        </w:t>
+      </w:r>
+      <w:r>
+        <w:rPr/>
+        <w:t>print(f"Процес {rank}: Надсилаю {len(data)} елементів: {data}")</w:t>
+      </w:r>
+    </w:p>
+    <w:p>
+      <w:pPr>
+        <w:pStyle w:val="Code"/>
+        <w:rPr/>
+      </w:pPr>
+      <w:r>
+        <w:rPr/>
+        <w:t xml:space="preserve">        </w:t>
+      </w:r>
+      <w:r>
+        <w:rPr/>
+        <w:t>comm.Send([data, MPI.LONG], dest=0, tag=77)</w:t>
+      </w:r>
+    </w:p>
+    <w:p>
+      <w:pPr>
+        <w:pStyle w:val="Code"/>
+        <w:rPr/>
+      </w:pPr>
+      <w:r>
+        <w:rPr/>
+      </w:r>
+    </w:p>
+    <w:p>
+      <w:pPr>
+        <w:pStyle w:val="Code"/>
+        <w:rPr/>
+      </w:pPr>
+      <w:r>
+        <w:rPr/>
+        <w:t xml:space="preserve">    </w:t>
+      </w:r>
+      <w:r>
+        <w:rPr/>
+        <w:t>elif rank == 0:</w:t>
+      </w:r>
+    </w:p>
+    <w:p>
+      <w:pPr>
+        <w:pStyle w:val="Code"/>
+        <w:rPr/>
+      </w:pPr>
+      <w:r>
+        <w:rPr/>
+        <w:t xml:space="preserve">        </w:t>
+      </w:r>
+      <w:r>
+        <w:rPr/>
+        <w:t># Процес 0: Прийом</w:t>
+      </w:r>
+    </w:p>
+    <w:p>
+      <w:pPr>
+        <w:pStyle w:val="Code"/>
+        <w:rPr/>
+      </w:pPr>
+      <w:r>
+        <w:rPr/>
+        <w:t xml:space="preserve">        </w:t>
+      </w:r>
+      <w:r>
+        <w:rPr/>
+        <w:t>recv_buffer = np.zeros(buffer_size, dtype=np.int64)</w:t>
+      </w:r>
+    </w:p>
+    <w:p>
+      <w:pPr>
+        <w:pStyle w:val="Code"/>
+        <w:rPr/>
+      </w:pPr>
+      <w:r>
+        <w:rPr/>
+        <w:t xml:space="preserve">        </w:t>
+      </w:r>
+      <w:r>
+        <w:rPr/>
+        <w:t>status = MPI.Status()</w:t>
+      </w:r>
+    </w:p>
+    <w:p>
+      <w:pPr>
+        <w:pStyle w:val="Code"/>
+        <w:rPr/>
+      </w:pPr>
+      <w:r>
+        <w:rPr/>
+      </w:r>
+    </w:p>
+    <w:p>
+      <w:pPr>
+        <w:pStyle w:val="Code"/>
+        <w:rPr/>
+      </w:pPr>
+      <w:r>
+        <w:rPr/>
+        <w:t xml:space="preserve">        </w:t>
+      </w:r>
+      <w:r>
+        <w:rPr/>
+        <w:t>comm.Recv([recv_buffer, MPI.LONG], source=1, tag=77, status=status)</w:t>
+      </w:r>
+    </w:p>
+    <w:p>
+      <w:pPr>
+        <w:pStyle w:val="Code"/>
+        <w:rPr/>
+      </w:pPr>
+      <w:r>
+        <w:rPr/>
+      </w:r>
+    </w:p>
+    <w:p>
+      <w:pPr>
+        <w:pStyle w:val="Code"/>
+        <w:rPr/>
+      </w:pPr>
+      <w:r>
+        <w:rPr/>
+        <w:t xml:space="preserve">        </w:t>
+      </w:r>
+      <w:r>
+        <w:rPr/>
+        <w:t>actual_count = status.Get_count(MPI.LONG)</w:t>
+      </w:r>
+    </w:p>
+    <w:p>
+      <w:pPr>
+        <w:pStyle w:val="Code"/>
+        <w:rPr/>
+      </w:pPr>
+      <w:r>
+        <w:rPr/>
+        <w:t xml:space="preserve">        </w:t>
+      </w:r>
+      <w:r>
+        <w:rPr/>
+        <w:t>print("Процес 0: Отримано дані")</w:t>
+      </w:r>
+    </w:p>
+    <w:p>
+      <w:pPr>
+        <w:pStyle w:val="Code"/>
+        <w:rPr/>
+      </w:pPr>
+      <w:r>
+        <w:rPr/>
+        <w:t xml:space="preserve">        </w:t>
+      </w:r>
+      <w:r>
+        <w:rPr/>
+        <w:t>print(f"Фактична кількість прийнятих елементів: {actual_count}")</w:t>
+      </w:r>
+    </w:p>
+    <w:p>
+      <w:pPr>
+        <w:pStyle w:val="Code"/>
+        <w:rPr/>
+      </w:pPr>
+      <w:r>
+        <w:rPr/>
+        <w:t xml:space="preserve">        </w:t>
+      </w:r>
+      <w:r>
+        <w:rPr/>
+        <w:t>print(</w:t>
+      </w:r>
+    </w:p>
+    <w:p>
+      <w:pPr>
+        <w:pStyle w:val="Code"/>
+        <w:rPr/>
+      </w:pPr>
+      <w:r>
+        <w:rPr/>
+        <w:t xml:space="preserve">            </w:t>
+      </w:r>
+      <w:r>
+        <w:rPr/>
+        <w:t>f"Вміст буфера (перші {actual_count} елементів): {recv_buffer[:actual_count]}"</w:t>
+      </w:r>
+    </w:p>
+    <w:p>
+      <w:pPr>
+        <w:pStyle w:val="Code"/>
+        <w:rPr/>
+      </w:pPr>
+      <w:r>
+        <w:rPr/>
+        <w:t xml:space="preserve">        </w:t>
+      </w:r>
+      <w:r>
+        <w:rPr/>
+        <w:t>)</w:t>
+      </w:r>
+    </w:p>
+    <w:p>
+      <w:pPr>
+        <w:pStyle w:val="Code"/>
+        <w:rPr/>
+      </w:pPr>
+      <w:r>
+        <w:rPr/>
+      </w:r>
+    </w:p>
+    <w:p>
+      <w:pPr>
+        <w:pStyle w:val="Code"/>
+        <w:rPr/>
+      </w:pPr>
+      <w:r>
+        <w:rPr/>
+      </w:r>
+    </w:p>
+    <w:p>
+      <w:pPr>
+        <w:pStyle w:val="Code"/>
+        <w:rPr/>
+      </w:pPr>
+      <w:r>
+        <w:rPr/>
+        <w:t>if __name__ == "__main__":</w:t>
+      </w:r>
+    </w:p>
+    <w:p>
+      <w:pPr>
+        <w:pStyle w:val="Code"/>
+        <w:rPr/>
+      </w:pPr>
+      <w:r>
+        <w:rPr/>
+        <w:t xml:space="preserve">    </w:t>
+      </w:r>
+      <w:r>
+        <w:rPr/>
+        <w:t>main()</w:t>
+      </w:r>
+    </w:p>
+    <w:p>
+      <w:pPr>
+        <w:pStyle w:val="P1"/>
+        <w:rPr/>
+      </w:pPr>
+      <w:r>
+        <w:rPr/>
+      </w:r>
+    </w:p>
+    <w:p>
+      <w:pPr>
+        <w:pStyle w:val="H3"/>
+        <w:rPr/>
+      </w:pPr>
+      <w:r>
+        <w:rPr/>
+        <w:t>Результати</w:t>
+      </w:r>
+    </w:p>
+    <w:p>
+      <w:pPr>
+        <w:pStyle w:val="P1"/>
+        <w:rPr/>
+      </w:pPr>
+      <w:r>
+        <w:rPr/>
+      </w:r>
+    </w:p>
+    <w:p>
+      <w:pPr>
+        <w:pStyle w:val="img1"/>
+        <w:rPr/>
+      </w:pPr>
+      <w:r>
+        <w:rPr/>
+        <w:drawing>
+          <wp:inline distT="0" distB="0" distL="0" distR="0">
+            <wp:extent cx="3105150" cy="180975"/>
+            <wp:effectExtent l="0" t="0" r="0" b="0"/>
+            <wp:docPr id="2" name="Зображення2"/>
+            <wp:cNvGraphicFramePr>
+              <a:graphicFrameLocks xmlns:a="http://schemas.openxmlformats.org/drawingml/2006/main" noChangeAspect="1"/>
+            </wp:cNvGraphicFramePr>
+            <a:graphic xmlns:a="http://schemas.openxmlformats.org/drawingml/2006/main">
+              <a:graphicData uri="http://schemas.openxmlformats.org/drawingml/2006/picture">
+                <pic:pic xmlns:pic="http://schemas.openxmlformats.org/drawingml/2006/picture">
+                  <pic:nvPicPr>
+                    <pic:cNvPr id="2" name="Зображення2"/>
+                    <pic:cNvPicPr>
+                      <a:picLocks noChangeAspect="1" noChangeArrowheads="1"/>
+                    </pic:cNvPicPr>
+                  </pic:nvPicPr>
+                  <pic:blipFill>
+                    <a:blip r:embed="rId3"/>
+                    <a:stretch>
+                      <a:fillRect/>
+                    </a:stretch>
+                  </pic:blipFill>
+                  <pic:spPr bwMode="auto">
+                    <a:xfrm>
+                      <a:off x="0" y="0"/>
+                      <a:ext cx="3105150" cy="180975"/>
+                    </a:xfrm>
+                    <a:prstGeom prst="rect">
+                      <a:avLst/>
+                    </a:prstGeom>
+                    <a:noFill/>
+                  </pic:spPr>
+                </pic:pic>
+              </a:graphicData>
+            </a:graphic>
+          </wp:inline>
+        </w:drawing>
+      </w:r>
+    </w:p>
+    <w:p>
+      <w:pPr>
+        <w:pStyle w:val="img1"/>
+        <w:rPr/>
+      </w:pPr>
+      <w:r>
+        <w:rPr/>
+        <w:t>Рисунок 2.1 — Результати роботи програми</w:t>
       </w:r>
     </w:p>
     <w:p>

</xml_diff>

<commit_message>
feat (TR3): make the third program
</commit_message>
<xml_diff>
--- a/42TR Tehnologiji Rozpodilenyh System/3/TR_KNT-122_Onyshchenko_19_PR3.docx
+++ b/42TR Tehnologiji Rozpodilenyh System/3/TR_KNT-122_Onyshchenko_19_PR3.docx
@@ -563,6 +563,52 @@
       <w:r>
         <w:rPr/>
         <w:t>1 Парність процесів</w:t>
+      </w:r>
+    </w:p>
+    <w:p>
+      <w:pPr>
+        <w:pStyle w:val="H3"/>
+        <w:rPr/>
+      </w:pPr>
+      <w:r>
+        <w:rPr/>
+        <w:t>Завдання</w:t>
+      </w:r>
+    </w:p>
+    <w:p>
+      <w:pPr>
+        <w:pStyle w:val="P1"/>
+        <w:rPr/>
+      </w:pPr>
+      <w:r>
+        <w:rPr/>
+      </w:r>
+    </w:p>
+    <w:p>
+      <w:pPr>
+        <w:pStyle w:val="P1"/>
+        <w:rPr>
+          <w:lang w:val="en-US"/>
+        </w:rPr>
+      </w:pPr>
+      <w:r>
+        <w:rPr>
+          <w:lang w:val="en-US"/>
+        </w:rPr>
+        <w:t>Змінити вихідну програму так, щоб кожний процес виводив інформацію щодо парності свого номера.</w:t>
+      </w:r>
+    </w:p>
+    <w:p>
+      <w:pPr>
+        <w:pStyle w:val="P1"/>
+        <w:rPr>
+          <w:lang w:val="en-US"/>
+        </w:rPr>
+      </w:pPr>
+      <w:r>
+        <w:rPr>
+          <w:lang w:val="en-US"/>
+        </w:rPr>
       </w:r>
     </w:p>
     <w:p>
@@ -960,6 +1006,56 @@
       </w:pPr>
       <w:r>
         <w:rPr/>
+        <w:t>Завдання</w:t>
+      </w:r>
+    </w:p>
+    <w:p>
+      <w:pPr>
+        <w:pStyle w:val="P1"/>
+        <w:rPr>
+          <w:lang w:val="en-US"/>
+        </w:rPr>
+      </w:pPr>
+      <w:r>
+        <w:rPr>
+          <w:lang w:val="en-US"/>
+        </w:rPr>
+      </w:r>
+    </w:p>
+    <w:p>
+      <w:pPr>
+        <w:pStyle w:val="P1"/>
+        <w:rPr>
+          <w:lang w:val="en-US"/>
+        </w:rPr>
+      </w:pPr>
+      <w:r>
+        <w:rPr>
+          <w:lang w:val="en-US"/>
+        </w:rPr>
+        <w:t>Доповніть вихідну програму так,  щоб процес  "1" виконував посилку,  а процес  "0" – прийом елементів масиву цілих чисел типу long, причому,  розміри буферів передачі та прийому мають дорівнювати номеру робочого місця,  помноженому на 10,  а кількість елементів,  що передаються – номеру робочого місця, збільшеного на одиницю. В процесі "0"  реалізувати виведення кількості фактично прийнятих елементів.</w:t>
+      </w:r>
+    </w:p>
+    <w:p>
+      <w:pPr>
+        <w:pStyle w:val="P1"/>
+        <w:rPr>
+          <w:lang w:val="en-US"/>
+        </w:rPr>
+      </w:pPr>
+      <w:r>
+        <w:rPr>
+          <w:lang w:val="en-US"/>
+        </w:rPr>
+      </w:r>
+    </w:p>
+    <w:p>
+      <w:pPr>
+        <w:pStyle w:val="H3"/>
+        <w:rPr/>
+      </w:pPr>
+      <w:r>
+        <w:rPr/>
         <w:t>Код</w:t>
       </w:r>
     </w:p>
@@ -1618,12 +1714,896 @@
     </w:p>
     <w:p>
       <w:pPr>
+        <w:pStyle w:val="p11"/>
+        <w:rPr/>
+      </w:pPr>
+      <w:r>
+        <w:rPr/>
+      </w:r>
+    </w:p>
+    <w:p>
+      <w:pPr>
         <w:pStyle w:val="H2"/>
         <w:rPr/>
       </w:pPr>
       <w:r>
         <w:rPr/>
         <w:t>3 Буфер</w:t>
+      </w:r>
+    </w:p>
+    <w:p>
+      <w:pPr>
+        <w:pStyle w:val="H3"/>
+        <w:rPr/>
+      </w:pPr>
+      <w:r>
+        <w:rPr/>
+        <w:t>Завдання</w:t>
+      </w:r>
+    </w:p>
+    <w:p>
+      <w:pPr>
+        <w:pStyle w:val="P1"/>
+        <w:rPr/>
+      </w:pPr>
+      <w:r>
+        <w:rPr/>
+      </w:r>
+    </w:p>
+    <w:p>
+      <w:pPr>
+        <w:pStyle w:val="P1"/>
+        <w:rPr>
+          <w:lang w:val="en-US"/>
+        </w:rPr>
+      </w:pPr>
+      <w:r>
+        <w:rPr>
+          <w:lang w:val="en-US"/>
+        </w:rPr>
+        <w:t>Переробити програму завдання 2 так,  щоб в якості буферів прийому та передачі використовувались масиви динамічної пам’яті.</w:t>
+      </w:r>
+    </w:p>
+    <w:p>
+      <w:pPr>
+        <w:pStyle w:val="P1"/>
+        <w:rPr>
+          <w:lang w:val="en-US"/>
+        </w:rPr>
+      </w:pPr>
+      <w:r>
+        <w:rPr>
+          <w:lang w:val="en-US"/>
+        </w:rPr>
+      </w:r>
+    </w:p>
+    <w:p>
+      <w:pPr>
+        <w:pStyle w:val="H3"/>
+        <w:rPr/>
+      </w:pPr>
+      <w:r>
+        <w:rPr/>
+        <w:t>Код</w:t>
+      </w:r>
+    </w:p>
+    <w:p>
+      <w:pPr>
+        <w:pStyle w:val="P1"/>
+        <w:rPr/>
+      </w:pPr>
+      <w:r>
+        <w:rPr/>
+      </w:r>
+    </w:p>
+    <w:p>
+      <w:pPr>
+        <w:pStyle w:val="Code"/>
+        <w:rPr/>
+      </w:pPr>
+      <w:r>
+        <w:rPr/>
+        <w:t>from mpi4py import MPI</w:t>
+      </w:r>
+    </w:p>
+    <w:p>
+      <w:pPr>
+        <w:pStyle w:val="Code"/>
+        <w:rPr/>
+      </w:pPr>
+      <w:r>
+        <w:rPr/>
+        <w:t>import numpy as np</w:t>
+      </w:r>
+    </w:p>
+    <w:p>
+      <w:pPr>
+        <w:pStyle w:val="Code"/>
+        <w:rPr/>
+      </w:pPr>
+      <w:r>
+        <w:rPr/>
+      </w:r>
+    </w:p>
+    <w:p>
+      <w:pPr>
+        <w:pStyle w:val="Code"/>
+        <w:rPr/>
+      </w:pPr>
+      <w:r>
+        <w:rPr/>
+      </w:r>
+    </w:p>
+    <w:p>
+      <w:pPr>
+        <w:pStyle w:val="Code"/>
+        <w:rPr/>
+      </w:pPr>
+      <w:r>
+        <w:rPr/>
+        <w:t>def main():</w:t>
+      </w:r>
+    </w:p>
+    <w:p>
+      <w:pPr>
+        <w:pStyle w:val="Code"/>
+        <w:rPr/>
+      </w:pPr>
+      <w:r>
+        <w:rPr/>
+        <w:t xml:space="preserve">    </w:t>
+      </w:r>
+      <w:r>
+        <w:rPr/>
+        <w:t>comm = MPI.COMM_WORLD</w:t>
+      </w:r>
+    </w:p>
+    <w:p>
+      <w:pPr>
+        <w:pStyle w:val="Code"/>
+        <w:rPr/>
+      </w:pPr>
+      <w:r>
+        <w:rPr/>
+        <w:t xml:space="preserve">    </w:t>
+      </w:r>
+      <w:r>
+        <w:rPr/>
+        <w:t>rank = comm.Get_rank()</w:t>
+      </w:r>
+    </w:p>
+    <w:p>
+      <w:pPr>
+        <w:pStyle w:val="Code"/>
+        <w:rPr/>
+      </w:pPr>
+      <w:r>
+        <w:rPr/>
+        <w:t xml:space="preserve">    </w:t>
+      </w:r>
+      <w:r>
+        <w:rPr/>
+        <w:t>size = comm.Get_size()</w:t>
+      </w:r>
+    </w:p>
+    <w:p>
+      <w:pPr>
+        <w:pStyle w:val="Code"/>
+        <w:rPr/>
+      </w:pPr>
+      <w:r>
+        <w:rPr/>
+      </w:r>
+    </w:p>
+    <w:p>
+      <w:pPr>
+        <w:pStyle w:val="Code"/>
+        <w:rPr/>
+      </w:pPr>
+      <w:r>
+        <w:rPr/>
+        <w:t xml:space="preserve">    </w:t>
+      </w:r>
+      <w:r>
+        <w:rPr/>
+        <w:t># --- Налаштування згідно з варіантом ---</w:t>
+      </w:r>
+    </w:p>
+    <w:p>
+      <w:pPr>
+        <w:pStyle w:val="Code"/>
+        <w:rPr/>
+      </w:pPr>
+      <w:r>
+        <w:rPr/>
+        <w:t xml:space="preserve">    </w:t>
+      </w:r>
+      <w:r>
+        <w:rPr/>
+        <w:t>WOKRSTATION_ID = 19</w:t>
+      </w:r>
+    </w:p>
+    <w:p>
+      <w:pPr>
+        <w:pStyle w:val="Code"/>
+        <w:rPr/>
+      </w:pPr>
+      <w:r>
+        <w:rPr/>
+        <w:t xml:space="preserve">    </w:t>
+      </w:r>
+      <w:r>
+        <w:rPr/>
+        <w:t>buffer_size = WOKRSTATION_ID * 10</w:t>
+      </w:r>
+    </w:p>
+    <w:p>
+      <w:pPr>
+        <w:pStyle w:val="Code"/>
+        <w:rPr/>
+      </w:pPr>
+      <w:r>
+        <w:rPr/>
+        <w:t xml:space="preserve">    </w:t>
+      </w:r>
+      <w:r>
+        <w:rPr/>
+        <w:t>elements_to_send = WOKRSTATION_ID + 1</w:t>
+      </w:r>
+    </w:p>
+    <w:p>
+      <w:pPr>
+        <w:pStyle w:val="Code"/>
+        <w:rPr/>
+      </w:pPr>
+      <w:r>
+        <w:rPr/>
+        <w:t xml:space="preserve">    </w:t>
+      </w:r>
+      <w:r>
+        <w:rPr/>
+        <w:t># --- ✝ ---</w:t>
+      </w:r>
+    </w:p>
+    <w:p>
+      <w:pPr>
+        <w:pStyle w:val="Code"/>
+        <w:rPr/>
+      </w:pPr>
+      <w:r>
+        <w:rPr/>
+      </w:r>
+    </w:p>
+    <w:p>
+      <w:pPr>
+        <w:pStyle w:val="Code"/>
+        <w:rPr/>
+      </w:pPr>
+      <w:r>
+        <w:rPr/>
+        <w:t xml:space="preserve">    </w:t>
+      </w:r>
+      <w:r>
+        <w:rPr/>
+        <w:t>if size &lt; 2:</w:t>
+      </w:r>
+    </w:p>
+    <w:p>
+      <w:pPr>
+        <w:pStyle w:val="Code"/>
+        <w:rPr/>
+      </w:pPr>
+      <w:r>
+        <w:rPr/>
+        <w:t xml:space="preserve">        </w:t>
+      </w:r>
+      <w:r>
+        <w:rPr/>
+        <w:t>if rank == 0:</w:t>
+      </w:r>
+    </w:p>
+    <w:p>
+      <w:pPr>
+        <w:pStyle w:val="Code"/>
+        <w:rPr/>
+      </w:pPr>
+      <w:r>
+        <w:rPr/>
+        <w:t xml:space="preserve">            </w:t>
+      </w:r>
+      <w:r>
+        <w:rPr/>
+        <w:t>print("Потрібно принаймні 2 процеси.")</w:t>
+      </w:r>
+    </w:p>
+    <w:p>
+      <w:pPr>
+        <w:pStyle w:val="Code"/>
+        <w:rPr/>
+      </w:pPr>
+      <w:r>
+        <w:rPr/>
+        <w:t xml:space="preserve">        </w:t>
+      </w:r>
+      <w:r>
+        <w:rPr/>
+        <w:t>return</w:t>
+      </w:r>
+    </w:p>
+    <w:p>
+      <w:pPr>
+        <w:pStyle w:val="Code"/>
+        <w:rPr/>
+      </w:pPr>
+      <w:r>
+        <w:rPr/>
+      </w:r>
+    </w:p>
+    <w:p>
+      <w:pPr>
+        <w:pStyle w:val="Code"/>
+        <w:rPr/>
+      </w:pPr>
+      <w:r>
+        <w:rPr/>
+        <w:t xml:space="preserve">    </w:t>
+      </w:r>
+      <w:r>
+        <w:rPr/>
+        <w:t>if rank == 1:</w:t>
+      </w:r>
+    </w:p>
+    <w:p>
+      <w:pPr>
+        <w:pStyle w:val="Code"/>
+        <w:rPr/>
+      </w:pPr>
+      <w:r>
+        <w:rPr/>
+        <w:t xml:space="preserve">        </w:t>
+      </w:r>
+      <w:r>
+        <w:rPr/>
+        <w:t># Динамічне виділення пам'яті</w:t>
+      </w:r>
+    </w:p>
+    <w:p>
+      <w:pPr>
+        <w:pStyle w:val="Code"/>
+        <w:rPr/>
+      </w:pPr>
+      <w:r>
+        <w:rPr/>
+        <w:t xml:space="preserve">        </w:t>
+      </w:r>
+      <w:r>
+        <w:rPr/>
+        <w:t># Використання np.empty для виділення пам'яті</w:t>
+      </w:r>
+    </w:p>
+    <w:p>
+      <w:pPr>
+        <w:pStyle w:val="Code"/>
+        <w:rPr/>
+      </w:pPr>
+      <w:r>
+        <w:rPr/>
+        <w:t xml:space="preserve">        </w:t>
+      </w:r>
+      <w:r>
+        <w:rPr/>
+        <w:t>send_data = np.empty(elements_to_send, dtype=np.int64)</w:t>
+      </w:r>
+    </w:p>
+    <w:p>
+      <w:pPr>
+        <w:pStyle w:val="Code"/>
+        <w:rPr/>
+      </w:pPr>
+      <w:r>
+        <w:rPr/>
+      </w:r>
+    </w:p>
+    <w:p>
+      <w:pPr>
+        <w:pStyle w:val="Code"/>
+        <w:rPr/>
+      </w:pPr>
+      <w:r>
+        <w:rPr/>
+        <w:t xml:space="preserve">        </w:t>
+      </w:r>
+      <w:r>
+        <w:rPr/>
+        <w:t># Ініціалізація даних</w:t>
+      </w:r>
+    </w:p>
+    <w:p>
+      <w:pPr>
+        <w:pStyle w:val="Code"/>
+        <w:rPr/>
+      </w:pPr>
+      <w:r>
+        <w:rPr/>
+        <w:t xml:space="preserve">        </w:t>
+      </w:r>
+      <w:r>
+        <w:rPr/>
+        <w:t>for i in range(elements_to_send):</w:t>
+      </w:r>
+    </w:p>
+    <w:p>
+      <w:pPr>
+        <w:pStyle w:val="Code"/>
+        <w:rPr/>
+      </w:pPr>
+      <w:r>
+        <w:rPr/>
+        <w:t xml:space="preserve">            </w:t>
+      </w:r>
+      <w:r>
+        <w:rPr/>
+        <w:t>send_data[i] = i + 100</w:t>
+      </w:r>
+    </w:p>
+    <w:p>
+      <w:pPr>
+        <w:pStyle w:val="Code"/>
+        <w:rPr/>
+      </w:pPr>
+      <w:r>
+        <w:rPr/>
+      </w:r>
+    </w:p>
+    <w:p>
+      <w:pPr>
+        <w:pStyle w:val="Code"/>
+        <w:rPr/>
+      </w:pPr>
+      <w:r>
+        <w:rPr/>
+        <w:t xml:space="preserve">        </w:t>
+      </w:r>
+      <w:r>
+        <w:rPr/>
+        <w:t>print(f"Процес {rank}: Динамічно створений масив розміром {elements_to_send}")</w:t>
+      </w:r>
+    </w:p>
+    <w:p>
+      <w:pPr>
+        <w:pStyle w:val="Code"/>
+        <w:rPr/>
+      </w:pPr>
+      <w:r>
+        <w:rPr/>
+        <w:t xml:space="preserve">        </w:t>
+      </w:r>
+      <w:r>
+        <w:rPr/>
+        <w:t>print(f"Процес {rank}: Надсилаю дані: {send_data}")</w:t>
+      </w:r>
+    </w:p>
+    <w:p>
+      <w:pPr>
+        <w:pStyle w:val="Code"/>
+        <w:rPr/>
+      </w:pPr>
+      <w:r>
+        <w:rPr/>
+      </w:r>
+    </w:p>
+    <w:p>
+      <w:pPr>
+        <w:pStyle w:val="Code"/>
+        <w:rPr/>
+      </w:pPr>
+      <w:r>
+        <w:rPr/>
+        <w:t xml:space="preserve">        </w:t>
+      </w:r>
+      <w:r>
+        <w:rPr/>
+        <w:t># Передача даних</w:t>
+      </w:r>
+    </w:p>
+    <w:p>
+      <w:pPr>
+        <w:pStyle w:val="Code"/>
+        <w:rPr/>
+      </w:pPr>
+      <w:r>
+        <w:rPr/>
+        <w:t xml:space="preserve">        </w:t>
+      </w:r>
+      <w:r>
+        <w:rPr/>
+        <w:t>comm.send([send_data, MPI.LONG], dest=0, tag=77)</w:t>
+      </w:r>
+    </w:p>
+    <w:p>
+      <w:pPr>
+        <w:pStyle w:val="Code"/>
+        <w:rPr/>
+      </w:pPr>
+      <w:r>
+        <w:rPr/>
+      </w:r>
+    </w:p>
+    <w:p>
+      <w:pPr>
+        <w:pStyle w:val="Code"/>
+        <w:rPr/>
+      </w:pPr>
+      <w:r>
+        <w:rPr/>
+        <w:t xml:space="preserve">    </w:t>
+      </w:r>
+      <w:r>
+        <w:rPr/>
+        <w:t>elif rank == 0:</w:t>
+      </w:r>
+    </w:p>
+    <w:p>
+      <w:pPr>
+        <w:pStyle w:val="Code"/>
+        <w:rPr/>
+      </w:pPr>
+      <w:r>
+        <w:rPr/>
+        <w:t xml:space="preserve">        </w:t>
+      </w:r>
+      <w:r>
+        <w:rPr/>
+        <w:t># Динамічне всиділення пам'яті для буфера обміну</w:t>
+      </w:r>
+    </w:p>
+    <w:p>
+      <w:pPr>
+        <w:pStyle w:val="Code"/>
+        <w:rPr/>
+      </w:pPr>
+      <w:r>
+        <w:rPr/>
+        <w:t xml:space="preserve">        </w:t>
+      </w:r>
+      <w:r>
+        <w:rPr/>
+        <w:t># Виділяємо пам'яті під максимально можливий розмір буфера</w:t>
+      </w:r>
+    </w:p>
+    <w:p>
+      <w:pPr>
+        <w:pStyle w:val="Code"/>
+        <w:rPr/>
+      </w:pPr>
+      <w:r>
+        <w:rPr/>
+        <w:t xml:space="preserve">        </w:t>
+      </w:r>
+      <w:r>
+        <w:rPr/>
+        <w:t>recv_buffer = np.empty(buffer_size, dtype=np.int64)</w:t>
+      </w:r>
+    </w:p>
+    <w:p>
+      <w:pPr>
+        <w:pStyle w:val="Code"/>
+        <w:rPr/>
+      </w:pPr>
+      <w:r>
+        <w:rPr/>
+      </w:r>
+    </w:p>
+    <w:p>
+      <w:pPr>
+        <w:pStyle w:val="Code"/>
+        <w:rPr/>
+      </w:pPr>
+      <w:r>
+        <w:rPr/>
+        <w:t xml:space="preserve">        </w:t>
+      </w:r>
+      <w:r>
+        <w:rPr/>
+        <w:t>status = MPI.Status()</w:t>
+      </w:r>
+    </w:p>
+    <w:p>
+      <w:pPr>
+        <w:pStyle w:val="Code"/>
+        <w:rPr/>
+      </w:pPr>
+      <w:r>
+        <w:rPr/>
+      </w:r>
+    </w:p>
+    <w:p>
+      <w:pPr>
+        <w:pStyle w:val="Code"/>
+        <w:rPr/>
+      </w:pPr>
+      <w:r>
+        <w:rPr/>
+        <w:t xml:space="preserve">        </w:t>
+      </w:r>
+      <w:r>
+        <w:rPr/>
+        <w:t># Прийом даних у динамічно виділений буфер</w:t>
+      </w:r>
+    </w:p>
+    <w:p>
+      <w:pPr>
+        <w:pStyle w:val="Code"/>
+        <w:rPr/>
+      </w:pPr>
+      <w:r>
+        <w:rPr/>
+        <w:t xml:space="preserve">        </w:t>
+      </w:r>
+      <w:r>
+        <w:rPr/>
+        <w:t>comm.Recv([recv_buffer, MPI.LONG], source=1, tag=77, status=status)</w:t>
+      </w:r>
+    </w:p>
+    <w:p>
+      <w:pPr>
+        <w:pStyle w:val="Code"/>
+        <w:rPr/>
+      </w:pPr>
+      <w:r>
+        <w:rPr/>
+      </w:r>
+    </w:p>
+    <w:p>
+      <w:pPr>
+        <w:pStyle w:val="Code"/>
+        <w:rPr/>
+      </w:pPr>
+      <w:r>
+        <w:rPr/>
+        <w:t xml:space="preserve">        </w:t>
+      </w:r>
+      <w:r>
+        <w:rPr/>
+        <w:t>actual_count = status.Get_count(MPI.LONG)</w:t>
+      </w:r>
+    </w:p>
+    <w:p>
+      <w:pPr>
+        <w:pStyle w:val="Code"/>
+        <w:rPr/>
+      </w:pPr>
+      <w:r>
+        <w:rPr/>
+      </w:r>
+    </w:p>
+    <w:p>
+      <w:pPr>
+        <w:pStyle w:val="Code"/>
+        <w:rPr/>
+      </w:pPr>
+      <w:r>
+        <w:rPr/>
+        <w:t xml:space="preserve">        </w:t>
+      </w:r>
+      <w:r>
+        <w:rPr/>
+        <w:t>print(</w:t>
+      </w:r>
+    </w:p>
+    <w:p>
+      <w:pPr>
+        <w:pStyle w:val="Code"/>
+        <w:rPr/>
+      </w:pPr>
+      <w:r>
+        <w:rPr/>
+        <w:t xml:space="preserve">            </w:t>
+      </w:r>
+      <w:r>
+        <w:rPr/>
+        <w:t>f"Процес 0: Отримано дані у динамічний буфер (розмір буфера: {buffer_size})"</w:t>
+      </w:r>
+    </w:p>
+    <w:p>
+      <w:pPr>
+        <w:pStyle w:val="Code"/>
+        <w:rPr/>
+      </w:pPr>
+      <w:r>
+        <w:rPr/>
+        <w:t xml:space="preserve">        </w:t>
+      </w:r>
+      <w:r>
+        <w:rPr/>
+        <w:t>)</w:t>
+      </w:r>
+    </w:p>
+    <w:p>
+      <w:pPr>
+        <w:pStyle w:val="Code"/>
+        <w:rPr/>
+      </w:pPr>
+      <w:r>
+        <w:rPr/>
+        <w:t xml:space="preserve">        </w:t>
+      </w:r>
+      <w:r>
+        <w:rPr/>
+        <w:t>print(f"Фактична кількість прийнятих елементів: {actual_count}")</w:t>
+      </w:r>
+    </w:p>
+    <w:p>
+      <w:pPr>
+        <w:pStyle w:val="Code"/>
+        <w:rPr/>
+      </w:pPr>
+      <w:r>
+        <w:rPr/>
+        <w:t xml:space="preserve">        </w:t>
+      </w:r>
+      <w:r>
+        <w:rPr/>
+        <w:t>print(f"Вміст отриманих даних: {recv_buffer[:actual_count]}")</w:t>
+      </w:r>
+    </w:p>
+    <w:p>
+      <w:pPr>
+        <w:pStyle w:val="Code"/>
+        <w:rPr/>
+      </w:pPr>
+      <w:r>
+        <w:rPr/>
+      </w:r>
+    </w:p>
+    <w:p>
+      <w:pPr>
+        <w:pStyle w:val="Code"/>
+        <w:rPr/>
+      </w:pPr>
+      <w:r>
+        <w:rPr/>
+        <w:t xml:space="preserve">    </w:t>
+      </w:r>
+      <w:r>
+        <w:rPr/>
+        <w:t># Явне звільнення пам'яті в Python відбувається автоматично (Garbage Collector)</w:t>
+      </w:r>
+    </w:p>
+    <w:p>
+      <w:pPr>
+        <w:pStyle w:val="Code"/>
+        <w:rPr/>
+      </w:pPr>
+      <w:r>
+        <w:rPr/>
+      </w:r>
+    </w:p>
+    <w:p>
+      <w:pPr>
+        <w:pStyle w:val="Code"/>
+        <w:rPr/>
+      </w:pPr>
+      <w:r>
+        <w:rPr/>
+      </w:r>
+    </w:p>
+    <w:p>
+      <w:pPr>
+        <w:pStyle w:val="Code"/>
+        <w:rPr/>
+      </w:pPr>
+      <w:r>
+        <w:rPr/>
+        <w:t>if __name__ == "__main__":</w:t>
+      </w:r>
+    </w:p>
+    <w:p>
+      <w:pPr>
+        <w:pStyle w:val="Code"/>
+        <w:rPr/>
+      </w:pPr>
+      <w:r>
+        <w:rPr/>
+        <w:t xml:space="preserve">    </w:t>
+      </w:r>
+      <w:r>
+        <w:rPr/>
+        <w:t>main()</w:t>
+      </w:r>
+    </w:p>
+    <w:p>
+      <w:pPr>
+        <w:pStyle w:val="P1"/>
+        <w:rPr/>
+      </w:pPr>
+      <w:r>
+        <w:rPr/>
+      </w:r>
+    </w:p>
+    <w:p>
+      <w:pPr>
+        <w:pStyle w:val="H3"/>
+        <w:rPr/>
+      </w:pPr>
+      <w:r>
+        <w:rPr/>
+        <w:t>Результати</w:t>
+      </w:r>
+    </w:p>
+    <w:p>
+      <w:pPr>
+        <w:pStyle w:val="P1"/>
+        <w:rPr/>
+      </w:pPr>
+      <w:r>
+        <w:rPr/>
+      </w:r>
+    </w:p>
+    <w:p>
+      <w:pPr>
+        <w:pStyle w:val="img1"/>
+        <w:rPr/>
+      </w:pPr>
+      <w:r>
+        <w:rPr/>
+        <w:drawing>
+          <wp:inline distT="0" distB="0" distL="0" distR="0">
+            <wp:extent cx="3105150" cy="180975"/>
+            <wp:effectExtent l="0" t="0" r="0" b="0"/>
+            <wp:docPr id="3" name="Зображення2 копія 1"/>
+            <wp:cNvGraphicFramePr>
+              <a:graphicFrameLocks xmlns:a="http://schemas.openxmlformats.org/drawingml/2006/main" noChangeAspect="1"/>
+            </wp:cNvGraphicFramePr>
+            <a:graphic xmlns:a="http://schemas.openxmlformats.org/drawingml/2006/main">
+              <a:graphicData uri="http://schemas.openxmlformats.org/drawingml/2006/picture">
+                <pic:pic xmlns:pic="http://schemas.openxmlformats.org/drawingml/2006/picture">
+                  <pic:nvPicPr>
+                    <pic:cNvPr id="3" name="Зображення2 копія 1"/>
+                    <pic:cNvPicPr>
+                      <a:picLocks noChangeAspect="1" noChangeArrowheads="1"/>
+                    </pic:cNvPicPr>
+                  </pic:nvPicPr>
+                  <pic:blipFill>
+                    <a:blip r:embed="rId4"/>
+                    <a:stretch>
+                      <a:fillRect/>
+                    </a:stretch>
+                  </pic:blipFill>
+                  <pic:spPr bwMode="auto">
+                    <a:xfrm>
+                      <a:off x="0" y="0"/>
+                      <a:ext cx="3105150" cy="180975"/>
+                    </a:xfrm>
+                    <a:prstGeom prst="rect">
+                      <a:avLst/>
+                    </a:prstGeom>
+                    <a:noFill/>
+                  </pic:spPr>
+                </pic:pic>
+              </a:graphicData>
+            </a:graphic>
+          </wp:inline>
+        </w:drawing>
+      </w:r>
+    </w:p>
+    <w:p>
+      <w:pPr>
+        <w:pStyle w:val="img1"/>
+        <w:rPr/>
+      </w:pPr>
+      <w:r>
+        <w:rPr/>
+        <w:t>Рисунок 2.1 — Результати роботи програми</w:t>
+      </w:r>
+    </w:p>
+    <w:p>
+      <w:pPr>
+        <w:pStyle w:val="p11"/>
+        <w:rPr/>
+      </w:pPr>
+      <w:r>
+        <w:rPr/>
       </w:r>
     </w:p>
     <w:p>

</xml_diff>

<commit_message>
refactor (TR3): rename the files for easier startup
</commit_message>
<xml_diff>
--- a/42TR Tehnologiji Rozpodilenyh System/3/TR_KNT-122_Onyshchenko_19_PR3.docx
+++ b/42TR Tehnologiji Rozpodilenyh System/3/TR_KNT-122_Onyshchenko_19_PR3.docx
@@ -740,7 +740,7 @@
       </w:r>
       <w:r>
         <w:rPr/>
-        <w:t>parity = "парний" if rank % 2 == 0 else "непарний"</w:t>
+        <w:t>parity = "even" if rank % 2 == 0 else "odd"</w:t>
       </w:r>
     </w:p>
     <w:p>
@@ -754,7 +754,7 @@
       </w:r>
       <w:r>
         <w:rPr/>
-        <w:t>print(f"Процес {rank} з {size} є {parity}")</w:t>
+        <w:t>print(f"Process {rank} of {size} is {parity}")</w:t>
       </w:r>
     </w:p>
     <w:p>
@@ -814,7 +814,7 @@
       </w:r>
       <w:r>
         <w:rPr/>
-        <w:t>print(f"\nВсього процесів: {size}")</w:t>
+        <w:t>print(f"\nTotal processes: {size}")</w:t>
       </w:r>
     </w:p>
     <w:p>
@@ -828,7 +828,7 @@
       </w:r>
       <w:r>
         <w:rPr/>
-        <w:t>print("Вміст командного рядку для першого процесу:")</w:t>
+        <w:t>print(f"CommandLine for {rank} process:")</w:t>
       </w:r>
     </w:p>
     <w:p>
@@ -922,7 +922,7 @@
     </w:p>
     <w:p>
       <w:pPr>
-        <w:pStyle w:val="img1"/>
+        <w:pStyle w:val="P1"/>
         <w:rPr/>
       </w:pPr>
       <w:r>
@@ -938,7 +938,7 @@
         <w:rPr/>
         <w:drawing>
           <wp:inline distT="0" distB="0" distL="0" distR="0">
-            <wp:extent cx="5731510" cy="898525"/>
+            <wp:extent cx="2976245" cy="1363345"/>
             <wp:effectExtent l="0" t="0" r="0" b="0"/>
             <wp:docPr id="1" name="Зображення1"/>
             <wp:cNvGraphicFramePr>
@@ -962,7 +962,7 @@
                   <pic:spPr bwMode="auto">
                     <a:xfrm>
                       <a:off x="0" y="0"/>
-                      <a:ext cx="5731510" cy="898525"/>
+                      <a:ext cx="2976245" cy="1363345"/>
                     </a:xfrm>
                     <a:prstGeom prst="rect">
                       <a:avLst/>
@@ -975,6 +975,12 @@
           </wp:inline>
         </w:drawing>
       </w:r>
+    </w:p>
+    <w:p>
+      <w:pPr>
+        <w:pStyle w:val="img1"/>
+        <w:rPr/>
+      </w:pPr>
       <w:r>
         <w:rPr/>
         <w:t>Рисунок 1.1 — Вигляд результатів роботи програми</w:t>
@@ -1071,559 +1077,951 @@
     <w:p>
       <w:pPr>
         <w:pStyle w:val="Code"/>
-        <w:rPr/>
-      </w:pPr>
-      <w:r>
-        <w:rPr/>
+        <w:rPr>
+          <w:rFonts w:ascii="Courier New" w:hAnsi="Courier New"/>
+          <w:color w:val="auto"/>
+        </w:rPr>
+      </w:pPr>
+      <w:r>
+        <w:rPr>
+          <w:rFonts w:ascii="Courier New" w:hAnsi="Courier New"/>
+          <w:color w:val="auto"/>
+        </w:rPr>
         <w:t>from mpi4py import MPI</w:t>
       </w:r>
     </w:p>
     <w:p>
       <w:pPr>
         <w:pStyle w:val="Code"/>
-        <w:rPr/>
-      </w:pPr>
-      <w:r>
-        <w:rPr/>
+        <w:rPr>
+          <w:rFonts w:ascii="Courier New" w:hAnsi="Courier New"/>
+          <w:color w:val="auto"/>
+        </w:rPr>
+      </w:pPr>
+      <w:r>
+        <w:rPr>
+          <w:rFonts w:ascii="Courier New" w:hAnsi="Courier New"/>
+          <w:color w:val="auto"/>
+        </w:rPr>
         <w:t>import numpy as np</w:t>
       </w:r>
     </w:p>
     <w:p>
       <w:pPr>
         <w:pStyle w:val="Code"/>
-        <w:rPr/>
-      </w:pPr>
-      <w:r>
-        <w:rPr/>
-      </w:r>
-    </w:p>
-    <w:p>
-      <w:pPr>
-        <w:pStyle w:val="Code"/>
-        <w:rPr/>
-      </w:pPr>
-      <w:r>
-        <w:rPr/>
-      </w:r>
-    </w:p>
-    <w:p>
-      <w:pPr>
-        <w:pStyle w:val="Code"/>
-        <w:rPr/>
-      </w:pPr>
-      <w:r>
-        <w:rPr/>
+        <w:rPr>
+          <w:rFonts w:ascii="Courier New" w:hAnsi="Courier New"/>
+          <w:color w:val="auto"/>
+        </w:rPr>
+      </w:pPr>
+      <w:r>
+        <w:rPr>
+          <w:rFonts w:ascii="Courier New" w:hAnsi="Courier New"/>
+          <w:color w:val="auto"/>
+        </w:rPr>
+      </w:r>
+    </w:p>
+    <w:p>
+      <w:pPr>
+        <w:pStyle w:val="Code"/>
+        <w:rPr>
+          <w:rFonts w:ascii="Courier New" w:hAnsi="Courier New"/>
+          <w:color w:val="auto"/>
+        </w:rPr>
+      </w:pPr>
+      <w:r>
+        <w:rPr>
+          <w:rFonts w:ascii="Courier New" w:hAnsi="Courier New"/>
+          <w:color w:val="auto"/>
+        </w:rPr>
         <w:t>def main():</w:t>
       </w:r>
     </w:p>
     <w:p>
       <w:pPr>
         <w:pStyle w:val="Code"/>
-        <w:rPr/>
-      </w:pPr>
-      <w:r>
-        <w:rPr/>
-        <w:t xml:space="preserve">    </w:t>
-      </w:r>
-      <w:r>
-        <w:rPr/>
+        <w:rPr>
+          <w:rFonts w:ascii="Courier New" w:hAnsi="Courier New"/>
+          <w:color w:val="auto"/>
+        </w:rPr>
+      </w:pPr>
+      <w:r>
+        <w:rPr>
+          <w:rFonts w:ascii="Courier New" w:hAnsi="Courier New"/>
+          <w:color w:val="auto"/>
+        </w:rPr>
+        <w:t xml:space="preserve">    </w:t>
+      </w:r>
+      <w:r>
+        <w:rPr>
+          <w:rFonts w:ascii="Courier New" w:hAnsi="Courier New"/>
+          <w:b w:val="false"/>
+          <w:color w:val="auto"/>
+          <w:sz w:val="21"/>
+        </w:rPr>
         <w:t>comm = MPI.COMM_WORLD</w:t>
       </w:r>
     </w:p>
     <w:p>
       <w:pPr>
         <w:pStyle w:val="Code"/>
-        <w:rPr/>
-      </w:pPr>
-      <w:r>
-        <w:rPr/>
-        <w:t xml:space="preserve">    </w:t>
-      </w:r>
-      <w:r>
-        <w:rPr/>
+        <w:rPr>
+          <w:rFonts w:ascii="Courier New" w:hAnsi="Courier New"/>
+          <w:color w:val="auto"/>
+        </w:rPr>
+      </w:pPr>
+      <w:r>
+        <w:rPr>
+          <w:rFonts w:ascii="Courier New" w:hAnsi="Courier New"/>
+          <w:color w:val="auto"/>
+        </w:rPr>
+        <w:t xml:space="preserve">    </w:t>
+      </w:r>
+      <w:r>
+        <w:rPr>
+          <w:rFonts w:ascii="Courier New" w:hAnsi="Courier New"/>
+          <w:b w:val="false"/>
+          <w:color w:val="auto"/>
+          <w:sz w:val="21"/>
+        </w:rPr>
         <w:t>rank = comm.Get_rank()</w:t>
       </w:r>
     </w:p>
     <w:p>
       <w:pPr>
         <w:pStyle w:val="Code"/>
-        <w:rPr/>
-      </w:pPr>
-      <w:r>
-        <w:rPr/>
-        <w:t xml:space="preserve">    </w:t>
-      </w:r>
-      <w:r>
-        <w:rPr/>
+        <w:rPr>
+          <w:rFonts w:ascii="Courier New" w:hAnsi="Courier New"/>
+          <w:color w:val="auto"/>
+        </w:rPr>
+      </w:pPr>
+      <w:r>
+        <w:rPr>
+          <w:rFonts w:ascii="Courier New" w:hAnsi="Courier New"/>
+          <w:color w:val="auto"/>
+        </w:rPr>
+        <w:t xml:space="preserve">    </w:t>
+      </w:r>
+      <w:r>
+        <w:rPr>
+          <w:rFonts w:ascii="Courier New" w:hAnsi="Courier New"/>
+          <w:b w:val="false"/>
+          <w:color w:val="auto"/>
+          <w:sz w:val="21"/>
+        </w:rPr>
         <w:t>size = comm.Get_size()</w:t>
       </w:r>
     </w:p>
     <w:p>
       <w:pPr>
         <w:pStyle w:val="Code"/>
-        <w:rPr/>
-      </w:pPr>
-      <w:r>
-        <w:rPr/>
-      </w:r>
-    </w:p>
-    <w:p>
-      <w:pPr>
-        <w:pStyle w:val="Code"/>
-        <w:rPr/>
-      </w:pPr>
-      <w:r>
-        <w:rPr/>
-        <w:t xml:space="preserve">    </w:t>
-      </w:r>
-      <w:r>
-        <w:rPr/>
+        <w:rPr>
+          <w:rFonts w:ascii="Courier New" w:hAnsi="Courier New"/>
+          <w:color w:val="auto"/>
+        </w:rPr>
+      </w:pPr>
+      <w:r>
+        <w:rPr>
+          <w:rFonts w:ascii="Courier New" w:hAnsi="Courier New"/>
+          <w:color w:val="auto"/>
+        </w:rPr>
+      </w:r>
+    </w:p>
+    <w:p>
+      <w:pPr>
+        <w:pStyle w:val="Code"/>
+        <w:rPr>
+          <w:rFonts w:ascii="Courier New" w:hAnsi="Courier New"/>
+          <w:color w:val="auto"/>
+        </w:rPr>
+      </w:pPr>
+      <w:r>
+        <w:rPr>
+          <w:rFonts w:ascii="Courier New" w:hAnsi="Courier New"/>
+          <w:color w:val="auto"/>
+        </w:rPr>
+        <w:t xml:space="preserve">    </w:t>
+      </w:r>
+      <w:r>
+        <w:rPr>
+          <w:rFonts w:ascii="Courier New" w:hAnsi="Courier New"/>
+          <w:b w:val="false"/>
+          <w:color w:val="auto"/>
+          <w:sz w:val="21"/>
+        </w:rPr>
         <w:t># --- Налаштування згідно з варіантом ---</w:t>
       </w:r>
     </w:p>
     <w:p>
       <w:pPr>
         <w:pStyle w:val="Code"/>
-        <w:rPr/>
-      </w:pPr>
-      <w:r>
-        <w:rPr/>
-        <w:t xml:space="preserve">    </w:t>
-      </w:r>
-      <w:r>
-        <w:rPr/>
+        <w:rPr>
+          <w:rFonts w:ascii="Courier New" w:hAnsi="Courier New"/>
+          <w:color w:val="auto"/>
+        </w:rPr>
+      </w:pPr>
+      <w:r>
+        <w:rPr>
+          <w:rFonts w:ascii="Courier New" w:hAnsi="Courier New"/>
+          <w:color w:val="auto"/>
+        </w:rPr>
+        <w:t xml:space="preserve">    </w:t>
+      </w:r>
+      <w:r>
+        <w:rPr>
+          <w:rFonts w:ascii="Courier New" w:hAnsi="Courier New"/>
+          <w:b w:val="false"/>
+          <w:color w:val="auto"/>
+          <w:sz w:val="21"/>
+        </w:rPr>
         <w:t>WOKRSTATION_ID = 19</w:t>
       </w:r>
     </w:p>
     <w:p>
       <w:pPr>
         <w:pStyle w:val="Code"/>
-        <w:rPr/>
-      </w:pPr>
-      <w:r>
-        <w:rPr/>
-      </w:r>
-    </w:p>
-    <w:p>
-      <w:pPr>
-        <w:pStyle w:val="Code"/>
-        <w:rPr/>
-      </w:pPr>
-      <w:r>
-        <w:rPr/>
-        <w:t xml:space="preserve">    </w:t>
-      </w:r>
-      <w:r>
-        <w:rPr/>
+        <w:rPr>
+          <w:rFonts w:ascii="Courier New" w:hAnsi="Courier New"/>
+          <w:color w:val="auto"/>
+        </w:rPr>
+      </w:pPr>
+      <w:r>
+        <w:rPr>
+          <w:rFonts w:ascii="Courier New" w:hAnsi="Courier New"/>
+          <w:color w:val="auto"/>
+        </w:rPr>
+      </w:r>
+    </w:p>
+    <w:p>
+      <w:pPr>
+        <w:pStyle w:val="Code"/>
+        <w:rPr>
+          <w:rFonts w:ascii="Courier New" w:hAnsi="Courier New"/>
+          <w:color w:val="auto"/>
+        </w:rPr>
+      </w:pPr>
+      <w:r>
+        <w:rPr>
+          <w:rFonts w:ascii="Courier New" w:hAnsi="Courier New"/>
+          <w:color w:val="auto"/>
+        </w:rPr>
+        <w:t xml:space="preserve">    </w:t>
+      </w:r>
+      <w:r>
+        <w:rPr>
+          <w:rFonts w:ascii="Courier New" w:hAnsi="Courier New"/>
+          <w:b w:val="false"/>
+          <w:color w:val="auto"/>
+          <w:sz w:val="21"/>
+        </w:rPr>
         <w:t>buffer_size = WOKRSTATION_ID * 10</w:t>
       </w:r>
     </w:p>
     <w:p>
       <w:pPr>
         <w:pStyle w:val="Code"/>
-        <w:rPr/>
-      </w:pPr>
-      <w:r>
-        <w:rPr/>
-        <w:t xml:space="preserve">    </w:t>
-      </w:r>
-      <w:r>
-        <w:rPr/>
+        <w:rPr>
+          <w:rFonts w:ascii="Courier New" w:hAnsi="Courier New"/>
+          <w:color w:val="auto"/>
+        </w:rPr>
+      </w:pPr>
+      <w:r>
+        <w:rPr>
+          <w:rFonts w:ascii="Courier New" w:hAnsi="Courier New"/>
+          <w:color w:val="auto"/>
+        </w:rPr>
+        <w:t xml:space="preserve">    </w:t>
+      </w:r>
+      <w:r>
+        <w:rPr>
+          <w:rFonts w:ascii="Courier New" w:hAnsi="Courier New"/>
+          <w:b w:val="false"/>
+          <w:color w:val="auto"/>
+          <w:sz w:val="21"/>
+        </w:rPr>
         <w:t>elements_to_send = WOKRSTATION_ID + 1</w:t>
       </w:r>
     </w:p>
     <w:p>
       <w:pPr>
         <w:pStyle w:val="Code"/>
-        <w:rPr/>
-      </w:pPr>
-      <w:r>
-        <w:rPr/>
-        <w:t xml:space="preserve">    </w:t>
-      </w:r>
-      <w:r>
-        <w:rPr/>
+        <w:rPr>
+          <w:rFonts w:ascii="Courier New" w:hAnsi="Courier New"/>
+          <w:color w:val="auto"/>
+        </w:rPr>
+      </w:pPr>
+      <w:r>
+        <w:rPr>
+          <w:rFonts w:ascii="Courier New" w:hAnsi="Courier New"/>
+          <w:color w:val="auto"/>
+        </w:rPr>
+        <w:t xml:space="preserve">    </w:t>
+      </w:r>
+      <w:r>
+        <w:rPr>
+          <w:rFonts w:ascii="Courier New" w:hAnsi="Courier New"/>
+          <w:b w:val="false"/>
+          <w:color w:val="auto"/>
+          <w:sz w:val="21"/>
+        </w:rPr>
         <w:t># --- ✝ ---</w:t>
       </w:r>
     </w:p>
     <w:p>
       <w:pPr>
         <w:pStyle w:val="Code"/>
-        <w:rPr/>
-      </w:pPr>
-      <w:r>
-        <w:rPr/>
-      </w:r>
-    </w:p>
-    <w:p>
-      <w:pPr>
-        <w:pStyle w:val="Code"/>
-        <w:rPr/>
-      </w:pPr>
-      <w:r>
-        <w:rPr/>
-        <w:t xml:space="preserve">    </w:t>
-      </w:r>
-      <w:r>
-        <w:rPr/>
+        <w:rPr>
+          <w:rFonts w:ascii="Courier New" w:hAnsi="Courier New"/>
+          <w:color w:val="auto"/>
+        </w:rPr>
+      </w:pPr>
+      <w:r>
+        <w:rPr>
+          <w:rFonts w:ascii="Courier New" w:hAnsi="Courier New"/>
+          <w:color w:val="auto"/>
+        </w:rPr>
+      </w:r>
+    </w:p>
+    <w:p>
+      <w:pPr>
+        <w:pStyle w:val="Code"/>
+        <w:rPr>
+          <w:rFonts w:ascii="Courier New" w:hAnsi="Courier New"/>
+          <w:color w:val="auto"/>
+        </w:rPr>
+      </w:pPr>
+      <w:r>
+        <w:rPr>
+          <w:rFonts w:ascii="Courier New" w:hAnsi="Courier New"/>
+          <w:color w:val="auto"/>
+        </w:rPr>
+        <w:t xml:space="preserve">    </w:t>
+      </w:r>
+      <w:r>
+        <w:rPr>
+          <w:rFonts w:ascii="Courier New" w:hAnsi="Courier New"/>
+          <w:b w:val="false"/>
+          <w:color w:val="auto"/>
+          <w:sz w:val="21"/>
+        </w:rPr>
         <w:t>if size &lt; 2:</w:t>
       </w:r>
     </w:p>
     <w:p>
       <w:pPr>
         <w:pStyle w:val="Code"/>
-        <w:rPr/>
-      </w:pPr>
-      <w:r>
-        <w:rPr/>
-        <w:t xml:space="preserve">        </w:t>
-      </w:r>
-      <w:r>
-        <w:rPr/>
+        <w:rPr>
+          <w:rFonts w:ascii="Courier New" w:hAnsi="Courier New"/>
+          <w:color w:val="auto"/>
+        </w:rPr>
+      </w:pPr>
+      <w:r>
+        <w:rPr>
+          <w:rFonts w:ascii="Courier New" w:hAnsi="Courier New"/>
+          <w:color w:val="auto"/>
+        </w:rPr>
+        <w:t xml:space="preserve">        </w:t>
+      </w:r>
+      <w:r>
+        <w:rPr>
+          <w:rFonts w:ascii="Courier New" w:hAnsi="Courier New"/>
+          <w:b w:val="false"/>
+          <w:color w:val="auto"/>
+          <w:sz w:val="21"/>
+        </w:rPr>
         <w:t>if rank == 0:</w:t>
       </w:r>
     </w:p>
     <w:p>
       <w:pPr>
         <w:pStyle w:val="Code"/>
-        <w:rPr/>
-      </w:pPr>
-      <w:r>
-        <w:rPr/>
-        <w:t xml:space="preserve">            </w:t>
-      </w:r>
-      <w:r>
-        <w:rPr/>
-        <w:t>print("Потрібно принаймні 2 процеси.")</w:t>
-      </w:r>
-    </w:p>
-    <w:p>
-      <w:pPr>
-        <w:pStyle w:val="Code"/>
-        <w:rPr/>
-      </w:pPr>
-      <w:r>
-        <w:rPr/>
-        <w:t xml:space="preserve">        </w:t>
-      </w:r>
-      <w:r>
-        <w:rPr/>
+        <w:rPr>
+          <w:rFonts w:ascii="Courier New" w:hAnsi="Courier New"/>
+          <w:color w:val="auto"/>
+        </w:rPr>
+      </w:pPr>
+      <w:r>
+        <w:rPr>
+          <w:rFonts w:ascii="Courier New" w:hAnsi="Courier New"/>
+          <w:color w:val="auto"/>
+        </w:rPr>
+        <w:t xml:space="preserve">            </w:t>
+      </w:r>
+      <w:r>
+        <w:rPr>
+          <w:rFonts w:ascii="Courier New" w:hAnsi="Courier New"/>
+          <w:b w:val="false"/>
+          <w:color w:val="auto"/>
+          <w:sz w:val="21"/>
+        </w:rPr>
+        <w:t>print("At least 2 processes needed.")</w:t>
+      </w:r>
+    </w:p>
+    <w:p>
+      <w:pPr>
+        <w:pStyle w:val="Code"/>
+        <w:rPr>
+          <w:rFonts w:ascii="Courier New" w:hAnsi="Courier New"/>
+          <w:color w:val="auto"/>
+        </w:rPr>
+      </w:pPr>
+      <w:r>
+        <w:rPr>
+          <w:rFonts w:ascii="Courier New" w:hAnsi="Courier New"/>
+          <w:color w:val="auto"/>
+        </w:rPr>
+        <w:t xml:space="preserve">        </w:t>
+      </w:r>
+      <w:r>
+        <w:rPr>
+          <w:rFonts w:ascii="Courier New" w:hAnsi="Courier New"/>
+          <w:b w:val="false"/>
+          <w:color w:val="auto"/>
+          <w:sz w:val="21"/>
+        </w:rPr>
         <w:t>return</w:t>
       </w:r>
     </w:p>
     <w:p>
       <w:pPr>
         <w:pStyle w:val="Code"/>
-        <w:rPr/>
-      </w:pPr>
-      <w:r>
-        <w:rPr/>
-      </w:r>
-    </w:p>
-    <w:p>
-      <w:pPr>
-        <w:pStyle w:val="Code"/>
-        <w:rPr/>
-      </w:pPr>
-      <w:r>
-        <w:rPr/>
-        <w:t xml:space="preserve">    </w:t>
-      </w:r>
-      <w:r>
-        <w:rPr/>
+        <w:rPr>
+          <w:rFonts w:ascii="Courier New" w:hAnsi="Courier New"/>
+          <w:color w:val="auto"/>
+        </w:rPr>
+      </w:pPr>
+      <w:r>
+        <w:rPr>
+          <w:rFonts w:ascii="Courier New" w:hAnsi="Courier New"/>
+          <w:color w:val="auto"/>
+        </w:rPr>
+      </w:r>
+    </w:p>
+    <w:p>
+      <w:pPr>
+        <w:pStyle w:val="Code"/>
+        <w:rPr>
+          <w:rFonts w:ascii="Courier New" w:hAnsi="Courier New"/>
+          <w:color w:val="auto"/>
+        </w:rPr>
+      </w:pPr>
+      <w:r>
+        <w:rPr>
+          <w:rFonts w:ascii="Courier New" w:hAnsi="Courier New"/>
+          <w:color w:val="auto"/>
+        </w:rPr>
+        <w:t xml:space="preserve">    </w:t>
+      </w:r>
+      <w:r>
+        <w:rPr>
+          <w:rFonts w:ascii="Courier New" w:hAnsi="Courier New"/>
+          <w:b w:val="false"/>
+          <w:color w:val="auto"/>
+          <w:sz w:val="21"/>
+        </w:rPr>
         <w:t>if rank == 1:</w:t>
       </w:r>
     </w:p>
     <w:p>
       <w:pPr>
         <w:pStyle w:val="Code"/>
-        <w:rPr/>
-      </w:pPr>
-      <w:r>
-        <w:rPr/>
-        <w:t xml:space="preserve">        </w:t>
-      </w:r>
-      <w:r>
-        <w:rPr/>
+        <w:rPr>
+          <w:rFonts w:ascii="Courier New" w:hAnsi="Courier New"/>
+          <w:color w:val="auto"/>
+        </w:rPr>
+      </w:pPr>
+      <w:r>
+        <w:rPr>
+          <w:rFonts w:ascii="Courier New" w:hAnsi="Courier New"/>
+          <w:color w:val="auto"/>
+        </w:rPr>
+        <w:t xml:space="preserve">        </w:t>
+      </w:r>
+      <w:r>
+        <w:rPr>
+          <w:rFonts w:ascii="Courier New" w:hAnsi="Courier New"/>
+          <w:b w:val="false"/>
+          <w:color w:val="auto"/>
+          <w:sz w:val="21"/>
+        </w:rPr>
         <w:t># Процес 1: Посилка</w:t>
       </w:r>
     </w:p>
     <w:p>
       <w:pPr>
         <w:pStyle w:val="Code"/>
-        <w:rPr/>
-      </w:pPr>
-      <w:r>
-        <w:rPr/>
-        <w:t xml:space="preserve">        </w:t>
-      </w:r>
-      <w:r>
-        <w:rPr/>
+        <w:rPr>
+          <w:rFonts w:ascii="Courier New" w:hAnsi="Courier New"/>
+          <w:color w:val="auto"/>
+        </w:rPr>
+      </w:pPr>
+      <w:r>
+        <w:rPr>
+          <w:rFonts w:ascii="Courier New" w:hAnsi="Courier New"/>
+          <w:color w:val="auto"/>
+        </w:rPr>
+        <w:t xml:space="preserve">        </w:t>
+      </w:r>
+      <w:r>
+        <w:rPr>
+          <w:rFonts w:ascii="Courier New" w:hAnsi="Courier New"/>
+          <w:b w:val="false"/>
+          <w:color w:val="auto"/>
+          <w:sz w:val="21"/>
+        </w:rPr>
         <w:t># Створити масив даних типу Long (int64)</w:t>
       </w:r>
     </w:p>
     <w:p>
       <w:pPr>
         <w:pStyle w:val="Code"/>
-        <w:rPr/>
-      </w:pPr>
-      <w:r>
-        <w:rPr/>
-        <w:t xml:space="preserve">        </w:t>
-      </w:r>
-      <w:r>
-        <w:rPr/>
+        <w:rPr>
+          <w:rFonts w:ascii="Courier New" w:hAnsi="Courier New"/>
+          <w:color w:val="auto"/>
+        </w:rPr>
+      </w:pPr>
+      <w:r>
+        <w:rPr>
+          <w:rFonts w:ascii="Courier New" w:hAnsi="Courier New"/>
+          <w:color w:val="auto"/>
+        </w:rPr>
+        <w:t xml:space="preserve">        </w:t>
+      </w:r>
+      <w:r>
+        <w:rPr>
+          <w:rFonts w:ascii="Courier New" w:hAnsi="Courier New"/>
+          <w:b w:val="false"/>
+          <w:color w:val="auto"/>
+          <w:sz w:val="21"/>
+        </w:rPr>
         <w:t>data = np.arange(elements_to_send, dtype=np.int64) + 100</w:t>
       </w:r>
     </w:p>
     <w:p>
       <w:pPr>
         <w:pStyle w:val="Code"/>
-        <w:rPr/>
-      </w:pPr>
-      <w:r>
-        <w:rPr/>
-        <w:t xml:space="preserve">        </w:t>
-      </w:r>
-      <w:r>
-        <w:rPr/>
-        <w:t>print(f"Процес {rank}: Надсилаю {len(data)} елементів: {data}")</w:t>
-      </w:r>
-    </w:p>
-    <w:p>
-      <w:pPr>
-        <w:pStyle w:val="Code"/>
-        <w:rPr/>
-      </w:pPr>
-      <w:r>
-        <w:rPr/>
-        <w:t xml:space="preserve">        </w:t>
-      </w:r>
-      <w:r>
-        <w:rPr/>
+        <w:rPr>
+          <w:rFonts w:ascii="Courier New" w:hAnsi="Courier New"/>
+          <w:color w:val="auto"/>
+        </w:rPr>
+      </w:pPr>
+      <w:r>
+        <w:rPr>
+          <w:rFonts w:ascii="Courier New" w:hAnsi="Courier New"/>
+          <w:color w:val="auto"/>
+        </w:rPr>
+        <w:t xml:space="preserve">        </w:t>
+      </w:r>
+      <w:r>
+        <w:rPr>
+          <w:rFonts w:ascii="Courier New" w:hAnsi="Courier New"/>
+          <w:b w:val="false"/>
+          <w:color w:val="auto"/>
+          <w:sz w:val="21"/>
+        </w:rPr>
+        <w:t>print(f"Process {rank}: Sending {len(data)} elements: {data}")</w:t>
+      </w:r>
+    </w:p>
+    <w:p>
+      <w:pPr>
+        <w:pStyle w:val="Code"/>
+        <w:rPr>
+          <w:rFonts w:ascii="Courier New" w:hAnsi="Courier New"/>
+          <w:color w:val="auto"/>
+        </w:rPr>
+      </w:pPr>
+      <w:r>
+        <w:rPr>
+          <w:rFonts w:ascii="Courier New" w:hAnsi="Courier New"/>
+          <w:color w:val="auto"/>
+        </w:rPr>
+        <w:t xml:space="preserve">        </w:t>
+      </w:r>
+      <w:r>
+        <w:rPr>
+          <w:rFonts w:ascii="Courier New" w:hAnsi="Courier New"/>
+          <w:b w:val="false"/>
+          <w:color w:val="auto"/>
+          <w:sz w:val="21"/>
+        </w:rPr>
         <w:t>comm.Send([data, MPI.LONG], dest=0, tag=77)</w:t>
       </w:r>
     </w:p>
     <w:p>
       <w:pPr>
         <w:pStyle w:val="Code"/>
-        <w:rPr/>
-      </w:pPr>
-      <w:r>
-        <w:rPr/>
-      </w:r>
-    </w:p>
-    <w:p>
-      <w:pPr>
-        <w:pStyle w:val="Code"/>
-        <w:rPr/>
-      </w:pPr>
-      <w:r>
-        <w:rPr/>
-        <w:t xml:space="preserve">    </w:t>
-      </w:r>
-      <w:r>
-        <w:rPr/>
+        <w:rPr>
+          <w:rFonts w:ascii="Courier New" w:hAnsi="Courier New"/>
+          <w:color w:val="auto"/>
+        </w:rPr>
+      </w:pPr>
+      <w:r>
+        <w:rPr>
+          <w:rFonts w:ascii="Courier New" w:hAnsi="Courier New"/>
+          <w:color w:val="auto"/>
+        </w:rPr>
+      </w:r>
+    </w:p>
+    <w:p>
+      <w:pPr>
+        <w:pStyle w:val="Code"/>
+        <w:rPr>
+          <w:rFonts w:ascii="Courier New" w:hAnsi="Courier New"/>
+          <w:color w:val="auto"/>
+        </w:rPr>
+      </w:pPr>
+      <w:r>
+        <w:rPr>
+          <w:rFonts w:ascii="Courier New" w:hAnsi="Courier New"/>
+          <w:color w:val="auto"/>
+        </w:rPr>
+        <w:t xml:space="preserve">    </w:t>
+      </w:r>
+      <w:r>
+        <w:rPr>
+          <w:rFonts w:ascii="Courier New" w:hAnsi="Courier New"/>
+          <w:b w:val="false"/>
+          <w:color w:val="auto"/>
+          <w:sz w:val="21"/>
+        </w:rPr>
         <w:t>elif rank == 0:</w:t>
       </w:r>
     </w:p>
     <w:p>
       <w:pPr>
         <w:pStyle w:val="Code"/>
-        <w:rPr/>
-      </w:pPr>
-      <w:r>
-        <w:rPr/>
-        <w:t xml:space="preserve">        </w:t>
-      </w:r>
-      <w:r>
-        <w:rPr/>
+        <w:rPr>
+          <w:rFonts w:ascii="Courier New" w:hAnsi="Courier New"/>
+          <w:color w:val="auto"/>
+        </w:rPr>
+      </w:pPr>
+      <w:r>
+        <w:rPr>
+          <w:rFonts w:ascii="Courier New" w:hAnsi="Courier New"/>
+          <w:color w:val="auto"/>
+        </w:rPr>
+        <w:t xml:space="preserve">        </w:t>
+      </w:r>
+      <w:r>
+        <w:rPr>
+          <w:rFonts w:ascii="Courier New" w:hAnsi="Courier New"/>
+          <w:b w:val="false"/>
+          <w:color w:val="auto"/>
+          <w:sz w:val="21"/>
+        </w:rPr>
         <w:t># Процес 0: Прийом</w:t>
       </w:r>
     </w:p>
     <w:p>
       <w:pPr>
         <w:pStyle w:val="Code"/>
-        <w:rPr/>
-      </w:pPr>
-      <w:r>
-        <w:rPr/>
-        <w:t xml:space="preserve">        </w:t>
-      </w:r>
-      <w:r>
-        <w:rPr/>
+        <w:rPr>
+          <w:rFonts w:ascii="Courier New" w:hAnsi="Courier New"/>
+          <w:color w:val="auto"/>
+        </w:rPr>
+      </w:pPr>
+      <w:r>
+        <w:rPr>
+          <w:rFonts w:ascii="Courier New" w:hAnsi="Courier New"/>
+          <w:color w:val="auto"/>
+        </w:rPr>
+        <w:t xml:space="preserve">        </w:t>
+      </w:r>
+      <w:r>
+        <w:rPr>
+          <w:rFonts w:ascii="Courier New" w:hAnsi="Courier New"/>
+          <w:b w:val="false"/>
+          <w:color w:val="auto"/>
+          <w:sz w:val="21"/>
+        </w:rPr>
         <w:t>recv_buffer = np.zeros(buffer_size, dtype=np.int64)</w:t>
       </w:r>
     </w:p>
     <w:p>
       <w:pPr>
         <w:pStyle w:val="Code"/>
-        <w:rPr/>
-      </w:pPr>
-      <w:r>
-        <w:rPr/>
-        <w:t xml:space="preserve">        </w:t>
-      </w:r>
-      <w:r>
-        <w:rPr/>
+        <w:rPr>
+          <w:rFonts w:ascii="Courier New" w:hAnsi="Courier New"/>
+          <w:color w:val="auto"/>
+        </w:rPr>
+      </w:pPr>
+      <w:r>
+        <w:rPr>
+          <w:rFonts w:ascii="Courier New" w:hAnsi="Courier New"/>
+          <w:color w:val="auto"/>
+        </w:rPr>
+        <w:t xml:space="preserve">        </w:t>
+      </w:r>
+      <w:r>
+        <w:rPr>
+          <w:rFonts w:ascii="Courier New" w:hAnsi="Courier New"/>
+          <w:b w:val="false"/>
+          <w:color w:val="auto"/>
+          <w:sz w:val="21"/>
+        </w:rPr>
         <w:t>status = MPI.Status()</w:t>
       </w:r>
     </w:p>
     <w:p>
       <w:pPr>
         <w:pStyle w:val="Code"/>
-        <w:rPr/>
-      </w:pPr>
-      <w:r>
-        <w:rPr/>
-      </w:r>
-    </w:p>
-    <w:p>
-      <w:pPr>
-        <w:pStyle w:val="Code"/>
-        <w:rPr/>
-      </w:pPr>
-      <w:r>
-        <w:rPr/>
-        <w:t xml:space="preserve">        </w:t>
-      </w:r>
-      <w:r>
-        <w:rPr/>
+        <w:rPr>
+          <w:rFonts w:ascii="Courier New" w:hAnsi="Courier New"/>
+          <w:color w:val="auto"/>
+        </w:rPr>
+      </w:pPr>
+      <w:r>
+        <w:rPr>
+          <w:rFonts w:ascii="Courier New" w:hAnsi="Courier New"/>
+          <w:color w:val="auto"/>
+        </w:rPr>
+      </w:r>
+    </w:p>
+    <w:p>
+      <w:pPr>
+        <w:pStyle w:val="Code"/>
+        <w:rPr>
+          <w:rFonts w:ascii="Courier New" w:hAnsi="Courier New"/>
+          <w:color w:val="auto"/>
+        </w:rPr>
+      </w:pPr>
+      <w:r>
+        <w:rPr>
+          <w:rFonts w:ascii="Courier New" w:hAnsi="Courier New"/>
+          <w:color w:val="auto"/>
+        </w:rPr>
+        <w:t xml:space="preserve">        </w:t>
+      </w:r>
+      <w:r>
+        <w:rPr>
+          <w:rFonts w:ascii="Courier New" w:hAnsi="Courier New"/>
+          <w:b w:val="false"/>
+          <w:color w:val="auto"/>
+          <w:sz w:val="21"/>
+        </w:rPr>
         <w:t>comm.Recv([recv_buffer, MPI.LONG], source=1, tag=77, status=status)</w:t>
       </w:r>
     </w:p>
     <w:p>
       <w:pPr>
         <w:pStyle w:val="Code"/>
-        <w:rPr/>
-      </w:pPr>
-      <w:r>
-        <w:rPr/>
-      </w:r>
-    </w:p>
-    <w:p>
-      <w:pPr>
-        <w:pStyle w:val="Code"/>
-        <w:rPr/>
-      </w:pPr>
-      <w:r>
-        <w:rPr/>
-        <w:t xml:space="preserve">        </w:t>
-      </w:r>
-      <w:r>
-        <w:rPr/>
+        <w:rPr>
+          <w:rFonts w:ascii="Courier New" w:hAnsi="Courier New"/>
+          <w:color w:val="auto"/>
+        </w:rPr>
+      </w:pPr>
+      <w:r>
+        <w:rPr>
+          <w:rFonts w:ascii="Courier New" w:hAnsi="Courier New"/>
+          <w:color w:val="auto"/>
+        </w:rPr>
+      </w:r>
+    </w:p>
+    <w:p>
+      <w:pPr>
+        <w:pStyle w:val="Code"/>
+        <w:rPr>
+          <w:rFonts w:ascii="Courier New" w:hAnsi="Courier New"/>
+          <w:color w:val="auto"/>
+        </w:rPr>
+      </w:pPr>
+      <w:r>
+        <w:rPr>
+          <w:rFonts w:ascii="Courier New" w:hAnsi="Courier New"/>
+          <w:color w:val="auto"/>
+        </w:rPr>
+        <w:t xml:space="preserve">        </w:t>
+      </w:r>
+      <w:r>
+        <w:rPr>
+          <w:rFonts w:ascii="Courier New" w:hAnsi="Courier New"/>
+          <w:b w:val="false"/>
+          <w:color w:val="auto"/>
+          <w:sz w:val="21"/>
+        </w:rPr>
         <w:t>actual_count = status.Get_count(MPI.LONG)</w:t>
       </w:r>
     </w:p>
     <w:p>
       <w:pPr>
         <w:pStyle w:val="Code"/>
-        <w:rPr/>
-      </w:pPr>
-      <w:r>
-        <w:rPr/>
-        <w:t xml:space="preserve">        </w:t>
-      </w:r>
-      <w:r>
-        <w:rPr/>
-        <w:t>print("Процес 0: Отримано дані")</w:t>
-      </w:r>
-    </w:p>
-    <w:p>
-      <w:pPr>
-        <w:pStyle w:val="Code"/>
-        <w:rPr/>
-      </w:pPr>
-      <w:r>
-        <w:rPr/>
-        <w:t xml:space="preserve">        </w:t>
-      </w:r>
-      <w:r>
-        <w:rPr/>
-        <w:t>print(f"Фактична кількість прийнятих елементів: {actual_count}")</w:t>
-      </w:r>
-    </w:p>
-    <w:p>
-      <w:pPr>
-        <w:pStyle w:val="Code"/>
-        <w:rPr/>
-      </w:pPr>
-      <w:r>
-        <w:rPr/>
-        <w:t xml:space="preserve">        </w:t>
-      </w:r>
-      <w:r>
-        <w:rPr/>
+        <w:rPr>
+          <w:rFonts w:ascii="Courier New" w:hAnsi="Courier New"/>
+          <w:color w:val="auto"/>
+        </w:rPr>
+      </w:pPr>
+      <w:r>
+        <w:rPr>
+          <w:rFonts w:ascii="Courier New" w:hAnsi="Courier New"/>
+          <w:color w:val="auto"/>
+        </w:rPr>
+        <w:t xml:space="preserve">        </w:t>
+      </w:r>
+      <w:r>
+        <w:rPr>
+          <w:rFonts w:ascii="Courier New" w:hAnsi="Courier New"/>
+          <w:b w:val="false"/>
+          <w:color w:val="auto"/>
+          <w:sz w:val="21"/>
+        </w:rPr>
+        <w:t>print("Process 0: Receiving data")</w:t>
+      </w:r>
+    </w:p>
+    <w:p>
+      <w:pPr>
+        <w:pStyle w:val="Code"/>
+        <w:rPr>
+          <w:rFonts w:ascii="Courier New" w:hAnsi="Courier New"/>
+          <w:color w:val="auto"/>
+        </w:rPr>
+      </w:pPr>
+      <w:r>
+        <w:rPr>
+          <w:rFonts w:ascii="Courier New" w:hAnsi="Courier New"/>
+          <w:color w:val="auto"/>
+        </w:rPr>
+        <w:t xml:space="preserve">        </w:t>
+      </w:r>
+      <w:r>
+        <w:rPr>
+          <w:rFonts w:ascii="Courier New" w:hAnsi="Courier New"/>
+          <w:b w:val="false"/>
+          <w:color w:val="auto"/>
+          <w:sz w:val="21"/>
+        </w:rPr>
+        <w:t>print(f"Actual amount of received elements: {actual_count}")</w:t>
+      </w:r>
+    </w:p>
+    <w:p>
+      <w:pPr>
+        <w:pStyle w:val="Code"/>
+        <w:rPr>
+          <w:rFonts w:ascii="Courier New" w:hAnsi="Courier New"/>
+          <w:color w:val="auto"/>
+        </w:rPr>
+      </w:pPr>
+      <w:r>
+        <w:rPr>
+          <w:rFonts w:ascii="Courier New" w:hAnsi="Courier New"/>
+          <w:color w:val="auto"/>
+        </w:rPr>
+        <w:t xml:space="preserve">        </w:t>
+      </w:r>
+      <w:r>
+        <w:rPr>
+          <w:rFonts w:ascii="Courier New" w:hAnsi="Courier New"/>
+          <w:b w:val="false"/>
+          <w:color w:val="auto"/>
+          <w:sz w:val="21"/>
+        </w:rPr>
         <w:t>print(</w:t>
       </w:r>
     </w:p>
     <w:p>
       <w:pPr>
         <w:pStyle w:val="Code"/>
-        <w:rPr/>
-      </w:pPr>
-      <w:r>
-        <w:rPr/>
-        <w:t xml:space="preserve">            </w:t>
-      </w:r>
-      <w:r>
-        <w:rPr/>
-        <w:t>f"Вміст буфера (перші {actual_count} елементів): {recv_buffer[:actual_count]}"</w:t>
-      </w:r>
-    </w:p>
-    <w:p>
-      <w:pPr>
-        <w:pStyle w:val="Code"/>
-        <w:rPr/>
-      </w:pPr>
-      <w:r>
-        <w:rPr/>
-        <w:t xml:space="preserve">        </w:t>
-      </w:r>
-      <w:r>
-        <w:rPr/>
+        <w:rPr>
+          <w:rFonts w:ascii="Courier New" w:hAnsi="Courier New"/>
+          <w:color w:val="auto"/>
+        </w:rPr>
+      </w:pPr>
+      <w:r>
+        <w:rPr>
+          <w:rFonts w:ascii="Courier New" w:hAnsi="Courier New"/>
+          <w:color w:val="auto"/>
+        </w:rPr>
+        <w:t xml:space="preserve">            </w:t>
+      </w:r>
+      <w:r>
+        <w:rPr>
+          <w:rFonts w:ascii="Courier New" w:hAnsi="Courier New"/>
+          <w:b w:val="false"/>
+          <w:color w:val="auto"/>
+          <w:sz w:val="21"/>
+        </w:rPr>
+        <w:t>f"Buffere size (first {actual_count} elements): {recv_buffer[:actual_count]}"</w:t>
+      </w:r>
+    </w:p>
+    <w:p>
+      <w:pPr>
+        <w:pStyle w:val="Code"/>
+        <w:rPr>
+          <w:rFonts w:ascii="Courier New" w:hAnsi="Courier New"/>
+          <w:color w:val="auto"/>
+        </w:rPr>
+      </w:pPr>
+      <w:r>
+        <w:rPr>
+          <w:rFonts w:ascii="Courier New" w:hAnsi="Courier New"/>
+          <w:color w:val="auto"/>
+        </w:rPr>
+        <w:t xml:space="preserve">        </w:t>
+      </w:r>
+      <w:r>
+        <w:rPr>
+          <w:rFonts w:ascii="Courier New" w:hAnsi="Courier New"/>
+          <w:b w:val="false"/>
+          <w:color w:val="auto"/>
+          <w:sz w:val="21"/>
+        </w:rPr>
         <w:t>)</w:t>
       </w:r>
     </w:p>
     <w:p>
       <w:pPr>
         <w:pStyle w:val="Code"/>
-        <w:rPr/>
-      </w:pPr>
-      <w:r>
-        <w:rPr/>
-      </w:r>
-    </w:p>
-    <w:p>
-      <w:pPr>
-        <w:pStyle w:val="Code"/>
-        <w:rPr/>
-      </w:pPr>
-      <w:r>
-        <w:rPr/>
-      </w:r>
-    </w:p>
-    <w:p>
-      <w:pPr>
-        <w:pStyle w:val="Code"/>
-        <w:rPr/>
-      </w:pPr>
-      <w:r>
-        <w:rPr/>
+        <w:rPr>
+          <w:rFonts w:ascii="Courier New" w:hAnsi="Courier New"/>
+          <w:color w:val="auto"/>
+        </w:rPr>
+      </w:pPr>
+      <w:r>
+        <w:rPr>
+          <w:rFonts w:ascii="Courier New" w:hAnsi="Courier New"/>
+          <w:color w:val="auto"/>
+        </w:rPr>
+      </w:r>
+    </w:p>
+    <w:p>
+      <w:pPr>
+        <w:pStyle w:val="Code"/>
+        <w:rPr>
+          <w:rFonts w:ascii="Courier New" w:hAnsi="Courier New"/>
+          <w:color w:val="auto"/>
+        </w:rPr>
+      </w:pPr>
+      <w:r>
+        <w:rPr>
+          <w:rFonts w:ascii="Courier New" w:hAnsi="Courier New"/>
+          <w:color w:val="auto"/>
+        </w:rPr>
         <w:t>if __name__ == "__main__":</w:t>
       </w:r>
     </w:p>
     <w:p>
       <w:pPr>
         <w:pStyle w:val="Code"/>
-        <w:rPr/>
-      </w:pPr>
-      <w:r>
-        <w:rPr/>
-        <w:t xml:space="preserve">    </w:t>
-      </w:r>
-      <w:r>
-        <w:rPr/>
+        <w:rPr>
+          <w:rFonts w:ascii="Courier New" w:hAnsi="Courier New"/>
+          <w:color w:val="auto"/>
+        </w:rPr>
+      </w:pPr>
+      <w:r>
+        <w:rPr>
+          <w:rFonts w:ascii="Courier New" w:hAnsi="Courier New"/>
+          <w:color w:val="auto"/>
+          <w:shd w:fill="FFFFFF" w:val="clear"/>
+        </w:rPr>
+        <w:t xml:space="preserve">    </w:t>
+      </w:r>
+      <w:r>
+        <w:rPr>
+          <w:rFonts w:ascii="Courier New" w:hAnsi="Courier New"/>
+          <w:b w:val="false"/>
+          <w:color w:val="auto"/>
+          <w:sz w:val="21"/>
+          <w:shd w:fill="FFFFFF" w:val="clear"/>
+        </w:rPr>
         <w:t>main()</w:t>
       </w:r>
     </w:p>
@@ -1664,9 +2062,9 @@
         <w:rPr/>
         <w:drawing>
           <wp:inline distT="0" distB="0" distL="0" distR="0">
-            <wp:extent cx="3105150" cy="180975"/>
+            <wp:extent cx="5731510" cy="765810"/>
             <wp:effectExtent l="0" t="0" r="0" b="0"/>
-            <wp:docPr id="2" name="Зображення2"/>
+            <wp:docPr id="2" name="Зображення3"/>
             <wp:cNvGraphicFramePr>
               <a:graphicFrameLocks xmlns:a="http://schemas.openxmlformats.org/drawingml/2006/main" noChangeAspect="1"/>
             </wp:cNvGraphicFramePr>
@@ -1674,7 +2072,7 @@
               <a:graphicData uri="http://schemas.openxmlformats.org/drawingml/2006/picture">
                 <pic:pic xmlns:pic="http://schemas.openxmlformats.org/drawingml/2006/picture">
                   <pic:nvPicPr>
-                    <pic:cNvPr id="2" name="Зображення2"/>
+                    <pic:cNvPr id="2" name="Зображення3"/>
                     <pic:cNvPicPr>
                       <a:picLocks noChangeAspect="1" noChangeArrowheads="1"/>
                     </pic:cNvPicPr>
@@ -1688,7 +2086,7 @@
                   <pic:spPr bwMode="auto">
                     <a:xfrm>
                       <a:off x="0" y="0"/>
-                      <a:ext cx="3105150" cy="180975"/>
+                      <a:ext cx="5731510" cy="765810"/>
                     </a:xfrm>
                     <a:prstGeom prst="rect">
                       <a:avLst/>
@@ -1799,716 +2197,1276 @@
     <w:p>
       <w:pPr>
         <w:pStyle w:val="Code"/>
-        <w:rPr/>
-      </w:pPr>
-      <w:r>
-        <w:rPr/>
+        <w:rPr>
+          <w:rFonts w:ascii="Courier New" w:hAnsi="Courier New"/>
+          <w:color w:val="auto"/>
+        </w:rPr>
+      </w:pPr>
+      <w:r>
+        <w:rPr>
+          <w:rFonts w:ascii="Courier New" w:hAnsi="Courier New"/>
+          <w:color w:val="auto"/>
+        </w:rPr>
         <w:t>from mpi4py import MPI</w:t>
       </w:r>
     </w:p>
     <w:p>
       <w:pPr>
         <w:pStyle w:val="Code"/>
-        <w:rPr/>
-      </w:pPr>
-      <w:r>
-        <w:rPr/>
+        <w:rPr>
+          <w:rFonts w:ascii="Courier New" w:hAnsi="Courier New"/>
+          <w:color w:val="auto"/>
+        </w:rPr>
+      </w:pPr>
+      <w:r>
+        <w:rPr>
+          <w:rFonts w:ascii="Courier New" w:hAnsi="Courier New"/>
+          <w:color w:val="auto"/>
+        </w:rPr>
         <w:t>import numpy as np</w:t>
       </w:r>
     </w:p>
     <w:p>
       <w:pPr>
         <w:pStyle w:val="Code"/>
-        <w:rPr/>
-      </w:pPr>
-      <w:r>
-        <w:rPr/>
-      </w:r>
-    </w:p>
-    <w:p>
-      <w:pPr>
-        <w:pStyle w:val="Code"/>
-        <w:rPr/>
-      </w:pPr>
-      <w:r>
-        <w:rPr/>
-      </w:r>
-    </w:p>
-    <w:p>
-      <w:pPr>
-        <w:pStyle w:val="Code"/>
-        <w:rPr/>
-      </w:pPr>
-      <w:r>
-        <w:rPr/>
+        <w:rPr>
+          <w:rFonts w:ascii="Courier New" w:hAnsi="Courier New"/>
+          <w:color w:val="auto"/>
+        </w:rPr>
+      </w:pPr>
+      <w:r>
+        <w:rPr>
+          <w:rFonts w:ascii="Courier New" w:hAnsi="Courier New"/>
+          <w:color w:val="auto"/>
+        </w:rPr>
+      </w:r>
+    </w:p>
+    <w:p>
+      <w:pPr>
+        <w:pStyle w:val="Code"/>
+        <w:rPr>
+          <w:rFonts w:ascii="Courier New" w:hAnsi="Courier New"/>
+          <w:color w:val="auto"/>
+        </w:rPr>
+      </w:pPr>
+      <w:r>
+        <w:rPr>
+          <w:rFonts w:ascii="Courier New" w:hAnsi="Courier New"/>
+          <w:color w:val="auto"/>
+        </w:rPr>
         <w:t>def main():</w:t>
       </w:r>
     </w:p>
     <w:p>
       <w:pPr>
         <w:pStyle w:val="Code"/>
-        <w:rPr/>
-      </w:pPr>
-      <w:r>
-        <w:rPr/>
-        <w:t xml:space="preserve">    </w:t>
-      </w:r>
-      <w:r>
-        <w:rPr/>
+        <w:rPr>
+          <w:rFonts w:ascii="Courier New" w:hAnsi="Courier New"/>
+          <w:color w:val="auto"/>
+        </w:rPr>
+      </w:pPr>
+      <w:r>
+        <w:rPr>
+          <w:rFonts w:ascii="Courier New" w:hAnsi="Courier New"/>
+          <w:color w:val="auto"/>
+        </w:rPr>
+        <w:t xml:space="preserve">    </w:t>
+      </w:r>
+      <w:r>
+        <w:rPr>
+          <w:rFonts w:ascii="Courier New" w:hAnsi="Courier New"/>
+          <w:b w:val="false"/>
+          <w:color w:val="auto"/>
+          <w:sz w:val="21"/>
+        </w:rPr>
         <w:t>comm = MPI.COMM_WORLD</w:t>
       </w:r>
     </w:p>
     <w:p>
       <w:pPr>
         <w:pStyle w:val="Code"/>
-        <w:rPr/>
-      </w:pPr>
-      <w:r>
-        <w:rPr/>
-        <w:t xml:space="preserve">    </w:t>
-      </w:r>
-      <w:r>
-        <w:rPr/>
+        <w:rPr>
+          <w:rFonts w:ascii="Courier New" w:hAnsi="Courier New"/>
+          <w:color w:val="auto"/>
+        </w:rPr>
+      </w:pPr>
+      <w:r>
+        <w:rPr>
+          <w:rFonts w:ascii="Courier New" w:hAnsi="Courier New"/>
+          <w:color w:val="auto"/>
+        </w:rPr>
+        <w:t xml:space="preserve">    </w:t>
+      </w:r>
+      <w:r>
+        <w:rPr>
+          <w:rFonts w:ascii="Courier New" w:hAnsi="Courier New"/>
+          <w:b w:val="false"/>
+          <w:color w:val="auto"/>
+          <w:sz w:val="21"/>
+        </w:rPr>
         <w:t>rank = comm.Get_rank()</w:t>
       </w:r>
     </w:p>
     <w:p>
       <w:pPr>
         <w:pStyle w:val="Code"/>
-        <w:rPr/>
-      </w:pPr>
-      <w:r>
-        <w:rPr/>
-        <w:t xml:space="preserve">    </w:t>
-      </w:r>
-      <w:r>
-        <w:rPr/>
+        <w:rPr>
+          <w:rFonts w:ascii="Courier New" w:hAnsi="Courier New"/>
+          <w:color w:val="auto"/>
+        </w:rPr>
+      </w:pPr>
+      <w:r>
+        <w:rPr>
+          <w:rFonts w:ascii="Courier New" w:hAnsi="Courier New"/>
+          <w:color w:val="auto"/>
+        </w:rPr>
+        <w:t xml:space="preserve">    </w:t>
+      </w:r>
+      <w:r>
+        <w:rPr>
+          <w:rFonts w:ascii="Courier New" w:hAnsi="Courier New"/>
+          <w:b w:val="false"/>
+          <w:color w:val="auto"/>
+          <w:sz w:val="21"/>
+        </w:rPr>
         <w:t>size = comm.Get_size()</w:t>
       </w:r>
     </w:p>
     <w:p>
       <w:pPr>
         <w:pStyle w:val="Code"/>
-        <w:rPr/>
-      </w:pPr>
-      <w:r>
-        <w:rPr/>
-      </w:r>
-    </w:p>
-    <w:p>
-      <w:pPr>
-        <w:pStyle w:val="Code"/>
-        <w:rPr/>
-      </w:pPr>
-      <w:r>
-        <w:rPr/>
-        <w:t xml:space="preserve">    </w:t>
-      </w:r>
-      <w:r>
-        <w:rPr/>
+        <w:rPr>
+          <w:rFonts w:ascii="Courier New" w:hAnsi="Courier New"/>
+          <w:color w:val="auto"/>
+        </w:rPr>
+      </w:pPr>
+      <w:r>
+        <w:rPr>
+          <w:rFonts w:ascii="Courier New" w:hAnsi="Courier New"/>
+          <w:color w:val="auto"/>
+        </w:rPr>
+      </w:r>
+    </w:p>
+    <w:p>
+      <w:pPr>
+        <w:pStyle w:val="Code"/>
+        <w:rPr>
+          <w:rFonts w:ascii="Courier New" w:hAnsi="Courier New"/>
+          <w:color w:val="auto"/>
+        </w:rPr>
+      </w:pPr>
+      <w:r>
+        <w:rPr>
+          <w:rFonts w:ascii="Courier New" w:hAnsi="Courier New"/>
+          <w:color w:val="auto"/>
+        </w:rPr>
+        <w:t xml:space="preserve">    </w:t>
+      </w:r>
+      <w:r>
+        <w:rPr>
+          <w:rFonts w:ascii="Courier New" w:hAnsi="Courier New"/>
+          <w:b w:val="false"/>
+          <w:color w:val="auto"/>
+          <w:sz w:val="21"/>
+        </w:rPr>
         <w:t># --- Налаштування згідно з варіантом ---</w:t>
       </w:r>
     </w:p>
     <w:p>
       <w:pPr>
         <w:pStyle w:val="Code"/>
-        <w:rPr/>
-      </w:pPr>
-      <w:r>
-        <w:rPr/>
-        <w:t xml:space="preserve">    </w:t>
-      </w:r>
-      <w:r>
-        <w:rPr/>
+        <w:rPr>
+          <w:rFonts w:ascii="Courier New" w:hAnsi="Courier New"/>
+          <w:color w:val="auto"/>
+        </w:rPr>
+      </w:pPr>
+      <w:r>
+        <w:rPr>
+          <w:rFonts w:ascii="Courier New" w:hAnsi="Courier New"/>
+          <w:color w:val="auto"/>
+        </w:rPr>
+        <w:t xml:space="preserve">    </w:t>
+      </w:r>
+      <w:r>
+        <w:rPr>
+          <w:rFonts w:ascii="Courier New" w:hAnsi="Courier New"/>
+          <w:b w:val="false"/>
+          <w:color w:val="auto"/>
+          <w:sz w:val="21"/>
+        </w:rPr>
         <w:t>WOKRSTATION_ID = 19</w:t>
       </w:r>
     </w:p>
     <w:p>
       <w:pPr>
         <w:pStyle w:val="Code"/>
-        <w:rPr/>
-      </w:pPr>
-      <w:r>
-        <w:rPr/>
-        <w:t xml:space="preserve">    </w:t>
-      </w:r>
-      <w:r>
-        <w:rPr/>
+        <w:rPr>
+          <w:rFonts w:ascii="Courier New" w:hAnsi="Courier New"/>
+          <w:color w:val="auto"/>
+        </w:rPr>
+      </w:pPr>
+      <w:r>
+        <w:rPr>
+          <w:rFonts w:ascii="Courier New" w:hAnsi="Courier New"/>
+          <w:color w:val="auto"/>
+        </w:rPr>
+        <w:t xml:space="preserve">    </w:t>
+      </w:r>
+      <w:r>
+        <w:rPr>
+          <w:rFonts w:ascii="Courier New" w:hAnsi="Courier New"/>
+          <w:b w:val="false"/>
+          <w:color w:val="auto"/>
+          <w:sz w:val="21"/>
+        </w:rPr>
         <w:t>buffer_size = WOKRSTATION_ID * 10</w:t>
       </w:r>
     </w:p>
     <w:p>
       <w:pPr>
         <w:pStyle w:val="Code"/>
-        <w:rPr/>
-      </w:pPr>
-      <w:r>
-        <w:rPr/>
-        <w:t xml:space="preserve">    </w:t>
-      </w:r>
-      <w:r>
-        <w:rPr/>
+        <w:rPr>
+          <w:rFonts w:ascii="Courier New" w:hAnsi="Courier New"/>
+          <w:color w:val="auto"/>
+        </w:rPr>
+      </w:pPr>
+      <w:r>
+        <w:rPr>
+          <w:rFonts w:ascii="Courier New" w:hAnsi="Courier New"/>
+          <w:color w:val="auto"/>
+        </w:rPr>
+        <w:t xml:space="preserve">    </w:t>
+      </w:r>
+      <w:r>
+        <w:rPr>
+          <w:rFonts w:ascii="Courier New" w:hAnsi="Courier New"/>
+          <w:b w:val="false"/>
+          <w:color w:val="auto"/>
+          <w:sz w:val="21"/>
+        </w:rPr>
         <w:t>elements_to_send = WOKRSTATION_ID + 1</w:t>
       </w:r>
     </w:p>
     <w:p>
       <w:pPr>
         <w:pStyle w:val="Code"/>
-        <w:rPr/>
-      </w:pPr>
-      <w:r>
-        <w:rPr/>
-        <w:t xml:space="preserve">    </w:t>
-      </w:r>
-      <w:r>
-        <w:rPr/>
+        <w:rPr>
+          <w:rFonts w:ascii="Courier New" w:hAnsi="Courier New"/>
+          <w:color w:val="auto"/>
+        </w:rPr>
+      </w:pPr>
+      <w:r>
+        <w:rPr>
+          <w:rFonts w:ascii="Courier New" w:hAnsi="Courier New"/>
+          <w:color w:val="auto"/>
+        </w:rPr>
+        <w:t xml:space="preserve">    </w:t>
+      </w:r>
+      <w:r>
+        <w:rPr>
+          <w:rFonts w:ascii="Courier New" w:hAnsi="Courier New"/>
+          <w:b w:val="false"/>
+          <w:color w:val="auto"/>
+          <w:sz w:val="21"/>
+        </w:rPr>
         <w:t># --- ✝ ---</w:t>
       </w:r>
     </w:p>
     <w:p>
       <w:pPr>
         <w:pStyle w:val="Code"/>
-        <w:rPr/>
-      </w:pPr>
-      <w:r>
-        <w:rPr/>
-      </w:r>
-    </w:p>
-    <w:p>
-      <w:pPr>
-        <w:pStyle w:val="Code"/>
-        <w:rPr/>
-      </w:pPr>
-      <w:r>
-        <w:rPr/>
-        <w:t xml:space="preserve">    </w:t>
-      </w:r>
-      <w:r>
-        <w:rPr/>
+        <w:rPr>
+          <w:rFonts w:ascii="Courier New" w:hAnsi="Courier New"/>
+          <w:color w:val="auto"/>
+        </w:rPr>
+      </w:pPr>
+      <w:r>
+        <w:rPr>
+          <w:rFonts w:ascii="Courier New" w:hAnsi="Courier New"/>
+          <w:color w:val="auto"/>
+        </w:rPr>
+      </w:r>
+    </w:p>
+    <w:p>
+      <w:pPr>
+        <w:pStyle w:val="Code"/>
+        <w:rPr>
+          <w:rFonts w:ascii="Courier New" w:hAnsi="Courier New"/>
+          <w:color w:val="auto"/>
+        </w:rPr>
+      </w:pPr>
+      <w:r>
+        <w:rPr>
+          <w:rFonts w:ascii="Courier New" w:hAnsi="Courier New"/>
+          <w:color w:val="auto"/>
+        </w:rPr>
+        <w:t xml:space="preserve">    </w:t>
+      </w:r>
+      <w:r>
+        <w:rPr>
+          <w:rFonts w:ascii="Courier New" w:hAnsi="Courier New"/>
+          <w:b w:val="false"/>
+          <w:color w:val="auto"/>
+          <w:sz w:val="21"/>
+        </w:rPr>
         <w:t>if size &lt; 2:</w:t>
       </w:r>
     </w:p>
     <w:p>
       <w:pPr>
         <w:pStyle w:val="Code"/>
-        <w:rPr/>
-      </w:pPr>
-      <w:r>
-        <w:rPr/>
-        <w:t xml:space="preserve">        </w:t>
-      </w:r>
-      <w:r>
-        <w:rPr/>
+        <w:rPr>
+          <w:rFonts w:ascii="Courier New" w:hAnsi="Courier New"/>
+          <w:color w:val="auto"/>
+        </w:rPr>
+      </w:pPr>
+      <w:r>
+        <w:rPr>
+          <w:rFonts w:ascii="Courier New" w:hAnsi="Courier New"/>
+          <w:color w:val="auto"/>
+        </w:rPr>
+        <w:t xml:space="preserve">        </w:t>
+      </w:r>
+      <w:r>
+        <w:rPr>
+          <w:rFonts w:ascii="Courier New" w:hAnsi="Courier New"/>
+          <w:b w:val="false"/>
+          <w:color w:val="auto"/>
+          <w:sz w:val="21"/>
+        </w:rPr>
         <w:t>if rank == 0:</w:t>
       </w:r>
     </w:p>
     <w:p>
       <w:pPr>
         <w:pStyle w:val="Code"/>
-        <w:rPr/>
-      </w:pPr>
-      <w:r>
-        <w:rPr/>
-        <w:t xml:space="preserve">            </w:t>
-      </w:r>
-      <w:r>
-        <w:rPr/>
-        <w:t>print("Потрібно принаймні 2 процеси.")</w:t>
-      </w:r>
-    </w:p>
-    <w:p>
-      <w:pPr>
-        <w:pStyle w:val="Code"/>
-        <w:rPr/>
-      </w:pPr>
-      <w:r>
-        <w:rPr/>
-        <w:t xml:space="preserve">        </w:t>
-      </w:r>
-      <w:r>
-        <w:rPr/>
+        <w:rPr>
+          <w:rFonts w:ascii="Courier New" w:hAnsi="Courier New"/>
+          <w:color w:val="auto"/>
+        </w:rPr>
+      </w:pPr>
+      <w:r>
+        <w:rPr>
+          <w:rFonts w:ascii="Courier New" w:hAnsi="Courier New"/>
+          <w:color w:val="auto"/>
+        </w:rPr>
+        <w:t xml:space="preserve">            </w:t>
+      </w:r>
+      <w:r>
+        <w:rPr>
+          <w:rFonts w:ascii="Courier New" w:hAnsi="Courier New"/>
+          <w:b w:val="false"/>
+          <w:color w:val="auto"/>
+          <w:sz w:val="21"/>
+        </w:rPr>
+        <w:t>print("At least 2 processes needed.")</w:t>
+      </w:r>
+    </w:p>
+    <w:p>
+      <w:pPr>
+        <w:pStyle w:val="Code"/>
+        <w:rPr>
+          <w:rFonts w:ascii="Courier New" w:hAnsi="Courier New"/>
+          <w:color w:val="auto"/>
+        </w:rPr>
+      </w:pPr>
+      <w:r>
+        <w:rPr>
+          <w:rFonts w:ascii="Courier New" w:hAnsi="Courier New"/>
+          <w:color w:val="auto"/>
+        </w:rPr>
+        <w:t xml:space="preserve">        </w:t>
+      </w:r>
+      <w:r>
+        <w:rPr>
+          <w:rFonts w:ascii="Courier New" w:hAnsi="Courier New"/>
+          <w:b w:val="false"/>
+          <w:color w:val="auto"/>
+          <w:sz w:val="21"/>
+        </w:rPr>
         <w:t>return</w:t>
       </w:r>
     </w:p>
     <w:p>
       <w:pPr>
         <w:pStyle w:val="Code"/>
-        <w:rPr/>
-      </w:pPr>
-      <w:r>
-        <w:rPr/>
-      </w:r>
-    </w:p>
-    <w:p>
-      <w:pPr>
-        <w:pStyle w:val="Code"/>
-        <w:rPr/>
-      </w:pPr>
-      <w:r>
-        <w:rPr/>
-        <w:t xml:space="preserve">    </w:t>
-      </w:r>
-      <w:r>
-        <w:rPr/>
+        <w:rPr>
+          <w:rFonts w:ascii="Courier New" w:hAnsi="Courier New"/>
+          <w:color w:val="auto"/>
+        </w:rPr>
+      </w:pPr>
+      <w:r>
+        <w:rPr>
+          <w:rFonts w:ascii="Courier New" w:hAnsi="Courier New"/>
+          <w:color w:val="auto"/>
+        </w:rPr>
+      </w:r>
+    </w:p>
+    <w:p>
+      <w:pPr>
+        <w:pStyle w:val="Code"/>
+        <w:rPr>
+          <w:rFonts w:ascii="Courier New" w:hAnsi="Courier New"/>
+          <w:color w:val="auto"/>
+        </w:rPr>
+      </w:pPr>
+      <w:r>
+        <w:rPr>
+          <w:rFonts w:ascii="Courier New" w:hAnsi="Courier New"/>
+          <w:color w:val="auto"/>
+        </w:rPr>
+        <w:t xml:space="preserve">    </w:t>
+      </w:r>
+      <w:r>
+        <w:rPr>
+          <w:rFonts w:ascii="Courier New" w:hAnsi="Courier New"/>
+          <w:b w:val="false"/>
+          <w:color w:val="auto"/>
+          <w:sz w:val="21"/>
+        </w:rPr>
         <w:t>if rank == 1:</w:t>
       </w:r>
     </w:p>
     <w:p>
       <w:pPr>
         <w:pStyle w:val="Code"/>
-        <w:rPr/>
-      </w:pPr>
-      <w:r>
-        <w:rPr/>
-        <w:t xml:space="preserve">        </w:t>
-      </w:r>
-      <w:r>
-        <w:rPr/>
+        <w:rPr>
+          <w:rFonts w:ascii="Courier New" w:hAnsi="Courier New"/>
+          <w:color w:val="auto"/>
+        </w:rPr>
+      </w:pPr>
+      <w:r>
+        <w:rPr>
+          <w:rFonts w:ascii="Courier New" w:hAnsi="Courier New"/>
+          <w:color w:val="auto"/>
+        </w:rPr>
+        <w:t xml:space="preserve">        </w:t>
+      </w:r>
+      <w:r>
+        <w:rPr>
+          <w:rFonts w:ascii="Courier New" w:hAnsi="Courier New"/>
+          <w:b w:val="false"/>
+          <w:color w:val="auto"/>
+          <w:sz w:val="21"/>
+        </w:rPr>
         <w:t># Динамічне виділення пам'яті</w:t>
       </w:r>
     </w:p>
     <w:p>
       <w:pPr>
         <w:pStyle w:val="Code"/>
-        <w:rPr/>
-      </w:pPr>
-      <w:r>
-        <w:rPr/>
-        <w:t xml:space="preserve">        </w:t>
-      </w:r>
-      <w:r>
-        <w:rPr/>
+        <w:rPr>
+          <w:rFonts w:ascii="Courier New" w:hAnsi="Courier New"/>
+          <w:color w:val="auto"/>
+        </w:rPr>
+      </w:pPr>
+      <w:r>
+        <w:rPr>
+          <w:rFonts w:ascii="Courier New" w:hAnsi="Courier New"/>
+          <w:color w:val="auto"/>
+        </w:rPr>
+        <w:t xml:space="preserve">        </w:t>
+      </w:r>
+      <w:r>
+        <w:rPr>
+          <w:rFonts w:ascii="Courier New" w:hAnsi="Courier New"/>
+          <w:b w:val="false"/>
+          <w:color w:val="auto"/>
+          <w:sz w:val="21"/>
+        </w:rPr>
         <w:t># Використання np.empty для виділення пам'яті</w:t>
       </w:r>
     </w:p>
     <w:p>
       <w:pPr>
         <w:pStyle w:val="Code"/>
-        <w:rPr/>
-      </w:pPr>
-      <w:r>
-        <w:rPr/>
-        <w:t xml:space="preserve">        </w:t>
-      </w:r>
-      <w:r>
-        <w:rPr/>
+        <w:rPr>
+          <w:rFonts w:ascii="Courier New" w:hAnsi="Courier New"/>
+          <w:color w:val="auto"/>
+        </w:rPr>
+      </w:pPr>
+      <w:r>
+        <w:rPr>
+          <w:rFonts w:ascii="Courier New" w:hAnsi="Courier New"/>
+          <w:color w:val="auto"/>
+        </w:rPr>
+        <w:t xml:space="preserve">        </w:t>
+      </w:r>
+      <w:r>
+        <w:rPr>
+          <w:rFonts w:ascii="Courier New" w:hAnsi="Courier New"/>
+          <w:b w:val="false"/>
+          <w:color w:val="auto"/>
+          <w:sz w:val="21"/>
+        </w:rPr>
         <w:t>send_data = np.empty(elements_to_send, dtype=np.int64)</w:t>
       </w:r>
     </w:p>
     <w:p>
       <w:pPr>
         <w:pStyle w:val="Code"/>
-        <w:rPr/>
-      </w:pPr>
-      <w:r>
-        <w:rPr/>
-      </w:r>
-    </w:p>
-    <w:p>
-      <w:pPr>
-        <w:pStyle w:val="Code"/>
-        <w:rPr/>
-      </w:pPr>
-      <w:r>
-        <w:rPr/>
-        <w:t xml:space="preserve">        </w:t>
-      </w:r>
-      <w:r>
-        <w:rPr/>
+        <w:rPr>
+          <w:rFonts w:ascii="Courier New" w:hAnsi="Courier New"/>
+          <w:color w:val="auto"/>
+        </w:rPr>
+      </w:pPr>
+      <w:r>
+        <w:rPr>
+          <w:rFonts w:ascii="Courier New" w:hAnsi="Courier New"/>
+          <w:color w:val="auto"/>
+        </w:rPr>
+      </w:r>
+    </w:p>
+    <w:p>
+      <w:pPr>
+        <w:pStyle w:val="Code"/>
+        <w:rPr>
+          <w:rFonts w:ascii="Courier New" w:hAnsi="Courier New"/>
+          <w:color w:val="auto"/>
+        </w:rPr>
+      </w:pPr>
+      <w:r>
+        <w:rPr>
+          <w:rFonts w:ascii="Courier New" w:hAnsi="Courier New"/>
+          <w:color w:val="auto"/>
+        </w:rPr>
+        <w:t xml:space="preserve">        </w:t>
+      </w:r>
+      <w:r>
+        <w:rPr>
+          <w:rFonts w:ascii="Courier New" w:hAnsi="Courier New"/>
+          <w:b w:val="false"/>
+          <w:color w:val="auto"/>
+          <w:sz w:val="21"/>
+        </w:rPr>
         <w:t># Ініціалізація даних</w:t>
       </w:r>
     </w:p>
     <w:p>
       <w:pPr>
         <w:pStyle w:val="Code"/>
-        <w:rPr/>
-      </w:pPr>
-      <w:r>
-        <w:rPr/>
-        <w:t xml:space="preserve">        </w:t>
-      </w:r>
-      <w:r>
-        <w:rPr/>
+        <w:rPr>
+          <w:rFonts w:ascii="Courier New" w:hAnsi="Courier New"/>
+          <w:color w:val="auto"/>
+        </w:rPr>
+      </w:pPr>
+      <w:r>
+        <w:rPr>
+          <w:rFonts w:ascii="Courier New" w:hAnsi="Courier New"/>
+          <w:color w:val="auto"/>
+        </w:rPr>
+        <w:t xml:space="preserve">        </w:t>
+      </w:r>
+      <w:r>
+        <w:rPr>
+          <w:rFonts w:ascii="Courier New" w:hAnsi="Courier New"/>
+          <w:b w:val="false"/>
+          <w:color w:val="auto"/>
+          <w:sz w:val="21"/>
+        </w:rPr>
         <w:t>for i in range(elements_to_send):</w:t>
       </w:r>
     </w:p>
     <w:p>
       <w:pPr>
         <w:pStyle w:val="Code"/>
-        <w:rPr/>
-      </w:pPr>
-      <w:r>
-        <w:rPr/>
-        <w:t xml:space="preserve">            </w:t>
-      </w:r>
-      <w:r>
-        <w:rPr/>
+        <w:rPr>
+          <w:rFonts w:ascii="Courier New" w:hAnsi="Courier New"/>
+          <w:color w:val="auto"/>
+        </w:rPr>
+      </w:pPr>
+      <w:r>
+        <w:rPr>
+          <w:rFonts w:ascii="Courier New" w:hAnsi="Courier New"/>
+          <w:color w:val="auto"/>
+        </w:rPr>
+        <w:t xml:space="preserve">            </w:t>
+      </w:r>
+      <w:r>
+        <w:rPr>
+          <w:rFonts w:ascii="Courier New" w:hAnsi="Courier New"/>
+          <w:b w:val="false"/>
+          <w:color w:val="auto"/>
+          <w:sz w:val="21"/>
+        </w:rPr>
         <w:t>send_data[i] = i + 100</w:t>
       </w:r>
     </w:p>
     <w:p>
       <w:pPr>
         <w:pStyle w:val="Code"/>
-        <w:rPr/>
-      </w:pPr>
-      <w:r>
-        <w:rPr/>
-      </w:r>
-    </w:p>
-    <w:p>
-      <w:pPr>
-        <w:pStyle w:val="Code"/>
-        <w:rPr/>
-      </w:pPr>
-      <w:r>
-        <w:rPr/>
-        <w:t xml:space="preserve">        </w:t>
-      </w:r>
-      <w:r>
-        <w:rPr/>
-        <w:t>print(f"Процес {rank}: Динамічно створений масив розміром {elements_to_send}")</w:t>
-      </w:r>
-    </w:p>
-    <w:p>
-      <w:pPr>
-        <w:pStyle w:val="Code"/>
-        <w:rPr/>
-      </w:pPr>
-      <w:r>
-        <w:rPr/>
-        <w:t xml:space="preserve">        </w:t>
-      </w:r>
-      <w:r>
-        <w:rPr/>
-        <w:t>print(f"Процес {rank}: Надсилаю дані: {send_data}")</w:t>
-      </w:r>
-    </w:p>
-    <w:p>
-      <w:pPr>
-        <w:pStyle w:val="Code"/>
-        <w:rPr/>
-      </w:pPr>
-      <w:r>
-        <w:rPr/>
-      </w:r>
-    </w:p>
-    <w:p>
-      <w:pPr>
-        <w:pStyle w:val="Code"/>
-        <w:rPr/>
-      </w:pPr>
-      <w:r>
-        <w:rPr/>
-        <w:t xml:space="preserve">        </w:t>
-      </w:r>
-      <w:r>
-        <w:rPr/>
+        <w:rPr>
+          <w:rFonts w:ascii="Courier New" w:hAnsi="Courier New"/>
+          <w:color w:val="auto"/>
+        </w:rPr>
+      </w:pPr>
+      <w:r>
+        <w:rPr>
+          <w:rFonts w:ascii="Courier New" w:hAnsi="Courier New"/>
+          <w:color w:val="auto"/>
+        </w:rPr>
+      </w:r>
+    </w:p>
+    <w:p>
+      <w:pPr>
+        <w:pStyle w:val="Code"/>
+        <w:rPr>
+          <w:rFonts w:ascii="Courier New" w:hAnsi="Courier New"/>
+          <w:color w:val="auto"/>
+        </w:rPr>
+      </w:pPr>
+      <w:r>
+        <w:rPr>
+          <w:rFonts w:ascii="Courier New" w:hAnsi="Courier New"/>
+          <w:color w:val="auto"/>
+        </w:rPr>
+        <w:t xml:space="preserve">        </w:t>
+      </w:r>
+      <w:r>
+        <w:rPr>
+          <w:rFonts w:ascii="Courier New" w:hAnsi="Courier New"/>
+          <w:b w:val="false"/>
+          <w:color w:val="auto"/>
+          <w:sz w:val="21"/>
+        </w:rPr>
+        <w:t>print(</w:t>
+      </w:r>
+    </w:p>
+    <w:p>
+      <w:pPr>
+        <w:pStyle w:val="Code"/>
+        <w:rPr>
+          <w:rFonts w:ascii="Courier New" w:hAnsi="Courier New"/>
+          <w:color w:val="auto"/>
+        </w:rPr>
+      </w:pPr>
+      <w:r>
+        <w:rPr>
+          <w:rFonts w:ascii="Courier New" w:hAnsi="Courier New"/>
+          <w:color w:val="auto"/>
+        </w:rPr>
+        <w:t xml:space="preserve">            </w:t>
+      </w:r>
+      <w:r>
+        <w:rPr>
+          <w:rFonts w:ascii="Courier New" w:hAnsi="Courier New"/>
+          <w:b w:val="false"/>
+          <w:color w:val="auto"/>
+          <w:sz w:val="21"/>
+        </w:rPr>
+        <w:t>f"Process {rank}: Dynamically created an array of {elements_to_send} elements."</w:t>
+      </w:r>
+    </w:p>
+    <w:p>
+      <w:pPr>
+        <w:pStyle w:val="Code"/>
+        <w:rPr>
+          <w:rFonts w:ascii="Courier New" w:hAnsi="Courier New"/>
+          <w:color w:val="auto"/>
+        </w:rPr>
+      </w:pPr>
+      <w:r>
+        <w:rPr>
+          <w:rFonts w:ascii="Courier New" w:hAnsi="Courier New"/>
+          <w:color w:val="auto"/>
+        </w:rPr>
+        <w:t xml:space="preserve">        </w:t>
+      </w:r>
+      <w:r>
+        <w:rPr>
+          <w:rFonts w:ascii="Courier New" w:hAnsi="Courier New"/>
+          <w:b w:val="false"/>
+          <w:color w:val="auto"/>
+          <w:sz w:val="21"/>
+        </w:rPr>
+        <w:t>)</w:t>
+      </w:r>
+    </w:p>
+    <w:p>
+      <w:pPr>
+        <w:pStyle w:val="Code"/>
+        <w:rPr>
+          <w:rFonts w:ascii="Courier New" w:hAnsi="Courier New"/>
+          <w:color w:val="auto"/>
+        </w:rPr>
+      </w:pPr>
+      <w:r>
+        <w:rPr>
+          <w:rFonts w:ascii="Courier New" w:hAnsi="Courier New"/>
+          <w:color w:val="auto"/>
+        </w:rPr>
+        <w:t xml:space="preserve">        </w:t>
+      </w:r>
+      <w:r>
+        <w:rPr>
+          <w:rFonts w:ascii="Courier New" w:hAnsi="Courier New"/>
+          <w:b w:val="false"/>
+          <w:color w:val="auto"/>
+          <w:sz w:val="21"/>
+        </w:rPr>
+        <w:t>print(f"Process {rank}: Sending data: {send_data}")</w:t>
+      </w:r>
+    </w:p>
+    <w:p>
+      <w:pPr>
+        <w:pStyle w:val="Code"/>
+        <w:rPr>
+          <w:rFonts w:ascii="Courier New" w:hAnsi="Courier New"/>
+          <w:color w:val="auto"/>
+        </w:rPr>
+      </w:pPr>
+      <w:r>
+        <w:rPr>
+          <w:rFonts w:ascii="Courier New" w:hAnsi="Courier New"/>
+          <w:color w:val="auto"/>
+        </w:rPr>
+      </w:r>
+    </w:p>
+    <w:p>
+      <w:pPr>
+        <w:pStyle w:val="Code"/>
+        <w:rPr>
+          <w:rFonts w:ascii="Courier New" w:hAnsi="Courier New"/>
+          <w:color w:val="auto"/>
+        </w:rPr>
+      </w:pPr>
+      <w:r>
+        <w:rPr>
+          <w:rFonts w:ascii="Courier New" w:hAnsi="Courier New"/>
+          <w:color w:val="auto"/>
+        </w:rPr>
+        <w:t xml:space="preserve">        </w:t>
+      </w:r>
+      <w:r>
+        <w:rPr>
+          <w:rFonts w:ascii="Courier New" w:hAnsi="Courier New"/>
+          <w:b w:val="false"/>
+          <w:color w:val="auto"/>
+          <w:sz w:val="21"/>
+        </w:rPr>
         <w:t># Передача даних</w:t>
       </w:r>
     </w:p>
     <w:p>
       <w:pPr>
         <w:pStyle w:val="Code"/>
-        <w:rPr/>
-      </w:pPr>
-      <w:r>
-        <w:rPr/>
-        <w:t xml:space="preserve">        </w:t>
-      </w:r>
-      <w:r>
-        <w:rPr/>
-        <w:t>comm.send([send_data, MPI.LONG], dest=0, tag=77)</w:t>
-      </w:r>
-    </w:p>
-    <w:p>
-      <w:pPr>
-        <w:pStyle w:val="Code"/>
-        <w:rPr/>
-      </w:pPr>
-      <w:r>
-        <w:rPr/>
-      </w:r>
-    </w:p>
-    <w:p>
-      <w:pPr>
-        <w:pStyle w:val="Code"/>
-        <w:rPr/>
-      </w:pPr>
-      <w:r>
-        <w:rPr/>
-        <w:t xml:space="preserve">    </w:t>
-      </w:r>
-      <w:r>
-        <w:rPr/>
+        <w:rPr>
+          <w:rFonts w:ascii="Courier New" w:hAnsi="Courier New"/>
+          <w:color w:val="auto"/>
+        </w:rPr>
+      </w:pPr>
+      <w:r>
+        <w:rPr>
+          <w:rFonts w:ascii="Courier New" w:hAnsi="Courier New"/>
+          <w:color w:val="auto"/>
+        </w:rPr>
+        <w:t xml:space="preserve">        </w:t>
+      </w:r>
+      <w:r>
+        <w:rPr>
+          <w:rFonts w:ascii="Courier New" w:hAnsi="Courier New"/>
+          <w:b w:val="false"/>
+          <w:color w:val="auto"/>
+          <w:sz w:val="21"/>
+        </w:rPr>
+        <w:t>comm.Send([send_data, MPI.LONG], dest=0, tag=77)</w:t>
+      </w:r>
+    </w:p>
+    <w:p>
+      <w:pPr>
+        <w:pStyle w:val="Code"/>
+        <w:rPr>
+          <w:rFonts w:ascii="Courier New" w:hAnsi="Courier New"/>
+          <w:color w:val="auto"/>
+        </w:rPr>
+      </w:pPr>
+      <w:r>
+        <w:rPr>
+          <w:rFonts w:ascii="Courier New" w:hAnsi="Courier New"/>
+          <w:color w:val="auto"/>
+        </w:rPr>
+      </w:r>
+    </w:p>
+    <w:p>
+      <w:pPr>
+        <w:pStyle w:val="Code"/>
+        <w:rPr>
+          <w:rFonts w:ascii="Courier New" w:hAnsi="Courier New"/>
+          <w:color w:val="auto"/>
+        </w:rPr>
+      </w:pPr>
+      <w:r>
+        <w:rPr>
+          <w:rFonts w:ascii="Courier New" w:hAnsi="Courier New"/>
+          <w:color w:val="auto"/>
+        </w:rPr>
+        <w:t xml:space="preserve">    </w:t>
+      </w:r>
+      <w:r>
+        <w:rPr>
+          <w:rFonts w:ascii="Courier New" w:hAnsi="Courier New"/>
+          <w:b w:val="false"/>
+          <w:color w:val="auto"/>
+          <w:sz w:val="21"/>
+        </w:rPr>
         <w:t>elif rank == 0:</w:t>
       </w:r>
     </w:p>
     <w:p>
       <w:pPr>
         <w:pStyle w:val="Code"/>
-        <w:rPr/>
-      </w:pPr>
-      <w:r>
-        <w:rPr/>
-        <w:t xml:space="preserve">        </w:t>
-      </w:r>
-      <w:r>
-        <w:rPr/>
+        <w:rPr>
+          <w:rFonts w:ascii="Courier New" w:hAnsi="Courier New"/>
+          <w:color w:val="auto"/>
+        </w:rPr>
+      </w:pPr>
+      <w:r>
+        <w:rPr>
+          <w:rFonts w:ascii="Courier New" w:hAnsi="Courier New"/>
+          <w:color w:val="auto"/>
+        </w:rPr>
+        <w:t xml:space="preserve">        </w:t>
+      </w:r>
+      <w:r>
+        <w:rPr>
+          <w:rFonts w:ascii="Courier New" w:hAnsi="Courier New"/>
+          <w:b w:val="false"/>
+          <w:color w:val="auto"/>
+          <w:sz w:val="21"/>
+        </w:rPr>
         <w:t># Динамічне всиділення пам'яті для буфера обміну</w:t>
       </w:r>
     </w:p>
     <w:p>
       <w:pPr>
         <w:pStyle w:val="Code"/>
-        <w:rPr/>
-      </w:pPr>
-      <w:r>
-        <w:rPr/>
-        <w:t xml:space="preserve">        </w:t>
-      </w:r>
-      <w:r>
-        <w:rPr/>
+        <w:rPr>
+          <w:rFonts w:ascii="Courier New" w:hAnsi="Courier New"/>
+          <w:color w:val="auto"/>
+        </w:rPr>
+      </w:pPr>
+      <w:r>
+        <w:rPr>
+          <w:rFonts w:ascii="Courier New" w:hAnsi="Courier New"/>
+          <w:color w:val="auto"/>
+        </w:rPr>
+        <w:t xml:space="preserve">        </w:t>
+      </w:r>
+      <w:r>
+        <w:rPr>
+          <w:rFonts w:ascii="Courier New" w:hAnsi="Courier New"/>
+          <w:b w:val="false"/>
+          <w:color w:val="auto"/>
+          <w:sz w:val="21"/>
+        </w:rPr>
         <w:t># Виділяємо пам'яті під максимально можливий розмір буфера</w:t>
       </w:r>
     </w:p>
     <w:p>
       <w:pPr>
         <w:pStyle w:val="Code"/>
-        <w:rPr/>
-      </w:pPr>
-      <w:r>
-        <w:rPr/>
-        <w:t xml:space="preserve">        </w:t>
-      </w:r>
-      <w:r>
-        <w:rPr/>
+        <w:rPr>
+          <w:rFonts w:ascii="Courier New" w:hAnsi="Courier New"/>
+          <w:color w:val="auto"/>
+        </w:rPr>
+      </w:pPr>
+      <w:r>
+        <w:rPr>
+          <w:rFonts w:ascii="Courier New" w:hAnsi="Courier New"/>
+          <w:color w:val="auto"/>
+        </w:rPr>
+        <w:t xml:space="preserve">        </w:t>
+      </w:r>
+      <w:r>
+        <w:rPr>
+          <w:rFonts w:ascii="Courier New" w:hAnsi="Courier New"/>
+          <w:b w:val="false"/>
+          <w:color w:val="auto"/>
+          <w:sz w:val="21"/>
+        </w:rPr>
         <w:t>recv_buffer = np.empty(buffer_size, dtype=np.int64)</w:t>
       </w:r>
     </w:p>
     <w:p>
       <w:pPr>
         <w:pStyle w:val="Code"/>
-        <w:rPr/>
-      </w:pPr>
-      <w:r>
-        <w:rPr/>
-      </w:r>
-    </w:p>
-    <w:p>
-      <w:pPr>
-        <w:pStyle w:val="Code"/>
-        <w:rPr/>
-      </w:pPr>
-      <w:r>
-        <w:rPr/>
-        <w:t xml:space="preserve">        </w:t>
-      </w:r>
-      <w:r>
-        <w:rPr/>
+        <w:rPr>
+          <w:rFonts w:ascii="Courier New" w:hAnsi="Courier New"/>
+          <w:color w:val="auto"/>
+        </w:rPr>
+      </w:pPr>
+      <w:r>
+        <w:rPr>
+          <w:rFonts w:ascii="Courier New" w:hAnsi="Courier New"/>
+          <w:color w:val="auto"/>
+        </w:rPr>
+      </w:r>
+    </w:p>
+    <w:p>
+      <w:pPr>
+        <w:pStyle w:val="Code"/>
+        <w:rPr>
+          <w:rFonts w:ascii="Courier New" w:hAnsi="Courier New"/>
+          <w:color w:val="auto"/>
+        </w:rPr>
+      </w:pPr>
+      <w:r>
+        <w:rPr>
+          <w:rFonts w:ascii="Courier New" w:hAnsi="Courier New"/>
+          <w:color w:val="auto"/>
+        </w:rPr>
+        <w:t xml:space="preserve">        </w:t>
+      </w:r>
+      <w:r>
+        <w:rPr>
+          <w:rFonts w:ascii="Courier New" w:hAnsi="Courier New"/>
+          <w:b w:val="false"/>
+          <w:color w:val="auto"/>
+          <w:sz w:val="21"/>
+        </w:rPr>
         <w:t>status = MPI.Status()</w:t>
       </w:r>
     </w:p>
     <w:p>
       <w:pPr>
         <w:pStyle w:val="Code"/>
-        <w:rPr/>
-      </w:pPr>
-      <w:r>
-        <w:rPr/>
-      </w:r>
-    </w:p>
-    <w:p>
-      <w:pPr>
-        <w:pStyle w:val="Code"/>
-        <w:rPr/>
-      </w:pPr>
-      <w:r>
-        <w:rPr/>
-        <w:t xml:space="preserve">        </w:t>
-      </w:r>
-      <w:r>
-        <w:rPr/>
+        <w:rPr>
+          <w:rFonts w:ascii="Courier New" w:hAnsi="Courier New"/>
+          <w:color w:val="auto"/>
+        </w:rPr>
+      </w:pPr>
+      <w:r>
+        <w:rPr>
+          <w:rFonts w:ascii="Courier New" w:hAnsi="Courier New"/>
+          <w:color w:val="auto"/>
+        </w:rPr>
+      </w:r>
+    </w:p>
+    <w:p>
+      <w:pPr>
+        <w:pStyle w:val="Code"/>
+        <w:rPr>
+          <w:rFonts w:ascii="Courier New" w:hAnsi="Courier New"/>
+          <w:color w:val="auto"/>
+        </w:rPr>
+      </w:pPr>
+      <w:r>
+        <w:rPr>
+          <w:rFonts w:ascii="Courier New" w:hAnsi="Courier New"/>
+          <w:color w:val="auto"/>
+        </w:rPr>
+        <w:t xml:space="preserve">        </w:t>
+      </w:r>
+      <w:r>
+        <w:rPr>
+          <w:rFonts w:ascii="Courier New" w:hAnsi="Courier New"/>
+          <w:b w:val="false"/>
+          <w:color w:val="auto"/>
+          <w:sz w:val="21"/>
+        </w:rPr>
         <w:t># Прийом даних у динамічно виділений буфер</w:t>
       </w:r>
     </w:p>
     <w:p>
       <w:pPr>
         <w:pStyle w:val="Code"/>
-        <w:rPr/>
-      </w:pPr>
-      <w:r>
-        <w:rPr/>
-        <w:t xml:space="preserve">        </w:t>
-      </w:r>
-      <w:r>
-        <w:rPr/>
+        <w:rPr>
+          <w:rFonts w:ascii="Courier New" w:hAnsi="Courier New"/>
+          <w:color w:val="auto"/>
+        </w:rPr>
+      </w:pPr>
+      <w:r>
+        <w:rPr>
+          <w:rFonts w:ascii="Courier New" w:hAnsi="Courier New"/>
+          <w:color w:val="auto"/>
+        </w:rPr>
+        <w:t xml:space="preserve">        </w:t>
+      </w:r>
+      <w:r>
+        <w:rPr>
+          <w:rFonts w:ascii="Courier New" w:hAnsi="Courier New"/>
+          <w:b w:val="false"/>
+          <w:color w:val="auto"/>
+          <w:sz w:val="21"/>
+        </w:rPr>
         <w:t>comm.Recv([recv_buffer, MPI.LONG], source=1, tag=77, status=status)</w:t>
       </w:r>
     </w:p>
     <w:p>
       <w:pPr>
         <w:pStyle w:val="Code"/>
-        <w:rPr/>
-      </w:pPr>
-      <w:r>
-        <w:rPr/>
-      </w:r>
-    </w:p>
-    <w:p>
-      <w:pPr>
-        <w:pStyle w:val="Code"/>
-        <w:rPr/>
-      </w:pPr>
-      <w:r>
-        <w:rPr/>
-        <w:t xml:space="preserve">        </w:t>
-      </w:r>
-      <w:r>
-        <w:rPr/>
+        <w:rPr>
+          <w:rFonts w:ascii="Courier New" w:hAnsi="Courier New"/>
+          <w:color w:val="auto"/>
+        </w:rPr>
+      </w:pPr>
+      <w:r>
+        <w:rPr>
+          <w:rFonts w:ascii="Courier New" w:hAnsi="Courier New"/>
+          <w:color w:val="auto"/>
+        </w:rPr>
+      </w:r>
+    </w:p>
+    <w:p>
+      <w:pPr>
+        <w:pStyle w:val="Code"/>
+        <w:rPr>
+          <w:rFonts w:ascii="Courier New" w:hAnsi="Courier New"/>
+          <w:color w:val="auto"/>
+        </w:rPr>
+      </w:pPr>
+      <w:r>
+        <w:rPr>
+          <w:rFonts w:ascii="Courier New" w:hAnsi="Courier New"/>
+          <w:color w:val="auto"/>
+        </w:rPr>
+        <w:t xml:space="preserve">        </w:t>
+      </w:r>
+      <w:r>
+        <w:rPr>
+          <w:rFonts w:ascii="Courier New" w:hAnsi="Courier New"/>
+          <w:b w:val="false"/>
+          <w:color w:val="auto"/>
+          <w:sz w:val="21"/>
+        </w:rPr>
         <w:t>actual_count = status.Get_count(MPI.LONG)</w:t>
       </w:r>
     </w:p>
     <w:p>
       <w:pPr>
         <w:pStyle w:val="Code"/>
-        <w:rPr/>
-      </w:pPr>
-      <w:r>
-        <w:rPr/>
-      </w:r>
-    </w:p>
-    <w:p>
-      <w:pPr>
-        <w:pStyle w:val="Code"/>
-        <w:rPr/>
-      </w:pPr>
-      <w:r>
-        <w:rPr/>
-        <w:t xml:space="preserve">        </w:t>
-      </w:r>
-      <w:r>
-        <w:rPr/>
+        <w:rPr>
+          <w:rFonts w:ascii="Courier New" w:hAnsi="Courier New"/>
+          <w:color w:val="auto"/>
+        </w:rPr>
+      </w:pPr>
+      <w:r>
+        <w:rPr>
+          <w:rFonts w:ascii="Courier New" w:hAnsi="Courier New"/>
+          <w:color w:val="auto"/>
+        </w:rPr>
+      </w:r>
+    </w:p>
+    <w:p>
+      <w:pPr>
+        <w:pStyle w:val="Code"/>
+        <w:rPr>
+          <w:rFonts w:ascii="Courier New" w:hAnsi="Courier New"/>
+          <w:color w:val="auto"/>
+        </w:rPr>
+      </w:pPr>
+      <w:r>
+        <w:rPr>
+          <w:rFonts w:ascii="Courier New" w:hAnsi="Courier New"/>
+          <w:color w:val="auto"/>
+        </w:rPr>
+        <w:t xml:space="preserve">        </w:t>
+      </w:r>
+      <w:r>
+        <w:rPr>
+          <w:rFonts w:ascii="Courier New" w:hAnsi="Courier New"/>
+          <w:b w:val="false"/>
+          <w:color w:val="auto"/>
+          <w:sz w:val="21"/>
+        </w:rPr>
         <w:t>print(</w:t>
       </w:r>
     </w:p>
     <w:p>
       <w:pPr>
         <w:pStyle w:val="Code"/>
-        <w:rPr/>
-      </w:pPr>
-      <w:r>
-        <w:rPr/>
-        <w:t xml:space="preserve">            </w:t>
-      </w:r>
-      <w:r>
-        <w:rPr/>
-        <w:t>f"Процес 0: Отримано дані у динамічний буфер (розмір буфера: {buffer_size})"</w:t>
-      </w:r>
-    </w:p>
-    <w:p>
-      <w:pPr>
-        <w:pStyle w:val="Code"/>
-        <w:rPr/>
-      </w:pPr>
-      <w:r>
-        <w:rPr/>
-        <w:t xml:space="preserve">        </w:t>
-      </w:r>
-      <w:r>
-        <w:rPr/>
+        <w:rPr>
+          <w:rFonts w:ascii="Courier New" w:hAnsi="Courier New"/>
+          <w:color w:val="auto"/>
+        </w:rPr>
+      </w:pPr>
+      <w:r>
+        <w:rPr>
+          <w:rFonts w:ascii="Courier New" w:hAnsi="Courier New"/>
+          <w:color w:val="auto"/>
+        </w:rPr>
+        <w:t xml:space="preserve">            </w:t>
+      </w:r>
+      <w:r>
+        <w:rPr>
+          <w:rFonts w:ascii="Courier New" w:hAnsi="Courier New"/>
+          <w:b w:val="false"/>
+          <w:color w:val="auto"/>
+          <w:sz w:val="21"/>
+        </w:rPr>
+        <w:t>f"Process 0: Received data into a dynamic buffer (buffer size: {buffer_size})"</w:t>
+      </w:r>
+    </w:p>
+    <w:p>
+      <w:pPr>
+        <w:pStyle w:val="Code"/>
+        <w:rPr>
+          <w:rFonts w:ascii="Courier New" w:hAnsi="Courier New"/>
+          <w:color w:val="auto"/>
+        </w:rPr>
+      </w:pPr>
+      <w:r>
+        <w:rPr>
+          <w:rFonts w:ascii="Courier New" w:hAnsi="Courier New"/>
+          <w:color w:val="auto"/>
+        </w:rPr>
+        <w:t xml:space="preserve">        </w:t>
+      </w:r>
+      <w:r>
+        <w:rPr>
+          <w:rFonts w:ascii="Courier New" w:hAnsi="Courier New"/>
+          <w:b w:val="false"/>
+          <w:color w:val="auto"/>
+          <w:sz w:val="21"/>
+        </w:rPr>
         <w:t>)</w:t>
       </w:r>
     </w:p>
     <w:p>
       <w:pPr>
         <w:pStyle w:val="Code"/>
-        <w:rPr/>
-      </w:pPr>
-      <w:r>
-        <w:rPr/>
-        <w:t xml:space="preserve">        </w:t>
-      </w:r>
-      <w:r>
-        <w:rPr/>
-        <w:t>print(f"Фактична кількість прийнятих елементів: {actual_count}")</w:t>
-      </w:r>
-    </w:p>
-    <w:p>
-      <w:pPr>
-        <w:pStyle w:val="Code"/>
-        <w:rPr/>
-      </w:pPr>
-      <w:r>
-        <w:rPr/>
-        <w:t xml:space="preserve">        </w:t>
-      </w:r>
-      <w:r>
-        <w:rPr/>
-        <w:t>print(f"Вміст отриманих даних: {recv_buffer[:actual_count]}")</w:t>
-      </w:r>
-    </w:p>
-    <w:p>
-      <w:pPr>
-        <w:pStyle w:val="Code"/>
-        <w:rPr/>
-      </w:pPr>
-      <w:r>
-        <w:rPr/>
-      </w:r>
-    </w:p>
-    <w:p>
-      <w:pPr>
-        <w:pStyle w:val="Code"/>
-        <w:rPr/>
-      </w:pPr>
-      <w:r>
-        <w:rPr/>
-        <w:t xml:space="preserve">    </w:t>
-      </w:r>
-      <w:r>
-        <w:rPr/>
+        <w:rPr>
+          <w:rFonts w:ascii="Courier New" w:hAnsi="Courier New"/>
+          <w:color w:val="auto"/>
+        </w:rPr>
+      </w:pPr>
+      <w:r>
+        <w:rPr>
+          <w:rFonts w:ascii="Courier New" w:hAnsi="Courier New"/>
+          <w:color w:val="auto"/>
+        </w:rPr>
+        <w:t xml:space="preserve">        </w:t>
+      </w:r>
+      <w:r>
+        <w:rPr>
+          <w:rFonts w:ascii="Courier New" w:hAnsi="Courier New"/>
+          <w:b w:val="false"/>
+          <w:color w:val="auto"/>
+          <w:sz w:val="21"/>
+        </w:rPr>
+        <w:t>print(f"Actual amount of received processes: {actual_count}")</w:t>
+      </w:r>
+    </w:p>
+    <w:p>
+      <w:pPr>
+        <w:pStyle w:val="Code"/>
+        <w:rPr>
+          <w:rFonts w:ascii="Courier New" w:hAnsi="Courier New"/>
+          <w:color w:val="auto"/>
+        </w:rPr>
+      </w:pPr>
+      <w:r>
+        <w:rPr>
+          <w:rFonts w:ascii="Courier New" w:hAnsi="Courier New"/>
+          <w:color w:val="auto"/>
+        </w:rPr>
+        <w:t xml:space="preserve">        </w:t>
+      </w:r>
+      <w:r>
+        <w:rPr>
+          <w:rFonts w:ascii="Courier New" w:hAnsi="Courier New"/>
+          <w:b w:val="false"/>
+          <w:color w:val="auto"/>
+          <w:sz w:val="21"/>
+        </w:rPr>
+        <w:t>print(f"Contents of received data: {recv_buffer[:actual_count]}")</w:t>
+      </w:r>
+    </w:p>
+    <w:p>
+      <w:pPr>
+        <w:pStyle w:val="Code"/>
+        <w:rPr>
+          <w:rFonts w:ascii="Courier New" w:hAnsi="Courier New"/>
+          <w:color w:val="auto"/>
+        </w:rPr>
+      </w:pPr>
+      <w:r>
+        <w:rPr>
+          <w:rFonts w:ascii="Courier New" w:hAnsi="Courier New"/>
+          <w:color w:val="auto"/>
+        </w:rPr>
+      </w:r>
+    </w:p>
+    <w:p>
+      <w:pPr>
+        <w:pStyle w:val="Code"/>
+        <w:rPr>
+          <w:rFonts w:ascii="Courier New" w:hAnsi="Courier New"/>
+          <w:color w:val="auto"/>
+        </w:rPr>
+      </w:pPr>
+      <w:r>
+        <w:rPr>
+          <w:rFonts w:ascii="Courier New" w:hAnsi="Courier New"/>
+          <w:color w:val="auto"/>
+        </w:rPr>
+        <w:t xml:space="preserve">    </w:t>
+      </w:r>
+      <w:r>
+        <w:rPr>
+          <w:rFonts w:ascii="Courier New" w:hAnsi="Courier New"/>
+          <w:b w:val="false"/>
+          <w:color w:val="auto"/>
+          <w:sz w:val="21"/>
+        </w:rPr>
         <w:t># Явне звільнення пам'яті в Python відбувається автоматично (Garbage Collector)</w:t>
       </w:r>
     </w:p>
     <w:p>
       <w:pPr>
         <w:pStyle w:val="Code"/>
-        <w:rPr/>
-      </w:pPr>
-      <w:r>
-        <w:rPr/>
-      </w:r>
-    </w:p>
-    <w:p>
-      <w:pPr>
-        <w:pStyle w:val="Code"/>
-        <w:rPr/>
-      </w:pPr>
-      <w:r>
-        <w:rPr/>
-      </w:r>
-    </w:p>
-    <w:p>
-      <w:pPr>
-        <w:pStyle w:val="Code"/>
-        <w:rPr/>
-      </w:pPr>
-      <w:r>
-        <w:rPr/>
+        <w:rPr>
+          <w:rFonts w:ascii="Courier New" w:hAnsi="Courier New"/>
+          <w:color w:val="auto"/>
+        </w:rPr>
+      </w:pPr>
+      <w:r>
+        <w:rPr>
+          <w:rFonts w:ascii="Courier New" w:hAnsi="Courier New"/>
+          <w:color w:val="auto"/>
+        </w:rPr>
+      </w:r>
+    </w:p>
+    <w:p>
+      <w:pPr>
+        <w:pStyle w:val="Code"/>
+        <w:rPr>
+          <w:rFonts w:ascii="Courier New" w:hAnsi="Courier New"/>
+          <w:color w:val="auto"/>
+        </w:rPr>
+      </w:pPr>
+      <w:r>
+        <w:rPr>
+          <w:rFonts w:ascii="Courier New" w:hAnsi="Courier New"/>
+          <w:color w:val="auto"/>
+        </w:rPr>
         <w:t>if __name__ == "__main__":</w:t>
       </w:r>
     </w:p>
     <w:p>
       <w:pPr>
         <w:pStyle w:val="Code"/>
-        <w:rPr/>
-      </w:pPr>
-      <w:r>
-        <w:rPr/>
-        <w:t xml:space="preserve">    </w:t>
-      </w:r>
-      <w:r>
-        <w:rPr/>
+        <w:rPr>
+          <w:rFonts w:ascii="Courier New" w:hAnsi="Courier New"/>
+          <w:color w:val="auto"/>
+        </w:rPr>
+      </w:pPr>
+      <w:r>
+        <w:rPr>
+          <w:rFonts w:ascii="Courier New" w:hAnsi="Courier New"/>
+          <w:color w:val="auto"/>
+          <w:shd w:fill="FFFFFF" w:val="clear"/>
+        </w:rPr>
+        <w:t xml:space="preserve">    </w:t>
+      </w:r>
+      <w:r>
+        <w:rPr>
+          <w:rFonts w:ascii="Courier New" w:hAnsi="Courier New"/>
+          <w:b w:val="false"/>
+          <w:color w:val="auto"/>
+          <w:sz w:val="21"/>
+          <w:shd w:fill="FFFFFF" w:val="clear"/>
+        </w:rPr>
         <w:t>main()</w:t>
       </w:r>
     </w:p>
@@ -2549,9 +3507,9 @@
         <w:rPr/>
         <w:drawing>
           <wp:inline distT="0" distB="0" distL="0" distR="0">
-            <wp:extent cx="3105150" cy="180975"/>
+            <wp:extent cx="5731510" cy="2214245"/>
             <wp:effectExtent l="0" t="0" r="0" b="0"/>
-            <wp:docPr id="3" name="Зображення2 копія 1"/>
+            <wp:docPr id="3" name="Зображення2"/>
             <wp:cNvGraphicFramePr>
               <a:graphicFrameLocks xmlns:a="http://schemas.openxmlformats.org/drawingml/2006/main" noChangeAspect="1"/>
             </wp:cNvGraphicFramePr>
@@ -2559,7 +3517,7 @@
               <a:graphicData uri="http://schemas.openxmlformats.org/drawingml/2006/picture">
                 <pic:pic xmlns:pic="http://schemas.openxmlformats.org/drawingml/2006/picture">
                   <pic:nvPicPr>
-                    <pic:cNvPr id="3" name="Зображення2 копія 1"/>
+                    <pic:cNvPr id="3" name="Зображення2"/>
                     <pic:cNvPicPr>
                       <a:picLocks noChangeAspect="1" noChangeArrowheads="1"/>
                     </pic:cNvPicPr>
@@ -2573,7 +3531,7 @@
                   <pic:spPr bwMode="auto">
                     <a:xfrm>
                       <a:off x="0" y="0"/>
-                      <a:ext cx="3105150" cy="180975"/>
+                      <a:ext cx="5731510" cy="2214245"/>
                     </a:xfrm>
                     <a:prstGeom prst="rect">
                       <a:avLst/>
@@ -2614,6 +3572,86 @@
       <w:r>
         <w:rPr/>
         <w:t>4 Чотири процеси</w:t>
+      </w:r>
+    </w:p>
+    <w:p>
+      <w:pPr>
+        <w:pStyle w:val="H3"/>
+        <w:rPr/>
+      </w:pPr>
+      <w:r>
+        <w:rPr/>
+        <w:t>Завдання</w:t>
+      </w:r>
+    </w:p>
+    <w:p>
+      <w:pPr>
+        <w:pStyle w:val="P1"/>
+        <w:rPr/>
+      </w:pPr>
+      <w:r>
+        <w:rPr/>
+      </w:r>
+    </w:p>
+    <w:p>
+      <w:pPr>
+        <w:pStyle w:val="Normal"/>
+        <w:rPr>
+          <w:lang w:val="en-US"/>
+        </w:rPr>
+      </w:pPr>
+      <w:r>
+        <w:rPr>
+          <w:lang w:val="en-US"/>
+        </w:rPr>
+        <w:t>Напишіть програму, яка складається з чотирьох процесів. Процес "0" передає до процесів "1", "2" та "3" рядок з прізвищем студента. Процес "1" конкатенує прийнятий рядок з рядком, відповідним імені студента, і відсилає отриманий рядок назад. Процес "2" визначає кількість символів в прийнятому рядку та відсилає це число до нульового процесу. Процес "3" множить число, що дорівнює сумі кодів символів прийнятого рядка на число PI, та відсилає отримане значення до процеса "0".</w:t>
+      </w:r>
+    </w:p>
+    <w:p>
+      <w:pPr>
+        <w:pStyle w:val="P1"/>
+        <w:rPr>
+          <w:lang w:val="en-US"/>
+        </w:rPr>
+      </w:pPr>
+      <w:r>
+        <w:rPr>
+          <w:lang w:val="en-US"/>
+        </w:rPr>
+        <w:t>Після завершення обмінів процес "0" виводить на друк отримані від інших процесів значення.</w:t>
+      </w:r>
+    </w:p>
+    <w:p>
+      <w:pPr>
+        <w:pStyle w:val="P1"/>
+        <w:rPr>
+          <w:lang w:val="en-US"/>
+        </w:rPr>
+      </w:pPr>
+      <w:r>
+        <w:rPr>
+          <w:lang w:val="en-US"/>
+        </w:rPr>
+      </w:r>
+    </w:p>
+    <w:p>
+      <w:pPr>
+        <w:pStyle w:val="H3"/>
+        <w:rPr/>
+      </w:pPr>
+      <w:r>
+        <w:rPr/>
+        <w:t>Код</w:t>
+      </w:r>
+    </w:p>
+    <w:p>
+      <w:pPr>
+        <w:pStyle w:val="H3"/>
+        <w:rPr/>
+      </w:pPr>
+      <w:r>
+        <w:rPr/>
+        <w:t>Результати</w:t>
       </w:r>
     </w:p>
     <w:p>

</xml_diff>

<commit_message>
feat (TR3): finish 4th task, fill in the report
</commit_message>
<xml_diff>
--- a/42TR Tehnologiji Rozpodilenyh System/3/TR_KNT-122_Onyshchenko_19_PR3.docx
+++ b/42TR Tehnologiji Rozpodilenyh System/3/TR_KNT-122_Onyshchenko_19_PR3.docx
@@ -633,271 +633,387 @@
     <w:p>
       <w:pPr>
         <w:pStyle w:val="Code"/>
-        <w:rPr/>
-      </w:pPr>
-      <w:r>
-        <w:rPr/>
+        <w:rPr>
+          <w:rFonts w:ascii="Cascadia Code" w:hAnsi="Cascadia Code"/>
+        </w:rPr>
+      </w:pPr>
+      <w:r>
+        <w:rPr>
+          <w:rFonts w:ascii="Cascadia Code" w:hAnsi="Cascadia Code"/>
+        </w:rPr>
         <w:t>from mpi4py import MPI</w:t>
       </w:r>
     </w:p>
     <w:p>
       <w:pPr>
         <w:pStyle w:val="Code"/>
-        <w:rPr/>
-      </w:pPr>
-      <w:r>
-        <w:rPr/>
+        <w:rPr>
+          <w:rFonts w:ascii="Cascadia Code" w:hAnsi="Cascadia Code"/>
+        </w:rPr>
+      </w:pPr>
+      <w:r>
+        <w:rPr>
+          <w:rFonts w:ascii="Cascadia Code" w:hAnsi="Cascadia Code"/>
+        </w:rPr>
         <w:t>import sys</w:t>
       </w:r>
     </w:p>
     <w:p>
       <w:pPr>
         <w:pStyle w:val="Code"/>
-        <w:rPr/>
-      </w:pPr>
-      <w:r>
-        <w:rPr/>
-      </w:r>
-    </w:p>
-    <w:p>
-      <w:pPr>
-        <w:pStyle w:val="Code"/>
-        <w:rPr/>
-      </w:pPr>
-      <w:r>
-        <w:rPr/>
-      </w:r>
-    </w:p>
-    <w:p>
-      <w:pPr>
-        <w:pStyle w:val="Code"/>
-        <w:rPr/>
-      </w:pPr>
-      <w:r>
-        <w:rPr/>
+        <w:rPr>
+          <w:rFonts w:ascii="Cascadia Code" w:hAnsi="Cascadia Code"/>
+        </w:rPr>
+      </w:pPr>
+      <w:r>
+        <w:rPr>
+          <w:rFonts w:ascii="Cascadia Code" w:hAnsi="Cascadia Code"/>
+        </w:rPr>
+      </w:r>
+    </w:p>
+    <w:p>
+      <w:pPr>
+        <w:pStyle w:val="Code"/>
+        <w:rPr>
+          <w:rFonts w:ascii="Cascadia Code" w:hAnsi="Cascadia Code"/>
+        </w:rPr>
+      </w:pPr>
+      <w:r>
+        <w:rPr>
+          <w:rFonts w:ascii="Cascadia Code" w:hAnsi="Cascadia Code"/>
+        </w:rPr>
+      </w:r>
+    </w:p>
+    <w:p>
+      <w:pPr>
+        <w:pStyle w:val="Code"/>
+        <w:rPr>
+          <w:rFonts w:ascii="Cascadia Code" w:hAnsi="Cascadia Code"/>
+        </w:rPr>
+      </w:pPr>
+      <w:r>
+        <w:rPr>
+          <w:rFonts w:ascii="Cascadia Code" w:hAnsi="Cascadia Code"/>
+        </w:rPr>
         <w:t>def main():</w:t>
       </w:r>
     </w:p>
     <w:p>
       <w:pPr>
         <w:pStyle w:val="Code"/>
-        <w:rPr/>
-      </w:pPr>
-      <w:r>
-        <w:rPr/>
+        <w:rPr>
+          <w:rFonts w:ascii="Cascadia Code" w:hAnsi="Cascadia Code"/>
+        </w:rPr>
+      </w:pPr>
+      <w:r>
+        <w:rPr>
+          <w:rFonts w:ascii="Cascadia Code" w:hAnsi="Cascadia Code"/>
+        </w:rPr>
         <w:t xml:space="preserve">    </w:t>
       </w:r>
       <w:r>
-        <w:rPr/>
+        <w:rPr>
+          <w:rFonts w:ascii="Cascadia Code" w:hAnsi="Cascadia Code"/>
+        </w:rPr>
         <w:t>comm = MPI.COMM_WORLD</w:t>
       </w:r>
     </w:p>
     <w:p>
       <w:pPr>
         <w:pStyle w:val="Code"/>
-        <w:rPr/>
-      </w:pPr>
-      <w:r>
-        <w:rPr/>
+        <w:rPr>
+          <w:rFonts w:ascii="Cascadia Code" w:hAnsi="Cascadia Code"/>
+        </w:rPr>
+      </w:pPr>
+      <w:r>
+        <w:rPr>
+          <w:rFonts w:ascii="Cascadia Code" w:hAnsi="Cascadia Code"/>
+        </w:rPr>
         <w:t xml:space="preserve">    </w:t>
       </w:r>
       <w:r>
-        <w:rPr/>
+        <w:rPr>
+          <w:rFonts w:ascii="Cascadia Code" w:hAnsi="Cascadia Code"/>
+        </w:rPr>
         <w:t>size = comm.Get_size()</w:t>
       </w:r>
     </w:p>
     <w:p>
       <w:pPr>
         <w:pStyle w:val="Code"/>
-        <w:rPr/>
-      </w:pPr>
-      <w:r>
-        <w:rPr/>
+        <w:rPr>
+          <w:rFonts w:ascii="Cascadia Code" w:hAnsi="Cascadia Code"/>
+        </w:rPr>
+      </w:pPr>
+      <w:r>
+        <w:rPr>
+          <w:rFonts w:ascii="Cascadia Code" w:hAnsi="Cascadia Code"/>
+        </w:rPr>
         <w:t xml:space="preserve">    </w:t>
       </w:r>
       <w:r>
-        <w:rPr/>
+        <w:rPr>
+          <w:rFonts w:ascii="Cascadia Code" w:hAnsi="Cascadia Code"/>
+        </w:rPr>
         <w:t>rank = comm.Get_rank()</w:t>
       </w:r>
     </w:p>
     <w:p>
       <w:pPr>
         <w:pStyle w:val="Code"/>
-        <w:rPr/>
-      </w:pPr>
-      <w:r>
-        <w:rPr/>
-      </w:r>
-    </w:p>
-    <w:p>
-      <w:pPr>
-        <w:pStyle w:val="Code"/>
-        <w:rPr/>
-      </w:pPr>
-      <w:r>
-        <w:rPr/>
+        <w:rPr>
+          <w:rFonts w:ascii="Cascadia Code" w:hAnsi="Cascadia Code"/>
+        </w:rPr>
+      </w:pPr>
+      <w:r>
+        <w:rPr>
+          <w:rFonts w:ascii="Cascadia Code" w:hAnsi="Cascadia Code"/>
+        </w:rPr>
+      </w:r>
+    </w:p>
+    <w:p>
+      <w:pPr>
+        <w:pStyle w:val="Code"/>
+        <w:rPr>
+          <w:rFonts w:ascii="Cascadia Code" w:hAnsi="Cascadia Code"/>
+        </w:rPr>
+      </w:pPr>
+      <w:r>
+        <w:rPr>
+          <w:rFonts w:ascii="Cascadia Code" w:hAnsi="Cascadia Code"/>
+        </w:rPr>
         <w:t xml:space="preserve">    </w:t>
       </w:r>
       <w:r>
-        <w:rPr/>
+        <w:rPr>
+          <w:rFonts w:ascii="Cascadia Code" w:hAnsi="Cascadia Code"/>
+        </w:rPr>
         <w:t>parity = "even" if rank % 2 == 0 else "odd"</w:t>
       </w:r>
     </w:p>
     <w:p>
       <w:pPr>
         <w:pStyle w:val="Code"/>
-        <w:rPr/>
-      </w:pPr>
-      <w:r>
-        <w:rPr/>
+        <w:rPr>
+          <w:rFonts w:ascii="Cascadia Code" w:hAnsi="Cascadia Code"/>
+        </w:rPr>
+      </w:pPr>
+      <w:r>
+        <w:rPr>
+          <w:rFonts w:ascii="Cascadia Code" w:hAnsi="Cascadia Code"/>
+        </w:rPr>
         <w:t xml:space="preserve">    </w:t>
       </w:r>
       <w:r>
-        <w:rPr/>
+        <w:rPr>
+          <w:rFonts w:ascii="Cascadia Code" w:hAnsi="Cascadia Code"/>
+        </w:rPr>
         <w:t>print(f"Process {rank} of {size} is {parity}")</w:t>
       </w:r>
     </w:p>
     <w:p>
       <w:pPr>
         <w:pStyle w:val="Code"/>
-        <w:rPr/>
-      </w:pPr>
-      <w:r>
-        <w:rPr/>
-      </w:r>
-    </w:p>
-    <w:p>
-      <w:pPr>
-        <w:pStyle w:val="Code"/>
-        <w:rPr/>
-      </w:pPr>
-      <w:r>
-        <w:rPr/>
+        <w:rPr>
+          <w:rFonts w:ascii="Cascadia Code" w:hAnsi="Cascadia Code"/>
+        </w:rPr>
+      </w:pPr>
+      <w:r>
+        <w:rPr>
+          <w:rFonts w:ascii="Cascadia Code" w:hAnsi="Cascadia Code"/>
+        </w:rPr>
+      </w:r>
+    </w:p>
+    <w:p>
+      <w:pPr>
+        <w:pStyle w:val="Code"/>
+        <w:rPr>
+          <w:rFonts w:ascii="Cascadia Code" w:hAnsi="Cascadia Code"/>
+        </w:rPr>
+      </w:pPr>
+      <w:r>
+        <w:rPr>
+          <w:rFonts w:ascii="Cascadia Code" w:hAnsi="Cascadia Code"/>
+        </w:rPr>
         <w:t xml:space="preserve">    </w:t>
       </w:r>
       <w:r>
-        <w:rPr/>
+        <w:rPr>
+          <w:rFonts w:ascii="Cascadia Code" w:hAnsi="Cascadia Code"/>
+        </w:rPr>
         <w:t>comm.Barrier()</w:t>
       </w:r>
     </w:p>
     <w:p>
       <w:pPr>
         <w:pStyle w:val="Code"/>
-        <w:rPr/>
-      </w:pPr>
-      <w:r>
-        <w:rPr/>
-      </w:r>
-    </w:p>
-    <w:p>
-      <w:pPr>
-        <w:pStyle w:val="Code"/>
-        <w:rPr/>
-      </w:pPr>
-      <w:r>
-        <w:rPr/>
+        <w:rPr>
+          <w:rFonts w:ascii="Cascadia Code" w:hAnsi="Cascadia Code"/>
+        </w:rPr>
+      </w:pPr>
+      <w:r>
+        <w:rPr>
+          <w:rFonts w:ascii="Cascadia Code" w:hAnsi="Cascadia Code"/>
+        </w:rPr>
+      </w:r>
+    </w:p>
+    <w:p>
+      <w:pPr>
+        <w:pStyle w:val="Code"/>
+        <w:rPr>
+          <w:rFonts w:ascii="Cascadia Code" w:hAnsi="Cascadia Code"/>
+        </w:rPr>
+      </w:pPr>
+      <w:r>
+        <w:rPr>
+          <w:rFonts w:ascii="Cascadia Code" w:hAnsi="Cascadia Code"/>
+        </w:rPr>
         <w:t xml:space="preserve">    </w:t>
       </w:r>
       <w:r>
-        <w:rPr/>
+        <w:rPr>
+          <w:rFonts w:ascii="Cascadia Code" w:hAnsi="Cascadia Code"/>
+        </w:rPr>
         <w:t>if rank == 0:</w:t>
       </w:r>
     </w:p>
     <w:p>
       <w:pPr>
         <w:pStyle w:val="Code"/>
-        <w:rPr/>
-      </w:pPr>
-      <w:r>
-        <w:rPr/>
+        <w:rPr>
+          <w:rFonts w:ascii="Cascadia Code" w:hAnsi="Cascadia Code"/>
+        </w:rPr>
+      </w:pPr>
+      <w:r>
+        <w:rPr>
+          <w:rFonts w:ascii="Cascadia Code" w:hAnsi="Cascadia Code"/>
+        </w:rPr>
         <w:t xml:space="preserve">        </w:t>
       </w:r>
       <w:r>
-        <w:rPr/>
+        <w:rPr>
+          <w:rFonts w:ascii="Cascadia Code" w:hAnsi="Cascadia Code"/>
+        </w:rPr>
         <w:t>print(f"\nTotal processes: {size}")</w:t>
       </w:r>
     </w:p>
     <w:p>
       <w:pPr>
         <w:pStyle w:val="Code"/>
-        <w:rPr/>
-      </w:pPr>
-      <w:r>
-        <w:rPr/>
+        <w:rPr>
+          <w:rFonts w:ascii="Cascadia Code" w:hAnsi="Cascadia Code"/>
+        </w:rPr>
+      </w:pPr>
+      <w:r>
+        <w:rPr>
+          <w:rFonts w:ascii="Cascadia Code" w:hAnsi="Cascadia Code"/>
+        </w:rPr>
         <w:t xml:space="preserve">        </w:t>
       </w:r>
       <w:r>
-        <w:rPr/>
+        <w:rPr>
+          <w:rFonts w:ascii="Cascadia Code" w:hAnsi="Cascadia Code"/>
+        </w:rPr>
         <w:t>print(f"CommandLine for {rank} process:")</w:t>
       </w:r>
     </w:p>
     <w:p>
       <w:pPr>
         <w:pStyle w:val="Code"/>
-        <w:rPr/>
-      </w:pPr>
-      <w:r>
-        <w:rPr/>
+        <w:rPr>
+          <w:rFonts w:ascii="Cascadia Code" w:hAnsi="Cascadia Code"/>
+        </w:rPr>
+      </w:pPr>
+      <w:r>
+        <w:rPr>
+          <w:rFonts w:ascii="Cascadia Code" w:hAnsi="Cascadia Code"/>
+        </w:rPr>
         <w:t xml:space="preserve">        </w:t>
       </w:r>
       <w:r>
-        <w:rPr/>
+        <w:rPr>
+          <w:rFonts w:ascii="Cascadia Code" w:hAnsi="Cascadia Code"/>
+        </w:rPr>
         <w:t>for i, arg in enumerate(sys.argv):</w:t>
       </w:r>
     </w:p>
     <w:p>
       <w:pPr>
         <w:pStyle w:val="Code"/>
-        <w:rPr/>
-      </w:pPr>
-      <w:r>
-        <w:rPr/>
+        <w:rPr>
+          <w:rFonts w:ascii="Cascadia Code" w:hAnsi="Cascadia Code"/>
+        </w:rPr>
+      </w:pPr>
+      <w:r>
+        <w:rPr>
+          <w:rFonts w:ascii="Cascadia Code" w:hAnsi="Cascadia Code"/>
+        </w:rPr>
         <w:t xml:space="preserve">            </w:t>
       </w:r>
       <w:r>
-        <w:rPr/>
+        <w:rPr>
+          <w:rFonts w:ascii="Cascadia Code" w:hAnsi="Cascadia Code"/>
+        </w:rPr>
         <w:t>print(f"{i}: {arg}")</w:t>
       </w:r>
     </w:p>
     <w:p>
       <w:pPr>
         <w:pStyle w:val="Code"/>
-        <w:rPr/>
-      </w:pPr>
-      <w:r>
-        <w:rPr/>
-      </w:r>
-    </w:p>
-    <w:p>
-      <w:pPr>
-        <w:pStyle w:val="Code"/>
-        <w:rPr/>
-      </w:pPr>
-      <w:r>
-        <w:rPr/>
-      </w:r>
-    </w:p>
-    <w:p>
-      <w:pPr>
-        <w:pStyle w:val="Code"/>
-        <w:rPr/>
-      </w:pPr>
-      <w:r>
-        <w:rPr/>
+        <w:rPr>
+          <w:rFonts w:ascii="Cascadia Code" w:hAnsi="Cascadia Code"/>
+        </w:rPr>
+      </w:pPr>
+      <w:r>
+        <w:rPr>
+          <w:rFonts w:ascii="Cascadia Code" w:hAnsi="Cascadia Code"/>
+        </w:rPr>
+      </w:r>
+    </w:p>
+    <w:p>
+      <w:pPr>
+        <w:pStyle w:val="Code"/>
+        <w:rPr>
+          <w:rFonts w:ascii="Cascadia Code" w:hAnsi="Cascadia Code"/>
+        </w:rPr>
+      </w:pPr>
+      <w:r>
+        <w:rPr>
+          <w:rFonts w:ascii="Cascadia Code" w:hAnsi="Cascadia Code"/>
+        </w:rPr>
+      </w:r>
+    </w:p>
+    <w:p>
+      <w:pPr>
+        <w:pStyle w:val="Code"/>
+        <w:rPr>
+          <w:rFonts w:ascii="Cascadia Code" w:hAnsi="Cascadia Code"/>
+        </w:rPr>
+      </w:pPr>
+      <w:r>
+        <w:rPr>
+          <w:rFonts w:ascii="Cascadia Code" w:hAnsi="Cascadia Code"/>
+        </w:rPr>
         <w:t>if __name__ == "__main__":</w:t>
       </w:r>
     </w:p>
     <w:p>
       <w:pPr>
         <w:pStyle w:val="Code"/>
-        <w:rPr/>
-      </w:pPr>
-      <w:r>
-        <w:rPr/>
+        <w:rPr>
+          <w:rFonts w:ascii="Cascadia Code" w:hAnsi="Cascadia Code"/>
+        </w:rPr>
+      </w:pPr>
+      <w:r>
+        <w:rPr>
+          <w:rFonts w:ascii="Cascadia Code" w:hAnsi="Cascadia Code"/>
+        </w:rPr>
         <w:t xml:space="preserve">    </w:t>
       </w:r>
       <w:r>
-        <w:rPr/>
+        <w:rPr>
+          <w:rFonts w:ascii="Cascadia Code" w:hAnsi="Cascadia Code"/>
+        </w:rPr>
         <w:t>main()</w:t>
       </w:r>
     </w:p>
@@ -983,7 +1099,7 @@
       </w:pPr>
       <w:r>
         <w:rPr/>
-        <w:t>Рисунок 1.1 — Вигляд результатів роботи програми</w:t>
+        <w:t>Рисунок 1.1 — Результати роботи</w:t>
       </w:r>
     </w:p>
     <w:p>
@@ -2107,7 +2223,7 @@
       </w:pPr>
       <w:r>
         <w:rPr/>
-        <w:t>Рисунок 2.1 — Результати роботи програми</w:t>
+        <w:t>Рисунок 2.1 — Результати роботи</w:t>
       </w:r>
     </w:p>
     <w:p>
@@ -3552,7 +3668,7 @@
       </w:pPr>
       <w:r>
         <w:rPr/>
-        <w:t>Рисунок 2.1 — Результати роботи програми</w:t>
+        <w:t>Рисунок 3.1 — Результати роботи</w:t>
       </w:r>
     </w:p>
     <w:p>
@@ -3646,12 +3762,738 @@
     </w:p>
     <w:p>
       <w:pPr>
+        <w:pStyle w:val="P1"/>
+        <w:rPr/>
+      </w:pPr>
+      <w:r>
+        <w:rPr/>
+      </w:r>
+    </w:p>
+    <w:p>
+      <w:pPr>
+        <w:pStyle w:val="Code"/>
+        <w:rPr/>
+      </w:pPr>
+      <w:r>
+        <w:rPr/>
+        <w:t>import math</w:t>
+      </w:r>
+    </w:p>
+    <w:p>
+      <w:pPr>
+        <w:pStyle w:val="Code"/>
+        <w:rPr/>
+      </w:pPr>
+      <w:r>
+        <w:rPr/>
+        <w:t>from mpi4py import MPI</w:t>
+      </w:r>
+    </w:p>
+    <w:p>
+      <w:pPr>
+        <w:pStyle w:val="Code"/>
+        <w:rPr/>
+      </w:pPr>
+      <w:r>
+        <w:rPr/>
+      </w:r>
+    </w:p>
+    <w:p>
+      <w:pPr>
+        <w:pStyle w:val="Code"/>
+        <w:rPr/>
+      </w:pPr>
+      <w:r>
+        <w:rPr/>
+      </w:r>
+    </w:p>
+    <w:p>
+      <w:pPr>
+        <w:pStyle w:val="Code"/>
+        <w:rPr/>
+      </w:pPr>
+      <w:r>
+        <w:rPr/>
+        <w:t>def main():</w:t>
+      </w:r>
+    </w:p>
+    <w:p>
+      <w:pPr>
+        <w:pStyle w:val="Code"/>
+        <w:rPr/>
+      </w:pPr>
+      <w:r>
+        <w:rPr/>
+        <w:t xml:space="preserve">    </w:t>
+      </w:r>
+      <w:r>
+        <w:rPr/>
+        <w:t>comm = MPI.COMM_WORLD</w:t>
+      </w:r>
+    </w:p>
+    <w:p>
+      <w:pPr>
+        <w:pStyle w:val="Code"/>
+        <w:rPr/>
+      </w:pPr>
+      <w:r>
+        <w:rPr/>
+        <w:t xml:space="preserve">    </w:t>
+      </w:r>
+      <w:r>
+        <w:rPr/>
+        <w:t>rank = comm.Get_rank()</w:t>
+      </w:r>
+    </w:p>
+    <w:p>
+      <w:pPr>
+        <w:pStyle w:val="Code"/>
+        <w:rPr/>
+      </w:pPr>
+      <w:r>
+        <w:rPr/>
+        <w:t xml:space="preserve">    </w:t>
+      </w:r>
+      <w:r>
+        <w:rPr/>
+        <w:t>size = comm.Get_size()</w:t>
+      </w:r>
+    </w:p>
+    <w:p>
+      <w:pPr>
+        <w:pStyle w:val="Code"/>
+        <w:rPr/>
+      </w:pPr>
+      <w:r>
+        <w:rPr/>
+      </w:r>
+    </w:p>
+    <w:p>
+      <w:pPr>
+        <w:pStyle w:val="Code"/>
+        <w:rPr/>
+      </w:pPr>
+      <w:r>
+        <w:rPr/>
+        <w:t xml:space="preserve">    </w:t>
+      </w:r>
+      <w:r>
+        <w:rPr/>
+        <w:t>if size != 4:</w:t>
+      </w:r>
+    </w:p>
+    <w:p>
+      <w:pPr>
+        <w:pStyle w:val="Code"/>
+        <w:rPr/>
+      </w:pPr>
+      <w:r>
+        <w:rPr/>
+        <w:t xml:space="preserve">        </w:t>
+      </w:r>
+      <w:r>
+        <w:rPr/>
+        <w:t>if rank == 0:</w:t>
+      </w:r>
+    </w:p>
+    <w:p>
+      <w:pPr>
+        <w:pStyle w:val="Code"/>
+        <w:rPr/>
+      </w:pPr>
+      <w:r>
+        <w:rPr/>
+        <w:t xml:space="preserve">            </w:t>
+      </w:r>
+      <w:r>
+        <w:rPr/>
+        <w:t>print(f"Error: This program needs 4 processes, but {size} given.")</w:t>
+      </w:r>
+    </w:p>
+    <w:p>
+      <w:pPr>
+        <w:pStyle w:val="Code"/>
+        <w:rPr/>
+      </w:pPr>
+      <w:r>
+        <w:rPr/>
+        <w:t xml:space="preserve">        </w:t>
+      </w:r>
+      <w:r>
+        <w:rPr/>
+        <w:t>return</w:t>
+      </w:r>
+    </w:p>
+    <w:p>
+      <w:pPr>
+        <w:pStyle w:val="Code"/>
+        <w:rPr/>
+      </w:pPr>
+      <w:r>
+        <w:rPr/>
+      </w:r>
+    </w:p>
+    <w:p>
+      <w:pPr>
+        <w:pStyle w:val="Code"/>
+        <w:rPr/>
+      </w:pPr>
+      <w:r>
+        <w:rPr/>
+        <w:t xml:space="preserve">    </w:t>
+      </w:r>
+      <w:r>
+        <w:rPr/>
+        <w:t>surname = "Onyshchenko"</w:t>
+      </w:r>
+    </w:p>
+    <w:p>
+      <w:pPr>
+        <w:pStyle w:val="Code"/>
+        <w:rPr/>
+      </w:pPr>
+      <w:r>
+        <w:rPr/>
+      </w:r>
+    </w:p>
+    <w:p>
+      <w:pPr>
+        <w:pStyle w:val="Code"/>
+        <w:rPr/>
+      </w:pPr>
+      <w:r>
+        <w:rPr/>
+        <w:t xml:space="preserve">    </w:t>
+      </w:r>
+      <w:r>
+        <w:rPr/>
+        <w:t>if rank == 0:</w:t>
+      </w:r>
+    </w:p>
+    <w:p>
+      <w:pPr>
+        <w:pStyle w:val="Code"/>
+        <w:rPr/>
+      </w:pPr>
+      <w:r>
+        <w:rPr/>
+        <w:t xml:space="preserve">        </w:t>
+      </w:r>
+      <w:r>
+        <w:rPr/>
+        <w:t>print(f"[Process 0]: Sending a surname {surname} to processes 1, 2, and 3...")</w:t>
+      </w:r>
+    </w:p>
+    <w:p>
+      <w:pPr>
+        <w:pStyle w:val="Code"/>
+        <w:rPr/>
+      </w:pPr>
+      <w:r>
+        <w:rPr/>
+      </w:r>
+    </w:p>
+    <w:p>
+      <w:pPr>
+        <w:pStyle w:val="Code"/>
+        <w:rPr/>
+      </w:pPr>
+      <w:r>
+        <w:rPr/>
+        <w:t xml:space="preserve">        </w:t>
+      </w:r>
+      <w:r>
+        <w:rPr/>
+        <w:t>for i in range(1, 4):</w:t>
+      </w:r>
+    </w:p>
+    <w:p>
+      <w:pPr>
+        <w:pStyle w:val="Code"/>
+        <w:rPr/>
+      </w:pPr>
+      <w:r>
+        <w:rPr/>
+        <w:t xml:space="preserve">            </w:t>
+      </w:r>
+      <w:r>
+        <w:rPr/>
+        <w:t>comm.send(surname, dest=i)</w:t>
+      </w:r>
+    </w:p>
+    <w:p>
+      <w:pPr>
+        <w:pStyle w:val="Code"/>
+        <w:rPr/>
+      </w:pPr>
+      <w:r>
+        <w:rPr/>
+      </w:r>
+    </w:p>
+    <w:p>
+      <w:pPr>
+        <w:pStyle w:val="Code"/>
+        <w:rPr/>
+      </w:pPr>
+      <w:r>
+        <w:rPr/>
+        <w:t xml:space="preserve">        </w:t>
+      </w:r>
+      <w:r>
+        <w:rPr/>
+        <w:t>full_name = comm.recv(source=1)</w:t>
+      </w:r>
+    </w:p>
+    <w:p>
+      <w:pPr>
+        <w:pStyle w:val="Code"/>
+        <w:rPr/>
+      </w:pPr>
+      <w:r>
+        <w:rPr/>
+        <w:t xml:space="preserve">        </w:t>
+      </w:r>
+      <w:r>
+        <w:rPr/>
+        <w:t>char_count = comm.recv(source=2)</w:t>
+      </w:r>
+    </w:p>
+    <w:p>
+      <w:pPr>
+        <w:pStyle w:val="Code"/>
+        <w:rPr/>
+      </w:pPr>
+      <w:r>
+        <w:rPr/>
+        <w:t xml:space="preserve">        </w:t>
+      </w:r>
+      <w:r>
+        <w:rPr/>
+        <w:t>pi_result = comm.recv(source=3)</w:t>
+      </w:r>
+    </w:p>
+    <w:p>
+      <w:pPr>
+        <w:pStyle w:val="Code"/>
+        <w:rPr/>
+      </w:pPr>
+      <w:r>
+        <w:rPr/>
+      </w:r>
+    </w:p>
+    <w:p>
+      <w:pPr>
+        <w:pStyle w:val="Code"/>
+        <w:rPr/>
+      </w:pPr>
+      <w:r>
+        <w:rPr/>
+        <w:t xml:space="preserve">        </w:t>
+      </w:r>
+      <w:r>
+        <w:rPr/>
+        <w:t>print("--- Results for process 0 ---")</w:t>
+      </w:r>
+    </w:p>
+    <w:p>
+      <w:pPr>
+        <w:pStyle w:val="Code"/>
+        <w:rPr/>
+      </w:pPr>
+      <w:r>
+        <w:rPr/>
+        <w:t xml:space="preserve">        </w:t>
+      </w:r>
+      <w:r>
+        <w:rPr/>
+        <w:t>print(f"From process 1 (Surname and Name): {full_name}")</w:t>
+      </w:r>
+    </w:p>
+    <w:p>
+      <w:pPr>
+        <w:pStyle w:val="Code"/>
+        <w:rPr/>
+      </w:pPr>
+      <w:r>
+        <w:rPr/>
+        <w:t xml:space="preserve">        </w:t>
+      </w:r>
+      <w:r>
+        <w:rPr/>
+        <w:t>print(f"From process 2 (Number of characters): {char_count}")</w:t>
+      </w:r>
+    </w:p>
+    <w:p>
+      <w:pPr>
+        <w:pStyle w:val="Code"/>
+        <w:rPr/>
+      </w:pPr>
+      <w:r>
+        <w:rPr/>
+        <w:t xml:space="preserve">        </w:t>
+      </w:r>
+      <w:r>
+        <w:rPr/>
+        <w:t>print(f"From process 3 (Sum of codes): {pi_result}")</w:t>
+      </w:r>
+    </w:p>
+    <w:p>
+      <w:pPr>
+        <w:pStyle w:val="Code"/>
+        <w:rPr/>
+      </w:pPr>
+      <w:r>
+        <w:rPr/>
+      </w:r>
+    </w:p>
+    <w:p>
+      <w:pPr>
+        <w:pStyle w:val="Code"/>
+        <w:rPr/>
+      </w:pPr>
+      <w:r>
+        <w:rPr/>
+        <w:t xml:space="preserve">    </w:t>
+      </w:r>
+      <w:r>
+        <w:rPr/>
+        <w:t>elif rank == 1:</w:t>
+      </w:r>
+    </w:p>
+    <w:p>
+      <w:pPr>
+        <w:pStyle w:val="Code"/>
+        <w:rPr/>
+      </w:pPr>
+      <w:r>
+        <w:rPr/>
+        <w:t xml:space="preserve">        </w:t>
+      </w:r>
+      <w:r>
+        <w:rPr/>
+        <w:t>received_surname = comm.recv(source=0)</w:t>
+      </w:r>
+    </w:p>
+    <w:p>
+      <w:pPr>
+        <w:pStyle w:val="Code"/>
+        <w:rPr/>
+      </w:pPr>
+      <w:r>
+        <w:rPr/>
+        <w:t xml:space="preserve">        </w:t>
+      </w:r>
+      <w:r>
+        <w:rPr/>
+        <w:t>name = "Oleh"</w:t>
+      </w:r>
+    </w:p>
+    <w:p>
+      <w:pPr>
+        <w:pStyle w:val="Code"/>
+        <w:rPr/>
+      </w:pPr>
+      <w:r>
+        <w:rPr/>
+        <w:t xml:space="preserve">        </w:t>
+      </w:r>
+      <w:r>
+        <w:rPr/>
+        <w:t>result = f"{received_surname} {name}"</w:t>
+      </w:r>
+    </w:p>
+    <w:p>
+      <w:pPr>
+        <w:pStyle w:val="Code"/>
+        <w:rPr/>
+      </w:pPr>
+      <w:r>
+        <w:rPr/>
+        <w:t xml:space="preserve">        </w:t>
+      </w:r>
+      <w:r>
+        <w:rPr/>
+        <w:t>comm.send(result, dest=0)</w:t>
+      </w:r>
+    </w:p>
+    <w:p>
+      <w:pPr>
+        <w:pStyle w:val="Code"/>
+        <w:rPr/>
+      </w:pPr>
+      <w:r>
+        <w:rPr/>
+      </w:r>
+    </w:p>
+    <w:p>
+      <w:pPr>
+        <w:pStyle w:val="Code"/>
+        <w:rPr/>
+      </w:pPr>
+      <w:r>
+        <w:rPr/>
+        <w:t xml:space="preserve">    </w:t>
+      </w:r>
+      <w:r>
+        <w:rPr/>
+        <w:t>elif rank == 2:</w:t>
+      </w:r>
+    </w:p>
+    <w:p>
+      <w:pPr>
+        <w:pStyle w:val="Code"/>
+        <w:rPr/>
+      </w:pPr>
+      <w:r>
+        <w:rPr/>
+        <w:t xml:space="preserve">        </w:t>
+      </w:r>
+      <w:r>
+        <w:rPr/>
+        <w:t>received_surname = comm.recv(source=0)</w:t>
+      </w:r>
+    </w:p>
+    <w:p>
+      <w:pPr>
+        <w:pStyle w:val="Code"/>
+        <w:rPr/>
+      </w:pPr>
+      <w:r>
+        <w:rPr/>
+        <w:t xml:space="preserve">        </w:t>
+      </w:r>
+      <w:r>
+        <w:rPr/>
+        <w:t>result = len(received_surname)</w:t>
+      </w:r>
+    </w:p>
+    <w:p>
+      <w:pPr>
+        <w:pStyle w:val="Code"/>
+        <w:rPr/>
+      </w:pPr>
+      <w:r>
+        <w:rPr/>
+        <w:t xml:space="preserve">        </w:t>
+      </w:r>
+      <w:r>
+        <w:rPr/>
+        <w:t>comm.send(result, dest=0)</w:t>
+      </w:r>
+    </w:p>
+    <w:p>
+      <w:pPr>
+        <w:pStyle w:val="Code"/>
+        <w:rPr/>
+      </w:pPr>
+      <w:r>
+        <w:rPr/>
+      </w:r>
+    </w:p>
+    <w:p>
+      <w:pPr>
+        <w:pStyle w:val="Code"/>
+        <w:rPr/>
+      </w:pPr>
+      <w:r>
+        <w:rPr/>
+        <w:t xml:space="preserve">    </w:t>
+      </w:r>
+      <w:r>
+        <w:rPr/>
+        <w:t>elif rank == 3:</w:t>
+      </w:r>
+    </w:p>
+    <w:p>
+      <w:pPr>
+        <w:pStyle w:val="Code"/>
+        <w:rPr/>
+      </w:pPr>
+      <w:r>
+        <w:rPr/>
+        <w:t xml:space="preserve">        </w:t>
+      </w:r>
+      <w:r>
+        <w:rPr/>
+        <w:t>received_surname = comm.recv(source=0)</w:t>
+      </w:r>
+    </w:p>
+    <w:p>
+      <w:pPr>
+        <w:pStyle w:val="Code"/>
+        <w:rPr/>
+      </w:pPr>
+      <w:r>
+        <w:rPr/>
+        <w:t xml:space="preserve">        </w:t>
+      </w:r>
+      <w:r>
+        <w:rPr/>
+        <w:t>char_sum = sum(ord(char) for char in received_surname)</w:t>
+      </w:r>
+    </w:p>
+    <w:p>
+      <w:pPr>
+        <w:pStyle w:val="Code"/>
+        <w:rPr/>
+      </w:pPr>
+      <w:r>
+        <w:rPr/>
+        <w:t xml:space="preserve">        </w:t>
+      </w:r>
+      <w:r>
+        <w:rPr/>
+        <w:t>result = char_sum * math.pi</w:t>
+      </w:r>
+    </w:p>
+    <w:p>
+      <w:pPr>
+        <w:pStyle w:val="Code"/>
+        <w:rPr/>
+      </w:pPr>
+      <w:r>
+        <w:rPr/>
+        <w:t xml:space="preserve">        </w:t>
+      </w:r>
+      <w:r>
+        <w:rPr/>
+        <w:t>comm.send(result, dest=0)</w:t>
+      </w:r>
+    </w:p>
+    <w:p>
+      <w:pPr>
+        <w:pStyle w:val="Code"/>
+        <w:rPr/>
+      </w:pPr>
+      <w:r>
+        <w:rPr/>
+      </w:r>
+    </w:p>
+    <w:p>
+      <w:pPr>
+        <w:pStyle w:val="Code"/>
+        <w:rPr/>
+      </w:pPr>
+      <w:r>
+        <w:rPr/>
+      </w:r>
+    </w:p>
+    <w:p>
+      <w:pPr>
+        <w:pStyle w:val="Code"/>
+        <w:rPr/>
+      </w:pPr>
+      <w:r>
+        <w:rPr/>
+        <w:t>if __name__ == "__main__":</w:t>
+      </w:r>
+    </w:p>
+    <w:p>
+      <w:pPr>
+        <w:pStyle w:val="Code"/>
+        <w:rPr/>
+      </w:pPr>
+      <w:r>
+        <w:rPr/>
+        <w:t xml:space="preserve">    </w:t>
+      </w:r>
+      <w:r>
+        <w:rPr/>
+        <w:t>main()</w:t>
+      </w:r>
+    </w:p>
+    <w:p>
+      <w:pPr>
+        <w:pStyle w:val="P1"/>
+        <w:rPr/>
+      </w:pPr>
+      <w:r>
+        <w:rPr/>
+      </w:r>
+    </w:p>
+    <w:p>
+      <w:pPr>
         <w:pStyle w:val="H3"/>
         <w:rPr/>
       </w:pPr>
       <w:r>
         <w:rPr/>
         <w:t>Результати</w:t>
+      </w:r>
+    </w:p>
+    <w:p>
+      <w:pPr>
+        <w:pStyle w:val="P1"/>
+        <w:rPr/>
+      </w:pPr>
+      <w:r>
+        <w:rPr/>
+      </w:r>
+    </w:p>
+    <w:p>
+      <w:pPr>
+        <w:pStyle w:val="img1"/>
+        <w:rPr/>
+      </w:pPr>
+      <w:r>
+        <w:rPr/>
+        <w:drawing>
+          <wp:inline distT="0" distB="0" distL="0" distR="0">
+            <wp:extent cx="5283200" cy="792480"/>
+            <wp:effectExtent l="0" t="0" r="0" b="0"/>
+            <wp:docPr id="4" name="Зображення4"/>
+            <wp:cNvGraphicFramePr>
+              <a:graphicFrameLocks xmlns:a="http://schemas.openxmlformats.org/drawingml/2006/main" noChangeAspect="1"/>
+            </wp:cNvGraphicFramePr>
+            <a:graphic xmlns:a="http://schemas.openxmlformats.org/drawingml/2006/main">
+              <a:graphicData uri="http://schemas.openxmlformats.org/drawingml/2006/picture">
+                <pic:pic xmlns:pic="http://schemas.openxmlformats.org/drawingml/2006/picture">
+                  <pic:nvPicPr>
+                    <pic:cNvPr id="4" name="Зображення4"/>
+                    <pic:cNvPicPr>
+                      <a:picLocks noChangeAspect="1" noChangeArrowheads="1"/>
+                    </pic:cNvPicPr>
+                  </pic:nvPicPr>
+                  <pic:blipFill>
+                    <a:blip r:embed="rId5"/>
+                    <a:stretch>
+                      <a:fillRect/>
+                    </a:stretch>
+                  </pic:blipFill>
+                  <pic:spPr bwMode="auto">
+                    <a:xfrm>
+                      <a:off x="0" y="0"/>
+                      <a:ext cx="5283200" cy="792480"/>
+                    </a:xfrm>
+                    <a:prstGeom prst="rect">
+                      <a:avLst/>
+                    </a:prstGeom>
+                    <a:noFill/>
+                  </pic:spPr>
+                </pic:pic>
+              </a:graphicData>
+            </a:graphic>
+          </wp:inline>
+        </w:drawing>
+      </w:r>
+    </w:p>
+    <w:p>
+      <w:pPr>
+        <w:pStyle w:val="img1"/>
+        <w:rPr/>
+      </w:pPr>
+      <w:r>
+        <w:rPr/>
+        <w:t>Рисунок 4.1 — Результати роботи</w:t>
+      </w:r>
+    </w:p>
+    <w:p>
+      <w:pPr>
+        <w:pStyle w:val="P1"/>
+        <w:rPr/>
+      </w:pPr>
+      <w:r>
+        <w:rPr/>
       </w:r>
     </w:p>
     <w:p>

</xml_diff>

<commit_message>
feat (TR4): start, make a report template
</commit_message>
<xml_diff>
--- a/42TR Tehnologiji Rozpodilenyh System/3/TR_KNT-122_Onyshchenko_19_PR3.docx
+++ b/42TR Tehnologiji Rozpodilenyh System/3/TR_KNT-122_Onyshchenko_19_PR3.docx
@@ -137,7 +137,7 @@
         <w:rPr>
           <w:lang w:val="en-US"/>
         </w:rPr>
-        <w:t>2</w:t>
+        <w:t>3</w:t>
       </w:r>
     </w:p>
     <w:p>
@@ -1000,9 +1000,7 @@
     <w:p>
       <w:pPr>
         <w:pStyle w:val="Code"/>
-        <w:rPr>
-          <w:rFonts w:ascii="Cascadia Code" w:hAnsi="Cascadia Code"/>
-        </w:rPr>
+        <w:rPr/>
       </w:pPr>
       <w:r>
         <w:rPr>
@@ -1019,11 +1017,14 @@
     </w:p>
     <w:p>
       <w:pPr>
-        <w:pStyle w:val="P1"/>
-        <w:rPr/>
-      </w:pPr>
-      <w:r>
-        <w:rPr/>
+        <w:pStyle w:val="H3"/>
+        <w:rPr/>
+      </w:pPr>
+      <w:r>
+        <w:rPr/>
+      </w:r>
+      <w:r>
+        <w:br w:type="page"/>
       </w:r>
     </w:p>
     <w:p>
@@ -4657,7 +4658,9 @@
     <w:p>
       <w:pPr>
         <w:pStyle w:val="Code"/>
-        <w:rPr/>
+        <w:rPr>
+          <w:rFonts w:ascii="Cascadia Code" w:hAnsi="Cascadia Code"/>
+        </w:rPr>
       </w:pPr>
       <w:r>
         <w:rPr>
@@ -4674,14 +4677,11 @@
     </w:p>
     <w:p>
       <w:pPr>
-        <w:pStyle w:val="H3"/>
-        <w:rPr/>
-      </w:pPr>
-      <w:r>
-        <w:rPr/>
-      </w:r>
-      <w:r>
-        <w:br w:type="page"/>
+        <w:pStyle w:val="p11"/>
+        <w:rPr/>
+      </w:pPr>
+      <w:r>
+        <w:rPr/>
       </w:r>
     </w:p>
     <w:p>

</xml_diff>

<commit_message>
feat: complete TR4, Jesus thank you!
</commit_message>
<xml_diff>
--- a/42TR Tehnologiji Rozpodilenyh System/3/TR_KNT-122_Onyshchenko_19_PR3.docx
+++ b/42TR Tehnologiji Rozpodilenyh System/3/TR_KNT-122_Onyshchenko_19_PR3.docx
@@ -420,15 +420,7 @@
       </w:pPr>
       <w:r>
         <w:rPr/>
-        <w:t xml:space="preserve">Метою роботи є </w:t>
-      </w:r>
-      <w:r>
-        <w:rPr/>
-        <w:t>в</w:t>
-      </w:r>
-      <w:r>
-        <w:rPr/>
-        <w:t>ивчити  каркас  паралельних  програм  на  базі функцій бібліотеки стандарту MPI, навчитися створювати паралельні програми та запускати їх на виконання.</w:t>
+        <w:t>Метою роботи є вивчити  каркас  паралельних  програм  на  базі функцій бібліотеки стандарту MPI, навчитися створювати паралельні програми та запускати їх на виконання.</w:t>
       </w:r>
     </w:p>
     <w:p>
@@ -1030,6 +1022,7 @@
     <w:p>
       <w:pPr>
         <w:pStyle w:val="H3"/>
+        <w:spacing w:before="0" w:after="0"/>
         <w:rPr/>
       </w:pPr>
       <w:r>
@@ -4793,19 +4786,7 @@
         <w:rPr>
           <w:lang w:val="en-US"/>
         </w:rPr>
-        <w:t>бібл</w:t>
-      </w:r>
-      <w:r>
-        <w:rPr>
-          <w:lang w:val="en-US"/>
-        </w:rPr>
-        <w:t>і</w:t>
-      </w:r>
-      <w:r>
-        <w:rPr>
-          <w:lang w:val="en-US"/>
-        </w:rPr>
-        <w:t>отека</w:t>
+        <w:t>бібліотека</w:t>
       </w:r>
       <w:r>
         <w:rPr/>
@@ -4914,11 +4895,7 @@
       </w:pPr>
       <w:r>
         <w:rPr/>
-        <w:t>Які функції вихідної програми завдання 1 виконуються у всіх процесах</w:t>
-      </w:r>
-      <w:r>
-        <w:rPr/>
-        <w:t>?</w:t>
+        <w:t>Які функції вихідної програми завдання 1 виконуються у всіх процесах?</w:t>
       </w:r>
     </w:p>
     <w:p>
@@ -5526,13 +5503,7 @@
         <w:rPr>
           <w:rFonts w:ascii="Cascadia Code" w:hAnsi="Cascadia Code"/>
         </w:rPr>
-        <w:t>print(f"\nЗагальна сума, зібрана з {size} процесів: {total_sum}"</w:t>
-      </w:r>
-      <w:r>
-        <w:rPr>
-          <w:rFonts w:ascii="Cascadia Code" w:hAnsi="Cascadia Code"/>
-        </w:rPr>
-        <w:t>)</w:t>
+        <w:t>print(f"\nЗагальна сума, зібрана з {size} процесів: {total_sum}")</w:t>
       </w:r>
     </w:p>
     <w:p>
@@ -6904,12 +6875,12 @@
       <w:lang w:val="en-US" w:eastAsia="uk-UA"/>
     </w:rPr>
   </w:style>
-  <w:style w:type="character" w:styleId="user">
-    <w:name w:val="Символ нумерації (user)"/>
+  <w:style w:type="character" w:styleId="Style12">
+    <w:name w:val="Символ нумерації"/>
     <w:qFormat/>
     <w:rPr/>
   </w:style>
-  <w:style w:type="paragraph" w:styleId="Style12">
+  <w:style w:type="paragraph" w:styleId="Style13">
     <w:name w:val="Заголовок"/>
     <w:basedOn w:val="Normal"/>
     <w:next w:val="BodyText"/>
@@ -6919,7 +6890,7 @@
       <w:spacing w:before="240" w:after="120"/>
     </w:pPr>
     <w:rPr>
-      <w:rFonts w:ascii="Liberation Sans" w:hAnsi="Liberation Sans" w:eastAsia="Microsoft YaHei" w:cs="Arial Unicode MS"/>
+      <w:rFonts w:ascii="Liberation Sans" w:hAnsi="Liberation Sans" w:eastAsia="Microsoft YaHei" w:cs="Lucida Sans"/>
       <w:sz w:val="28"/>
       <w:szCs w:val="28"/>
     </w:rPr>
@@ -6956,8 +6927,34 @@
       <w:szCs w:val="24"/>
     </w:rPr>
   </w:style>
-  <w:style w:type="paragraph" w:styleId="Style13">
+  <w:style w:type="paragraph" w:styleId="Style14">
     <w:name w:val="Покажчик"/>
+    <w:basedOn w:val="Normal"/>
+    <w:qFormat/>
+    <w:pPr>
+      <w:suppressLineNumbers/>
+    </w:pPr>
+    <w:rPr>
+      <w:rFonts w:cs="Lucida Sans"/>
+    </w:rPr>
+  </w:style>
+  <w:style w:type="paragraph" w:styleId="user">
+    <w:name w:val="Заголовок (user)"/>
+    <w:basedOn w:val="Normal"/>
+    <w:next w:val="BodyText"/>
+    <w:qFormat/>
+    <w:pPr>
+      <w:keepNext w:val="true"/>
+      <w:spacing w:before="240" w:after="120"/>
+    </w:pPr>
+    <w:rPr>
+      <w:rFonts w:ascii="Liberation Sans" w:hAnsi="Liberation Sans" w:eastAsia="Microsoft YaHei" w:cs="Arial Unicode MS"/>
+      <w:sz w:val="28"/>
+      <w:szCs w:val="28"/>
+    </w:rPr>
+  </w:style>
+  <w:style w:type="paragraph" w:styleId="user1">
+    <w:name w:val="Покажчик (user)"/>
     <w:basedOn w:val="Normal"/>
     <w:qFormat/>
     <w:pPr>
@@ -6967,35 +6964,9 @@
       <w:rFonts w:cs="Arial Unicode MS"/>
     </w:rPr>
   </w:style>
-  <w:style w:type="paragraph" w:styleId="user1">
-    <w:name w:val="Заголовок (user)"/>
-    <w:basedOn w:val="Normal"/>
-    <w:next w:val="BodyText"/>
-    <w:qFormat/>
-    <w:pPr>
-      <w:keepNext w:val="true"/>
-      <w:spacing w:before="240" w:after="120"/>
-    </w:pPr>
-    <w:rPr>
-      <w:rFonts w:ascii="Liberation Sans" w:hAnsi="Liberation Sans" w:eastAsia="Microsoft YaHei" w:cs="Lucida Sans"/>
-      <w:sz w:val="28"/>
-      <w:szCs w:val="28"/>
-    </w:rPr>
-  </w:style>
-  <w:style w:type="paragraph" w:styleId="user2">
-    <w:name w:val="Покажчик (user)"/>
-    <w:basedOn w:val="Normal"/>
-    <w:qFormat/>
-    <w:pPr>
-      <w:suppressLineNumbers/>
-    </w:pPr>
-    <w:rPr>
-      <w:rFonts w:cs="Lucida Sans"/>
-    </w:rPr>
-  </w:style>
   <w:style w:type="paragraph" w:styleId="IndexHeading">
     <w:name w:val="index heading"/>
-    <w:basedOn w:val="Style12"/>
+    <w:basedOn w:val="user"/>
     <w:pPr/>
     <w:rPr/>
   </w:style>
@@ -7273,7 +7244,17 @@
     </w:pPr>
     <w:rPr/>
   </w:style>
-  <w:style w:type="paragraph" w:styleId="Style14">
+  <w:style w:type="paragraph" w:styleId="user2">
+    <w:name w:val="Вміст таблиці (user)"/>
+    <w:basedOn w:val="Normal"/>
+    <w:qFormat/>
+    <w:pPr>
+      <w:widowControl w:val="false"/>
+      <w:suppressLineNumbers/>
+    </w:pPr>
+    <w:rPr/>
+  </w:style>
+  <w:style w:type="paragraph" w:styleId="Style15">
     <w:name w:val="Вміст таблиці"/>
     <w:basedOn w:val="Normal"/>
     <w:qFormat/>
@@ -7283,18 +7264,8 @@
     </w:pPr>
     <w:rPr/>
   </w:style>
-  <w:style w:type="paragraph" w:styleId="user3">
-    <w:name w:val="Вміст таблиці (user)"/>
-    <w:basedOn w:val="Normal"/>
-    <w:qFormat/>
-    <w:pPr>
-      <w:widowControl w:val="false"/>
-      <w:suppressLineNumbers/>
-    </w:pPr>
-    <w:rPr/>
-  </w:style>
-  <w:style w:type="numbering" w:styleId="Style15" w:default="1">
-    <w:name w:val="Без маркерів"/>
+  <w:style w:type="numbering" w:styleId="user3" w:default="1">
+    <w:name w:val="Без маркерів (user)"/>
     <w:uiPriority w:val="99"/>
     <w:semiHidden/>
     <w:unhideWhenUsed/>

</xml_diff>